<commit_message>
feat(seatings-badge): ajouter une stratégie d'export pour les badges d'examen et mettre à jour les résolveurs de données
</commit_message>
<xml_diff>
--- a/documents_templates/seating-presence.docx
+++ b/documents_templates/seating-presence.docx
@@ -5,7 +5,9 @@
     <w:p>
       <w:pPr>
         <w:pStyle w:val="Normal"/>
-        <w:rPr/>
+        <w:rPr>
+          <w:rFonts w:ascii="Times New Roman" w:hAnsi="Times New Roman"/>
+        </w:rPr>
       </w:pPr>
       <w:r>
         <w:rPr>
@@ -20,7 +22,9 @@
         <w:pStyle w:val="Normal"/>
         <w:spacing w:before="0" w:after="0"/>
         <w:jc w:val="center"/>
-        <w:rPr/>
+        <w:rPr>
+          <w:rFonts w:ascii="Times New Roman" w:hAnsi="Times New Roman"/>
+        </w:rPr>
       </w:pPr>
       <w:r>
         <w:drawing>
@@ -71,7 +75,7 @@
         <mc:AlternateContent>
           <mc:Choice Requires="wps">
             <w:drawing>
-              <wp:anchor behindDoc="0" distT="0" distB="0" distL="111125" distR="107950" simplePos="0" locked="0" layoutInCell="0" allowOverlap="1" relativeHeight="3">
+              <wp:anchor behindDoc="0" distT="0" distB="0" distL="110490" distR="106680" simplePos="0" locked="0" layoutInCell="0" allowOverlap="1" relativeHeight="3">
                 <wp:simplePos x="0" y="0"/>
                 <wp:positionH relativeFrom="margin">
                   <wp:posOffset>5918200</wp:posOffset>
@@ -187,7 +191,9 @@
         <w:pStyle w:val="Normal"/>
         <w:spacing w:before="0" w:after="0"/>
         <w:jc w:val="center"/>
-        <w:rPr/>
+        <w:rPr>
+          <w:rFonts w:ascii="Times New Roman" w:hAnsi="Times New Roman"/>
+        </w:rPr>
       </w:pPr>
       <w:r>
         <w:rPr>
@@ -203,7 +209,9 @@
         <w:pStyle w:val="Normal"/>
         <w:spacing w:before="57" w:after="57"/>
         <w:jc w:val="center"/>
-        <w:rPr/>
+        <w:rPr>
+          <w:rFonts w:ascii="Times New Roman" w:hAnsi="Times New Roman"/>
+        </w:rPr>
       </w:pPr>
       <w:r>
         <w:rPr>
@@ -219,7 +227,9 @@
         <w:pStyle w:val="Normal"/>
         <w:spacing w:before="0" w:after="0"/>
         <w:jc w:val="center"/>
-        <w:rPr/>
+        <w:rPr>
+          <w:rFonts w:ascii="Times New Roman" w:hAnsi="Times New Roman"/>
+        </w:rPr>
       </w:pPr>
       <w:r>
         <w:rPr>
@@ -246,7 +256,12 @@
         </w:rPr>
       </w:pPr>
       <w:r>
-        <w:rPr/>
+        <w:rPr>
+          <w:rFonts w:cs="Times New Roman" w:ascii="Times New Roman" w:hAnsi="Times New Roman"/>
+          <w:sz w:val="20"/>
+          <w:szCs w:val="20"/>
+          <w:lang w:val="en-US"/>
+        </w:rPr>
       </w:r>
     </w:p>
     <w:p>
@@ -257,7 +272,9 @@
         </w:pBdr>
         <w:spacing w:before="57" w:after="217"/>
         <w:jc w:val="center"/>
-        <w:rPr/>
+        <w:rPr>
+          <w:rFonts w:ascii="Times New Roman" w:hAnsi="Times New Roman"/>
+        </w:rPr>
       </w:pPr>
       <w:r>
         <w:rPr>
@@ -265,15 +282,7 @@
           <w:sz w:val="20"/>
           <w:szCs w:val="20"/>
         </w:rPr>
-        <w:t>FICHE DE PRÉSENCE</w:t>
-      </w:r>
-      <w:r>
-        <w:rPr>
-          <w:rFonts w:cs="Times New Roman" w:ascii="Times New Roman" w:hAnsi="Times New Roman"/>
-          <w:sz w:val="20"/>
-          <w:szCs w:val="20"/>
-        </w:rPr>
-        <w:t xml:space="preserve"> </w:t>
+        <w:t xml:space="preserve">FICHE DE PRÉSENCE </w:t>
       </w:r>
       <w:r>
         <w:rPr>
@@ -326,17 +335,14 @@
         <w:spacing w:before="0" w:after="0"/>
         <w:jc w:val="left"/>
         <w:rPr>
-          <w:b/>
-          <w:bCs/>
-          <w:i w:val="false"/>
-          <w:i w:val="false"/>
-          <w:iCs w:val="false"/>
+          <w:rFonts w:ascii="Times New Roman" w:hAnsi="Times New Roman"/>
           <w:sz w:val="14"/>
           <w:szCs w:val="14"/>
         </w:rPr>
       </w:pPr>
       <w:r>
         <w:rPr>
+          <w:rFonts w:ascii="Times New Roman" w:hAnsi="Times New Roman"/>
           <w:b/>
           <w:bCs/>
           <w:i w:val="false"/>
@@ -357,12 +363,14 @@
         <w:spacing w:before="0" w:after="0"/>
         <w:jc w:val="left"/>
         <w:rPr>
+          <w:rFonts w:ascii="Times New Roman" w:hAnsi="Times New Roman"/>
           <w:sz w:val="14"/>
           <w:szCs w:val="14"/>
         </w:rPr>
       </w:pPr>
       <w:r>
         <w:rPr>
+          <w:rFonts w:ascii="Times New Roman" w:hAnsi="Times New Roman"/>
           <w:sz w:val="14"/>
           <w:szCs w:val="14"/>
         </w:rPr>
@@ -370,6 +378,7 @@
       </w:r>
       <w:r>
         <w:rPr>
+          <w:rFonts w:ascii="Times New Roman" w:hAnsi="Times New Roman"/>
           <w:b/>
           <w:bCs/>
           <w:i/>
@@ -381,6 +390,7 @@
       </w:r>
       <w:r>
         <w:rPr>
+          <w:rFonts w:ascii="Times New Roman" w:hAnsi="Times New Roman"/>
           <w:i/>
           <w:iCs/>
           <w:sz w:val="14"/>
@@ -399,24 +409,24 @@
         <w:spacing w:before="0" w:after="0"/>
         <w:jc w:val="left"/>
         <w:rPr>
-          <w:i/>
+          <w:rFonts w:ascii="Times New Roman" w:hAnsi="Times New Roman"/>
+          <w:sz w:val="14"/>
+          <w:szCs w:val="14"/>
+        </w:rPr>
+      </w:pPr>
+      <w:r>
+        <w:rPr>
+          <w:rFonts w:ascii="Times New Roman" w:hAnsi="Times New Roman"/>
           <w:i/>
           <w:iCs/>
           <w:sz w:val="14"/>
           <w:szCs w:val="14"/>
         </w:rPr>
-      </w:pPr>
-      <w:r>
-        <w:rPr>
-          <w:i/>
-          <w:iCs/>
-          <w:sz w:val="14"/>
-          <w:szCs w:val="14"/>
-        </w:rPr>
         <w:t xml:space="preserve">    </w:t>
       </w:r>
       <w:r>
         <w:rPr>
+          <w:rFonts w:ascii="Times New Roman" w:hAnsi="Times New Roman"/>
           <w:b/>
           <w:bCs/>
           <w:i/>
@@ -428,6 +438,7 @@
       </w:r>
       <w:r>
         <w:rPr>
+          <w:rFonts w:ascii="Times New Roman" w:hAnsi="Times New Roman"/>
           <w:i/>
           <w:iCs/>
           <w:sz w:val="14"/>
@@ -446,29 +457,29 @@
         <w:spacing w:before="0" w:after="0"/>
         <w:jc w:val="left"/>
         <w:rPr>
-          <w:i/>
+          <w:rFonts w:ascii="Times New Roman" w:hAnsi="Times New Roman"/>
+          <w:sz w:val="14"/>
+          <w:szCs w:val="14"/>
+        </w:rPr>
+      </w:pPr>
+      <w:r>
+        <w:rPr>
+          <w:rFonts w:ascii="Times New Roman" w:hAnsi="Times New Roman"/>
           <w:i/>
           <w:iCs/>
           <w:sz w:val="14"/>
           <w:szCs w:val="14"/>
         </w:rPr>
-      </w:pPr>
+        <w:t xml:space="preserve">    </w:t>
+      </w:r>
       <w:r>
         <w:rPr>
+          <w:rFonts w:ascii="Times New Roman" w:hAnsi="Times New Roman"/>
           <w:i/>
           <w:iCs/>
           <w:sz w:val="14"/>
           <w:szCs w:val="14"/>
         </w:rPr>
-        <w:t xml:space="preserve">    </w:t>
-      </w:r>
-      <w:r>
-        <w:rPr>
-          <w:i/>
-          <w:iCs/>
-          <w:sz w:val="14"/>
-          <w:szCs w:val="14"/>
-        </w:rPr>
         <w:t>La croix atteste de la présence de l'élève et de la remise effective de sa copie.</w:t>
       </w:r>
     </w:p>
@@ -478,48 +489,95 @@
         <w:spacing w:before="0" w:after="0"/>
         <w:jc w:val="left"/>
         <w:rPr>
-          <w:sz w:val="14"/>
-          <w:szCs w:val="14"/>
+          <w:rFonts w:ascii="Times New Roman" w:hAnsi="Times New Roman"/>
         </w:rPr>
       </w:pPr>
       <w:r>
         <w:rPr>
-          <w:sz w:val="14"/>
-          <w:szCs w:val="14"/>
+          <w:rFonts w:ascii="Times New Roman" w:hAnsi="Times New Roman"/>
         </w:rPr>
       </w:r>
     </w:p>
     <w:tbl>
       <w:tblPr>
-        <w:tblStyle w:val="Grilledutableau"/>
-        <w:tblW w:w="10601" w:type="dxa"/>
+        <w:tblW w:w="5000" w:type="pct"/>
         <w:jc w:val="left"/>
-        <w:tblInd w:w="-226" w:type="dxa"/>
+        <w:tblInd w:w="55" w:type="dxa"/>
         <w:tblLayout w:type="fixed"/>
         <w:tblCellMar>
-          <w:top w:w="0" w:type="dxa"/>
-          <w:left w:w="108" w:type="dxa"/>
-          <w:bottom w:w="0" w:type="dxa"/>
-          <w:right w:w="108" w:type="dxa"/>
+          <w:top w:w="55" w:type="dxa"/>
+          <w:left w:w="55" w:type="dxa"/>
+          <w:bottom w:w="55" w:type="dxa"/>
+          <w:right w:w="55" w:type="dxa"/>
         </w:tblCellMar>
-        <w:tblLook w:val="04a0" w:noHBand="0" w:noVBand="1" w:firstColumn="1" w:lastRow="0" w:lastColumn="0" w:firstRow="1"/>
       </w:tblPr>
       <w:tblGrid>
         <w:gridCol w:w="454"/>
-        <w:gridCol w:w="3451"/>
-        <w:gridCol w:w="2320"/>
-        <w:gridCol w:w="510"/>
-        <w:gridCol w:w="3866"/>
+        <w:gridCol w:w="3402"/>
+        <w:gridCol w:w="2423"/>
+        <w:gridCol w:w="454"/>
+        <w:gridCol w:w="3733"/>
       </w:tblGrid>
       <w:tr>
         <w:trPr>
-          <w:trHeight w:val="337" w:hRule="atLeast"/>
+          <w:trHeight w:val="1304" w:hRule="atLeast"/>
         </w:trPr>
         <w:tc>
           <w:tcPr>
             <w:tcW w:w="454" w:type="dxa"/>
             <w:tcBorders/>
-            <w:vAlign w:val="center"/>
+          </w:tcPr>
+          <w:p>
+            <w:pPr>
+              <w:pStyle w:val="Contenudetableau"/>
+              <w:spacing w:before="0" w:after="160"/>
+              <w:rPr>
+                <w:rFonts w:ascii="Times New Roman" w:hAnsi="Times New Roman"/>
+              </w:rPr>
+            </w:pPr>
+            <w:r>
+              <w:rPr>
+                <w:rFonts w:ascii="Times New Roman" w:hAnsi="Times New Roman"/>
+              </w:rPr>
+            </w:r>
+          </w:p>
+        </w:tc>
+        <w:tc>
+          <w:tcPr>
+            <w:tcW w:w="3402" w:type="dxa"/>
+            <w:tcBorders/>
+            <w:textDirection w:val="btLr"/>
+            <w:vAlign w:val="bottom"/>
+          </w:tcPr>
+          <w:p>
+            <w:pPr>
+              <w:pStyle w:val="Contenudetableau"/>
+              <w:spacing w:before="0" w:after="160"/>
+              <w:jc w:val="right"/>
+              <w:rPr>
+                <w:rFonts w:ascii="Times New Roman" w:hAnsi="Times New Roman"/>
+                <w:sz w:val="18"/>
+                <w:szCs w:val="18"/>
+              </w:rPr>
+            </w:pPr>
+            <w:r>
+              <w:rPr>
+                <w:rFonts w:ascii="Times New Roman" w:hAnsi="Times New Roman"/>
+                <w:sz w:val="18"/>
+                <w:szCs w:val="18"/>
+              </w:rPr>
+              <w:t>Date</w:t>
+            </w:r>
+          </w:p>
+        </w:tc>
+        <w:tc>
+          <w:tcPr>
+            <w:tcW w:w="2423" w:type="dxa"/>
+            <w:tcBorders>
+              <w:top w:val="single" w:sz="4" w:space="0" w:color="000000"/>
+              <w:left w:val="single" w:sz="4" w:space="0" w:color="000000"/>
+              <w:bottom w:val="single" w:sz="4" w:space="0" w:color="000000"/>
+            </w:tcBorders>
           </w:tcPr>
           <w:p>
             <w:pPr>
@@ -528,34 +586,31 @@
               <w:suppressAutoHyphens w:val="true"/>
               <w:spacing w:lineRule="auto" w:line="240" w:before="0" w:after="0"/>
               <w:jc w:val="center"/>
-              <w:rPr/>
+              <w:rPr>
+                <w:rFonts w:ascii="Times New Roman" w:hAnsi="Times New Roman"/>
+              </w:rPr>
             </w:pPr>
             <w:r>
               <w:rPr>
-                <w:rFonts w:cs="Times New Roman" w:ascii="Times New Roman" w:hAnsi="Times New Roman"/>
+                <w:rFonts w:eastAsia="Calibri" w:cs="Times New Roman" w:ascii="Times New Roman" w:hAnsi="Times New Roman"/>
+                <w:kern w:val="0"/>
                 <w:sz w:val="18"/>
                 <w:szCs w:val="18"/>
-              </w:rPr>
-              <w:t>N</w:t>
-            </w:r>
-            <w:r>
-              <w:rPr>
-                <w:rFonts w:eastAsia="DejaVu Sans" w:cs="DejaVu Sans" w:ascii="Times New Roman" w:hAnsi="Times New Roman"/>
-                <w:position w:val="0"/>
-                <w:sz w:val="18"/>
-                <w:sz w:val="18"/>
-                <w:szCs w:val="18"/>
-                <w:vertAlign w:val="baseline"/>
-              </w:rPr>
-              <w:t>∘</w:t>
+                <w:lang w:val="fr-FR" w:eastAsia="en-US" w:bidi="ar-SA"/>
+              </w:rPr>
+              <w:t>+++ FOR day in days+++</w:t>
             </w:r>
           </w:p>
         </w:tc>
         <w:tc>
           <w:tcPr>
-            <w:tcW w:w="3451" w:type="dxa"/>
-            <w:tcBorders/>
-            <w:vAlign w:val="center"/>
+            <w:tcW w:w="454" w:type="dxa"/>
+            <w:tcBorders>
+              <w:top w:val="single" w:sz="4" w:space="0" w:color="000000"/>
+              <w:left w:val="single" w:sz="4" w:space="0" w:color="000000"/>
+              <w:bottom w:val="single" w:sz="4" w:space="0" w:color="000000"/>
+            </w:tcBorders>
+            <w:textDirection w:val="btLr"/>
           </w:tcPr>
           <w:p>
             <w:pPr>
@@ -563,8 +618,10 @@
               <w:widowControl/>
               <w:suppressAutoHyphens w:val="true"/>
               <w:spacing w:lineRule="auto" w:line="240" w:before="0" w:after="0"/>
-              <w:jc w:val="left"/>
-              <w:rPr/>
+              <w:jc w:val="center"/>
+              <w:rPr>
+                <w:rFonts w:ascii="Times New Roman" w:hAnsi="Times New Roman"/>
+              </w:rPr>
             </w:pPr>
             <w:r>
               <w:rPr>
@@ -574,15 +631,75 @@
                 <w:szCs w:val="18"/>
                 <w:lang w:val="fr-FR" w:eastAsia="en-US" w:bidi="ar-SA"/>
               </w:rPr>
-              <w:t>NOM, POST NOM ET PRÉNOM</w:t>
+              <w:t>…</w:t>
+            </w:r>
+            <w:r>
+              <w:rPr>
+                <w:rFonts w:eastAsia="Calibri" w:cs="Times New Roman" w:ascii="Times New Roman" w:hAnsi="Times New Roman"/>
+                <w:kern w:val="0"/>
+                <w:sz w:val="18"/>
+                <w:szCs w:val="18"/>
+                <w:lang w:val="fr-FR" w:eastAsia="en-US" w:bidi="ar-SA"/>
+              </w:rPr>
+              <w:t xml:space="preserve">./…../ </w:t>
+            </w:r>
+            <w:r>
+              <w:rPr>
+                <w:rFonts w:eastAsia="Calibri" w:cs="Times New Roman" w:ascii="Times New Roman" w:hAnsi="Times New Roman"/>
+                <w:kern w:val="0"/>
+                <w:sz w:val="18"/>
+                <w:szCs w:val="18"/>
+                <w:lang w:val="fr-FR" w:eastAsia="en-US" w:bidi="ar-SA"/>
+              </w:rPr>
+              <w:t>202...</w:t>
             </w:r>
           </w:p>
         </w:tc>
         <w:tc>
           <w:tcPr>
-            <w:tcW w:w="2320" w:type="dxa"/>
+            <w:tcW w:w="3733" w:type="dxa"/>
             <w:tcBorders>
-              <w:right w:val="nil"/>
+              <w:top w:val="single" w:sz="4" w:space="0" w:color="000000"/>
+              <w:left w:val="single" w:sz="4" w:space="0" w:color="000000"/>
+              <w:bottom w:val="single" w:sz="4" w:space="0" w:color="000000"/>
+              <w:right w:val="single" w:sz="4" w:space="0" w:color="000000"/>
+            </w:tcBorders>
+          </w:tcPr>
+          <w:p>
+            <w:pPr>
+              <w:pStyle w:val="Normal"/>
+              <w:widowControl/>
+              <w:suppressAutoHyphens w:val="true"/>
+              <w:spacing w:lineRule="auto" w:line="240" w:before="0" w:after="0"/>
+              <w:jc w:val="center"/>
+              <w:rPr>
+                <w:rFonts w:ascii="Times New Roman" w:hAnsi="Times New Roman"/>
+                <w:sz w:val="16"/>
+                <w:szCs w:val="16"/>
+              </w:rPr>
+            </w:pPr>
+            <w:r>
+              <w:rPr>
+                <w:rFonts w:eastAsia="Calibri" w:cs="Times New Roman" w:ascii="Times New Roman" w:hAnsi="Times New Roman"/>
+                <w:kern w:val="0"/>
+                <w:sz w:val="16"/>
+                <w:szCs w:val="16"/>
+                <w:lang w:val="fr-FR" w:eastAsia="en-US" w:bidi="ar-SA"/>
+              </w:rPr>
+              <w:t>+++END-FOR day+++</w:t>
+            </w:r>
+          </w:p>
+        </w:tc>
+      </w:tr>
+      <w:tr>
+        <w:trPr/>
+        <w:tc>
+          <w:tcPr>
+            <w:tcW w:w="454" w:type="dxa"/>
+            <w:tcBorders>
+              <w:top w:val="single" w:sz="4" w:space="0" w:color="000000"/>
+              <w:left w:val="single" w:sz="4" w:space="0" w:color="000000"/>
+              <w:bottom w:val="single" w:sz="4" w:space="0" w:color="000000"/>
             </w:tcBorders>
             <w:vAlign w:val="center"/>
           </w:tcPr>
@@ -593,7 +710,53 @@
               <w:suppressAutoHyphens w:val="true"/>
               <w:spacing w:lineRule="auto" w:line="240" w:before="0" w:after="0"/>
               <w:jc w:val="center"/>
-              <w:rPr/>
+              <w:rPr>
+                <w:rFonts w:ascii="Times New Roman" w:hAnsi="Times New Roman"/>
+              </w:rPr>
+            </w:pPr>
+            <w:r>
+              <w:rPr>
+                <w:rFonts w:cs="Times New Roman" w:ascii="Times New Roman" w:hAnsi="Times New Roman"/>
+                <w:sz w:val="18"/>
+                <w:szCs w:val="18"/>
+              </w:rPr>
+              <w:t>N</w:t>
+            </w:r>
+            <w:r>
+              <w:rPr>
+                <w:rFonts w:eastAsia="DejaVu Sans" w:cs="DejaVu Sans" w:ascii="Times New Roman" w:hAnsi="Times New Roman"/>
+                <w:position w:val="0"/>
+                <w:sz w:val="18"/>
+                <w:sz w:val="18"/>
+                <w:szCs w:val="18"/>
+                <w:vertAlign w:val="baseline"/>
+              </w:rPr>
+              <w:t>∘</w:t>
+            </w:r>
+          </w:p>
+        </w:tc>
+        <w:tc>
+          <w:tcPr>
+            <w:tcW w:w="3402" w:type="dxa"/>
+            <w:tcBorders>
+              <w:top w:val="single" w:sz="4" w:space="0" w:color="000000"/>
+              <w:left w:val="single" w:sz="4" w:space="0" w:color="000000"/>
+              <w:bottom w:val="single" w:sz="4" w:space="0" w:color="000000"/>
+            </w:tcBorders>
+            <w:vAlign w:val="center"/>
+          </w:tcPr>
+          <w:p>
+            <w:pPr>
+              <w:pStyle w:val="Normal"/>
+              <w:widowControl/>
+              <w:suppressAutoHyphens w:val="true"/>
+              <w:bidi w:val="0"/>
+              <w:spacing w:lineRule="auto" w:line="240" w:before="0" w:after="0"/>
+              <w:ind w:hanging="0" w:left="113" w:right="0"/>
+              <w:jc w:val="left"/>
+              <w:rPr>
+                <w:rFonts w:ascii="Times New Roman" w:hAnsi="Times New Roman"/>
+              </w:rPr>
             </w:pPr>
             <w:r>
               <w:rPr>
@@ -603,15 +766,120 @@
                 <w:szCs w:val="18"/>
                 <w:lang w:val="fr-FR" w:eastAsia="en-US" w:bidi="ar-SA"/>
               </w:rPr>
-              <w:t>+++ FOR day in days+++</w:t>
+              <w:t>NOM, POST NOM ET PRÉNOM</w:t>
             </w:r>
           </w:p>
         </w:tc>
         <w:tc>
           <w:tcPr>
-            <w:tcW w:w="510" w:type="dxa"/>
+            <w:tcW w:w="2423" w:type="dxa"/>
             <w:tcBorders>
-              <w:right w:val="nil"/>
+              <w:left w:val="single" w:sz="4" w:space="0" w:color="000000"/>
+              <w:bottom w:val="single" w:sz="4" w:space="0" w:color="000000"/>
+            </w:tcBorders>
+          </w:tcPr>
+          <w:p>
+            <w:pPr>
+              <w:pStyle w:val="Normal"/>
+              <w:widowControl/>
+              <w:suppressAutoHyphens w:val="true"/>
+              <w:spacing w:lineRule="auto" w:line="240" w:before="0" w:after="0"/>
+              <w:jc w:val="center"/>
+              <w:rPr>
+                <w:rFonts w:ascii="Times New Roman" w:hAnsi="Times New Roman"/>
+                <w:sz w:val="16"/>
+                <w:szCs w:val="16"/>
+              </w:rPr>
+            </w:pPr>
+            <w:r>
+              <w:rPr>
+                <w:rFonts w:eastAsia="Calibri" w:cs="Times New Roman" w:ascii="Times New Roman" w:hAnsi="Times New Roman"/>
+                <w:kern w:val="0"/>
+                <w:sz w:val="16"/>
+                <w:szCs w:val="16"/>
+                <w:lang w:val="fr-FR" w:eastAsia="en-US" w:bidi="ar-SA"/>
+              </w:rPr>
+              <w:t>+++ FOR day in days+++</w:t>
+            </w:r>
+          </w:p>
+        </w:tc>
+        <w:tc>
+          <w:tcPr>
+            <w:tcW w:w="454" w:type="dxa"/>
+            <w:tcBorders>
+              <w:left w:val="single" w:sz="4" w:space="0" w:color="000000"/>
+              <w:bottom w:val="single" w:sz="4" w:space="0" w:color="000000"/>
+            </w:tcBorders>
+          </w:tcPr>
+          <w:p>
+            <w:pPr>
+              <w:pStyle w:val="Normal"/>
+              <w:widowControl/>
+              <w:suppressAutoHyphens w:val="true"/>
+              <w:spacing w:lineRule="auto" w:line="240" w:before="0" w:after="0"/>
+              <w:jc w:val="center"/>
+              <w:rPr>
+                <w:rFonts w:ascii="Times New Roman" w:hAnsi="Times New Roman" w:eastAsia="Calibri" w:cs="Times New Roman"/>
+                <w:kern w:val="0"/>
+                <w:sz w:val="16"/>
+                <w:szCs w:val="16"/>
+                <w:lang w:val="fr-FR" w:eastAsia="en-US" w:bidi="ar-SA"/>
+              </w:rPr>
+            </w:pPr>
+            <w:r>
+              <w:rPr>
+                <w:rFonts w:eastAsia="Calibri" w:cs="Times New Roman" w:ascii="Times New Roman" w:hAnsi="Times New Roman"/>
+                <w:kern w:val="0"/>
+                <w:sz w:val="16"/>
+                <w:szCs w:val="16"/>
+                <w:lang w:val="fr-FR" w:eastAsia="en-US" w:bidi="ar-SA"/>
+              </w:rPr>
+            </w:r>
+          </w:p>
+        </w:tc>
+        <w:tc>
+          <w:tcPr>
+            <w:tcW w:w="3733" w:type="dxa"/>
+            <w:tcBorders>
+              <w:left w:val="single" w:sz="4" w:space="0" w:color="000000"/>
+              <w:bottom w:val="single" w:sz="4" w:space="0" w:color="000000"/>
+              <w:right w:val="single" w:sz="4" w:space="0" w:color="000000"/>
+            </w:tcBorders>
+          </w:tcPr>
+          <w:p>
+            <w:pPr>
+              <w:pStyle w:val="Normal"/>
+              <w:widowControl/>
+              <w:suppressAutoHyphens w:val="true"/>
+              <w:spacing w:lineRule="auto" w:line="240" w:before="0" w:after="0"/>
+              <w:jc w:val="center"/>
+              <w:rPr>
+                <w:rFonts w:ascii="Times New Roman" w:hAnsi="Times New Roman"/>
+                <w:sz w:val="16"/>
+                <w:szCs w:val="16"/>
+              </w:rPr>
+            </w:pPr>
+            <w:r>
+              <w:rPr>
+                <w:rFonts w:eastAsia="Calibri" w:cs="Times New Roman" w:ascii="Times New Roman" w:hAnsi="Times New Roman"/>
+                <w:kern w:val="0"/>
+                <w:sz w:val="16"/>
+                <w:szCs w:val="16"/>
+                <w:lang w:val="fr-FR" w:eastAsia="en-US" w:bidi="ar-SA"/>
+              </w:rPr>
+              <w:t>+++END-FOR day+++</w:t>
+            </w:r>
+          </w:p>
+        </w:tc>
+      </w:tr>
+      <w:tr>
+        <w:trPr/>
+        <w:tc>
+          <w:tcPr>
+            <w:tcW w:w="454" w:type="dxa"/>
+            <w:tcBorders>
+              <w:left w:val="single" w:sz="4" w:space="0" w:color="000000"/>
+              <w:bottom w:val="single" w:sz="4" w:space="0" w:color="000000"/>
             </w:tcBorders>
             <w:vAlign w:val="center"/>
           </w:tcPr>
@@ -622,84 +890,28 @@
               <w:suppressAutoHyphens w:val="true"/>
               <w:spacing w:lineRule="auto" w:line="240" w:before="0" w:after="0"/>
               <w:jc w:val="center"/>
-              <w:rPr/>
-            </w:pPr>
-            <w:r>
-              <w:rPr>
-                <w:rFonts w:eastAsia="Calibri" w:cs="Times New Roman" w:ascii="Times New Roman" w:hAnsi="Times New Roman"/>
-                <w:kern w:val="0"/>
+              <w:rPr>
+                <w:rFonts w:ascii="Times New Roman" w:hAnsi="Times New Roman"/>
                 <w:sz w:val="18"/>
                 <w:szCs w:val="18"/>
-                <w:lang w:val="fr-FR" w:eastAsia="en-US" w:bidi="ar-SA"/>
-              </w:rPr>
-              <w:t>+++$day+++</w:t>
+              </w:rPr>
+            </w:pPr>
+            <w:r>
+              <w:rPr>
+                <w:rFonts w:ascii="Times New Roman" w:hAnsi="Times New Roman"/>
+                <w:sz w:val="18"/>
+                <w:szCs w:val="18"/>
+              </w:rPr>
             </w:r>
           </w:p>
         </w:tc>
         <w:tc>
           <w:tcPr>
-            <w:tcW w:w="3866" w:type="dxa"/>
-            <w:tcBorders/>
-            <w:vAlign w:val="center"/>
-          </w:tcPr>
-          <w:p>
-            <w:pPr>
-              <w:pStyle w:val="Normal"/>
-              <w:widowControl/>
-              <w:suppressAutoHyphens w:val="true"/>
-              <w:spacing w:lineRule="auto" w:line="240" w:before="0" w:after="0"/>
-              <w:jc w:val="center"/>
-              <w:rPr/>
-            </w:pPr>
-            <w:r>
-              <w:rPr>
-                <w:rFonts w:eastAsia="Calibri" w:cs="Times New Roman" w:ascii="Times New Roman" w:hAnsi="Times New Roman"/>
-                <w:kern w:val="0"/>
-                <w:sz w:val="18"/>
-                <w:szCs w:val="18"/>
-                <w:lang w:val="fr-FR" w:eastAsia="en-US" w:bidi="ar-SA"/>
-              </w:rPr>
-              <w:t>+++END-FOR day+++</w:t>
-            </w:r>
-          </w:p>
-        </w:tc>
-      </w:tr>
-      <w:tr>
-        <w:trPr>
-          <w:trHeight w:val="458" w:hRule="atLeast"/>
-        </w:trPr>
-        <w:tc>
-          <w:tcPr>
-            <w:tcW w:w="454" w:type="dxa"/>
-            <w:tcBorders/>
-            <w:vAlign w:val="center"/>
-          </w:tcPr>
-          <w:p>
-            <w:pPr>
-              <w:pStyle w:val="Normal"/>
-              <w:widowControl/>
-              <w:suppressAutoHyphens w:val="true"/>
-              <w:spacing w:lineRule="auto" w:line="240" w:before="0" w:after="0"/>
-              <w:jc w:val="center"/>
-              <w:rPr>
-                <w:rFonts w:ascii="Times New Roman" w:hAnsi="Times New Roman"/>
-                <w:sz w:val="18"/>
-                <w:szCs w:val="18"/>
-              </w:rPr>
-            </w:pPr>
-            <w:r>
-              <w:rPr>
-                <w:rFonts w:ascii="Times New Roman" w:hAnsi="Times New Roman"/>
-                <w:sz w:val="18"/>
-                <w:szCs w:val="18"/>
-              </w:rPr>
-            </w:r>
-          </w:p>
-        </w:tc>
-        <w:tc>
-          <w:tcPr>
-            <w:tcW w:w="3451" w:type="dxa"/>
-            <w:tcBorders/>
+            <w:tcW w:w="3402" w:type="dxa"/>
+            <w:tcBorders>
+              <w:left w:val="single" w:sz="4" w:space="0" w:color="000000"/>
+              <w:bottom w:val="single" w:sz="4" w:space="0" w:color="000000"/>
+            </w:tcBorders>
             <w:vAlign w:val="center"/>
           </w:tcPr>
           <w:p>
@@ -709,7 +921,9 @@
               <w:suppressAutoHyphens w:val="true"/>
               <w:spacing w:lineRule="auto" w:line="240" w:before="0" w:after="0"/>
               <w:jc w:val="left"/>
-              <w:rPr/>
+              <w:rPr>
+                <w:rFonts w:ascii="Times New Roman" w:hAnsi="Times New Roman"/>
+              </w:rPr>
             </w:pPr>
             <w:r>
               <w:rPr>
@@ -725,9 +939,86 @@
         </w:tc>
         <w:tc>
           <w:tcPr>
-            <w:tcW w:w="2320" w:type="dxa"/>
+            <w:tcW w:w="2423" w:type="dxa"/>
             <w:tcBorders>
-              <w:right w:val="nil"/>
+              <w:left w:val="single" w:sz="4" w:space="0" w:color="000000"/>
+              <w:bottom w:val="single" w:sz="4" w:space="0" w:color="000000"/>
+            </w:tcBorders>
+            <w:vAlign w:val="center"/>
+          </w:tcPr>
+          <w:p>
+            <w:pPr>
+              <w:pStyle w:val="Contenudetableau"/>
+              <w:spacing w:before="0" w:after="160"/>
+              <w:rPr>
+                <w:rFonts w:ascii="Times New Roman" w:hAnsi="Times New Roman"/>
+              </w:rPr>
+            </w:pPr>
+            <w:r>
+              <w:rPr>
+                <w:rFonts w:ascii="Times New Roman" w:hAnsi="Times New Roman"/>
+              </w:rPr>
+            </w:r>
+          </w:p>
+        </w:tc>
+        <w:tc>
+          <w:tcPr>
+            <w:tcW w:w="454" w:type="dxa"/>
+            <w:tcBorders>
+              <w:left w:val="single" w:sz="4" w:space="0" w:color="000000"/>
+              <w:bottom w:val="single" w:sz="4" w:space="0" w:color="000000"/>
+            </w:tcBorders>
+            <w:vAlign w:val="center"/>
+          </w:tcPr>
+          <w:p>
+            <w:pPr>
+              <w:pStyle w:val="Contenudetableau"/>
+              <w:spacing w:before="0" w:after="160"/>
+              <w:rPr>
+                <w:rFonts w:ascii="Times New Roman" w:hAnsi="Times New Roman"/>
+              </w:rPr>
+            </w:pPr>
+            <w:r>
+              <w:rPr>
+                <w:rFonts w:ascii="Times New Roman" w:hAnsi="Times New Roman"/>
+              </w:rPr>
+            </w:r>
+          </w:p>
+        </w:tc>
+        <w:tc>
+          <w:tcPr>
+            <w:tcW w:w="3733" w:type="dxa"/>
+            <w:tcBorders>
+              <w:left w:val="single" w:sz="4" w:space="0" w:color="000000"/>
+              <w:bottom w:val="single" w:sz="4" w:space="0" w:color="000000"/>
+              <w:right w:val="single" w:sz="4" w:space="0" w:color="000000"/>
+            </w:tcBorders>
+            <w:vAlign w:val="center"/>
+          </w:tcPr>
+          <w:p>
+            <w:pPr>
+              <w:pStyle w:val="Contenudetableau"/>
+              <w:spacing w:before="0" w:after="160"/>
+              <w:rPr>
+                <w:rFonts w:ascii="Times New Roman" w:hAnsi="Times New Roman"/>
+              </w:rPr>
+            </w:pPr>
+            <w:r>
+              <w:rPr>
+                <w:rFonts w:ascii="Times New Roman" w:hAnsi="Times New Roman"/>
+              </w:rPr>
+            </w:r>
+          </w:p>
+        </w:tc>
+      </w:tr>
+      <w:tr>
+        <w:trPr/>
+        <w:tc>
+          <w:tcPr>
+            <w:tcW w:w="454" w:type="dxa"/>
+            <w:tcBorders>
+              <w:left w:val="single" w:sz="4" w:space="0" w:color="000000"/>
+              <w:bottom w:val="single" w:sz="4" w:space="0" w:color="000000"/>
             </w:tcBorders>
             <w:vAlign w:val="center"/>
           </w:tcPr>
@@ -739,25 +1030,85 @@
               <w:spacing w:lineRule="auto" w:line="240" w:before="0" w:after="0"/>
               <w:jc w:val="center"/>
               <w:rPr>
-                <w:rFonts w:ascii="Times New Roman" w:hAnsi="Times New Roman" w:cs="Times New Roman"/>
-                <w:sz w:val="18"/>
-                <w:szCs w:val="18"/>
+                <w:rFonts w:ascii="Times New Roman" w:hAnsi="Times New Roman"/>
+                <w:sz w:val="16"/>
+                <w:szCs w:val="16"/>
               </w:rPr>
             </w:pPr>
             <w:r>
               <w:rPr>
-                <w:rFonts w:cs="Times New Roman" w:ascii="Times New Roman" w:hAnsi="Times New Roman"/>
-                <w:sz w:val="18"/>
-                <w:szCs w:val="18"/>
-              </w:rPr>
+                <w:rFonts w:eastAsia="Calibri" w:cs="Times New Roman" w:ascii="Times New Roman" w:hAnsi="Times New Roman"/>
+                <w:kern w:val="0"/>
+                <w:sz w:val="16"/>
+                <w:szCs w:val="16"/>
+                <w:lang w:val="fr-FR" w:eastAsia="en-US" w:bidi="ar-SA"/>
+              </w:rPr>
+              <w:t>+++ $idx+1 +++</w:t>
             </w:r>
           </w:p>
         </w:tc>
         <w:tc>
           <w:tcPr>
-            <w:tcW w:w="510" w:type="dxa"/>
+            <w:tcW w:w="3402" w:type="dxa"/>
             <w:tcBorders>
-              <w:right w:val="nil"/>
+              <w:left w:val="single" w:sz="4" w:space="0" w:color="000000"/>
+              <w:bottom w:val="single" w:sz="4" w:space="0" w:color="000000"/>
+            </w:tcBorders>
+            <w:vAlign w:val="center"/>
+          </w:tcPr>
+          <w:p>
+            <w:pPr>
+              <w:pStyle w:val="Normal"/>
+              <w:widowControl/>
+              <w:suppressAutoHyphens w:val="true"/>
+              <w:bidi w:val="0"/>
+              <w:spacing w:lineRule="auto" w:line="240" w:before="0" w:after="0"/>
+              <w:ind w:hanging="0" w:left="113" w:right="0"/>
+              <w:jc w:val="left"/>
+              <w:rPr>
+                <w:rFonts w:ascii="Times New Roman" w:hAnsi="Times New Roman"/>
+                <w:sz w:val="16"/>
+                <w:szCs w:val="16"/>
+              </w:rPr>
+            </w:pPr>
+            <w:r>
+              <w:rPr>
+                <w:rFonts w:eastAsia="Calibri" w:cs="Times New Roman" w:ascii="Times New Roman" w:hAnsi="Times New Roman"/>
+                <w:kern w:val="0"/>
+                <w:sz w:val="16"/>
+                <w:szCs w:val="16"/>
+                <w:lang w:val="fr-FR" w:eastAsia="en-US" w:bidi="ar-SA"/>
+              </w:rPr>
+              <w:t>+++$</w:t>
+            </w:r>
+            <w:r>
+              <w:rPr>
+                <w:rFonts w:eastAsia="Calibri" w:cs="Times New Roman" w:ascii="Times New Roman" w:hAnsi="Times New Roman"/>
+                <w:kern w:val="0"/>
+                <w:sz w:val="16"/>
+                <w:szCs w:val="16"/>
+                <w:lang w:val="en-US" w:eastAsia="en-US" w:bidi="ar-SA"/>
+              </w:rPr>
+              <w:t>std</w:t>
+            </w:r>
+            <w:r>
+              <w:rPr>
+                <w:rFonts w:eastAsia="Calibri" w:cs="Times New Roman" w:ascii="Times New Roman" w:hAnsi="Times New Roman"/>
+                <w:kern w:val="0"/>
+                <w:sz w:val="16"/>
+                <w:szCs w:val="16"/>
+                <w:lang w:val="fr-FR" w:eastAsia="en-US" w:bidi="ar-SA"/>
+              </w:rPr>
+              <w:t>.enrolement.student.fullName+++</w:t>
+            </w:r>
+          </w:p>
+        </w:tc>
+        <w:tc>
+          <w:tcPr>
+            <w:tcW w:w="2423" w:type="dxa"/>
+            <w:tcBorders>
+              <w:left w:val="single" w:sz="4" w:space="0" w:color="000000"/>
+              <w:bottom w:val="single" w:sz="4" w:space="0" w:color="000000"/>
             </w:tcBorders>
             <w:vAlign w:val="center"/>
           </w:tcPr>
@@ -769,138 +1120,29 @@
               <w:spacing w:lineRule="auto" w:line="240" w:before="0" w:after="0"/>
               <w:jc w:val="center"/>
               <w:rPr>
-                <w:rFonts w:ascii="Times New Roman" w:hAnsi="Times New Roman" w:cs="Times New Roman"/>
-                <w:sz w:val="18"/>
-                <w:szCs w:val="18"/>
+                <w:rFonts w:ascii="Times New Roman" w:hAnsi="Times New Roman"/>
+                <w:sz w:val="16"/>
+                <w:szCs w:val="16"/>
               </w:rPr>
             </w:pPr>
             <w:r>
               <w:rPr>
-                <w:rFonts w:cs="Times New Roman" w:ascii="Times New Roman" w:hAnsi="Times New Roman"/>
-                <w:sz w:val="18"/>
-                <w:szCs w:val="18"/>
-              </w:rPr>
+                <w:rFonts w:eastAsia="Calibri" w:cs="Times New Roman" w:ascii="Times New Roman" w:hAnsi="Times New Roman"/>
+                <w:kern w:val="0"/>
+                <w:sz w:val="16"/>
+                <w:szCs w:val="16"/>
+                <w:lang w:val="fr-FR" w:eastAsia="en-US" w:bidi="ar-SA"/>
+              </w:rPr>
+              <w:t>+++ FOR day in days+++</w:t>
             </w:r>
           </w:p>
         </w:tc>
         <w:tc>
           <w:tcPr>
-            <w:tcW w:w="3866" w:type="dxa"/>
-            <w:tcBorders/>
-            <w:vAlign w:val="center"/>
-          </w:tcPr>
-          <w:p>
-            <w:pPr>
-              <w:pStyle w:val="Normal"/>
-              <w:widowControl/>
-              <w:suppressAutoHyphens w:val="true"/>
-              <w:spacing w:lineRule="auto" w:line="240" w:before="0" w:after="0"/>
-              <w:jc w:val="center"/>
-              <w:rPr>
-                <w:rFonts w:ascii="Times New Roman" w:hAnsi="Times New Roman" w:cs="Times New Roman"/>
-                <w:sz w:val="18"/>
-                <w:szCs w:val="18"/>
-              </w:rPr>
-            </w:pPr>
-            <w:r>
-              <w:rPr>
-                <w:rFonts w:cs="Times New Roman" w:ascii="Times New Roman" w:hAnsi="Times New Roman"/>
-                <w:sz w:val="18"/>
-                <w:szCs w:val="18"/>
-              </w:rPr>
-            </w:r>
-          </w:p>
-        </w:tc>
-      </w:tr>
-      <w:tr>
-        <w:trPr>
-          <w:trHeight w:val="283" w:hRule="atLeast"/>
-        </w:trPr>
-        <w:tc>
-          <w:tcPr>
             <w:tcW w:w="454" w:type="dxa"/>
-            <w:tcBorders/>
-            <w:vAlign w:val="center"/>
-          </w:tcPr>
-          <w:p>
-            <w:pPr>
-              <w:pStyle w:val="Normal"/>
-              <w:widowControl/>
-              <w:suppressAutoHyphens w:val="true"/>
-              <w:spacing w:lineRule="auto" w:line="240" w:before="0" w:after="0"/>
-              <w:jc w:val="center"/>
-              <w:rPr>
-                <w:sz w:val="18"/>
-                <w:szCs w:val="18"/>
-              </w:rPr>
-            </w:pPr>
-            <w:r>
-              <w:rPr>
-                <w:rFonts w:eastAsia="Calibri" w:cs="Times New Roman" w:ascii="Times New Roman" w:hAnsi="Times New Roman"/>
-                <w:kern w:val="0"/>
-                <w:sz w:val="18"/>
-                <w:szCs w:val="18"/>
-                <w:lang w:val="fr-FR" w:eastAsia="en-US" w:bidi="ar-SA"/>
-              </w:rPr>
-              <w:t>+++ $idx+1 +++</w:t>
-            </w:r>
-          </w:p>
-        </w:tc>
-        <w:tc>
-          <w:tcPr>
-            <w:tcW w:w="3451" w:type="dxa"/>
-            <w:tcBorders/>
-            <w:vAlign w:val="center"/>
-          </w:tcPr>
-          <w:p>
-            <w:pPr>
-              <w:pStyle w:val="Normal"/>
-              <w:widowControl/>
-              <w:suppressAutoHyphens w:val="true"/>
-              <w:spacing w:lineRule="auto" w:line="240" w:before="0" w:after="0"/>
-              <w:jc w:val="left"/>
-              <w:rPr>
-                <w:sz w:val="18"/>
-                <w:szCs w:val="18"/>
-              </w:rPr>
-            </w:pPr>
-            <w:r>
-              <w:rPr>
-                <w:rFonts w:eastAsia="Calibri" w:cs="Times New Roman" w:ascii="Times New Roman" w:hAnsi="Times New Roman"/>
-                <w:kern w:val="0"/>
-                <w:sz w:val="18"/>
-                <w:szCs w:val="18"/>
-                <w:lang w:val="fr-FR" w:eastAsia="en-US" w:bidi="ar-SA"/>
-              </w:rPr>
-              <w:t>+++$</w:t>
-            </w:r>
-            <w:r>
-              <w:rPr>
-                <w:rFonts w:eastAsia="Calibri" w:cs="Times New Roman" w:ascii="Times New Roman" w:hAnsi="Times New Roman"/>
-                <w:kern w:val="0"/>
-                <w:sz w:val="18"/>
-                <w:szCs w:val="18"/>
-                <w:lang w:val="en-US" w:eastAsia="en-US" w:bidi="ar-SA"/>
-              </w:rPr>
-              <w:t>std</w:t>
-            </w:r>
-            <w:r>
-              <w:rPr>
-                <w:rFonts w:eastAsia="Calibri" w:cs="Times New Roman" w:ascii="Times New Roman" w:hAnsi="Times New Roman"/>
-                <w:kern w:val="0"/>
-                <w:sz w:val="18"/>
-                <w:szCs w:val="18"/>
-                <w:lang w:val="fr-FR" w:eastAsia="en-US" w:bidi="ar-SA"/>
-              </w:rPr>
-              <w:t>.enrolement.student.fullName+++</w:t>
-            </w:r>
-          </w:p>
-        </w:tc>
-        <w:tc>
-          <w:tcPr>
-            <w:tcW w:w="2320" w:type="dxa"/>
             <w:tcBorders>
-              <w:right w:val="nil"/>
+              <w:left w:val="single" w:sz="4" w:space="0" w:color="000000"/>
+              <w:bottom w:val="single" w:sz="4" w:space="0" w:color="000000"/>
             </w:tcBorders>
             <w:vAlign w:val="center"/>
           </w:tcPr>
@@ -911,25 +1153,32 @@
               <w:suppressAutoHyphens w:val="true"/>
               <w:spacing w:lineRule="auto" w:line="240" w:before="0" w:after="0"/>
               <w:jc w:val="center"/>
-              <w:rPr/>
+              <w:rPr>
+                <w:rFonts w:ascii="Times New Roman" w:hAnsi="Times New Roman" w:eastAsia="Calibri" w:cs="Times New Roman"/>
+                <w:kern w:val="0"/>
+                <w:sz w:val="16"/>
+                <w:szCs w:val="16"/>
+                <w:lang w:val="fr-FR" w:eastAsia="en-US" w:bidi="ar-SA"/>
+              </w:rPr>
             </w:pPr>
             <w:r>
               <w:rPr>
                 <w:rFonts w:eastAsia="Calibri" w:cs="Times New Roman" w:ascii="Times New Roman" w:hAnsi="Times New Roman"/>
                 <w:kern w:val="0"/>
-                <w:sz w:val="18"/>
-                <w:szCs w:val="18"/>
+                <w:sz w:val="16"/>
+                <w:szCs w:val="16"/>
                 <w:lang w:val="fr-FR" w:eastAsia="en-US" w:bidi="ar-SA"/>
               </w:rPr>
-              <w:t>+++ FOR day in days+++</w:t>
             </w:r>
           </w:p>
         </w:tc>
         <w:tc>
           <w:tcPr>
-            <w:tcW w:w="510" w:type="dxa"/>
+            <w:tcW w:w="3733" w:type="dxa"/>
             <w:tcBorders>
-              <w:right w:val="nil"/>
+              <w:left w:val="single" w:sz="4" w:space="0" w:color="000000"/>
+              <w:bottom w:val="single" w:sz="4" w:space="0" w:color="000000"/>
+              <w:right w:val="single" w:sz="4" w:space="0" w:color="000000"/>
             </w:tcBorders>
             <w:vAlign w:val="center"/>
           </w:tcPr>
@@ -941,39 +1190,17 @@
               <w:spacing w:lineRule="auto" w:line="240" w:before="0" w:after="0"/>
               <w:jc w:val="center"/>
               <w:rPr>
-                <w:rFonts w:ascii="Times New Roman" w:hAnsi="Times New Roman" w:eastAsia="Calibri" w:cs="Times New Roman"/>
-                <w:kern w:val="0"/>
-                <w:sz w:val="18"/>
-                <w:szCs w:val="18"/>
-                <w:lang w:val="fr-FR" w:eastAsia="en-US" w:bidi="ar-SA"/>
-              </w:rPr>
-            </w:pPr>
-            <w:r>
-              <w:rPr/>
-            </w:r>
-          </w:p>
-        </w:tc>
-        <w:tc>
-          <w:tcPr>
-            <w:tcW w:w="3866" w:type="dxa"/>
-            <w:tcBorders/>
-            <w:vAlign w:val="center"/>
-          </w:tcPr>
-          <w:p>
-            <w:pPr>
-              <w:pStyle w:val="Normal"/>
-              <w:widowControl/>
-              <w:suppressAutoHyphens w:val="true"/>
-              <w:spacing w:lineRule="auto" w:line="240" w:before="0" w:after="0"/>
-              <w:jc w:val="center"/>
-              <w:rPr/>
+                <w:rFonts w:ascii="Times New Roman" w:hAnsi="Times New Roman"/>
+                <w:sz w:val="16"/>
+                <w:szCs w:val="16"/>
+              </w:rPr>
             </w:pPr>
             <w:r>
               <w:rPr>
                 <w:rFonts w:eastAsia="Calibri" w:cs="Times New Roman" w:ascii="Times New Roman" w:hAnsi="Times New Roman"/>
                 <w:kern w:val="0"/>
-                <w:sz w:val="18"/>
-                <w:szCs w:val="18"/>
+                <w:sz w:val="16"/>
+                <w:szCs w:val="16"/>
                 <w:lang w:val="fr-FR" w:eastAsia="en-US" w:bidi="ar-SA"/>
               </w:rPr>
               <w:t>+++END-FOR day+++</w:t>
@@ -982,69 +1209,13 @@
         </w:tc>
       </w:tr>
       <w:tr>
-        <w:trPr>
-          <w:trHeight w:val="957" w:hRule="atLeast"/>
-        </w:trPr>
+        <w:trPr/>
         <w:tc>
           <w:tcPr>
             <w:tcW w:w="454" w:type="dxa"/>
-            <w:tcBorders/>
-            <w:vAlign w:val="center"/>
-          </w:tcPr>
-          <w:p>
-            <w:pPr>
-              <w:pStyle w:val="Normal"/>
-              <w:widowControl/>
-              <w:suppressAutoHyphens w:val="true"/>
-              <w:spacing w:lineRule="auto" w:line="240" w:before="0" w:after="0"/>
-              <w:jc w:val="center"/>
-              <w:rPr>
-                <w:rFonts w:ascii="Times New Roman" w:hAnsi="Times New Roman"/>
-                <w:sz w:val="18"/>
-                <w:szCs w:val="18"/>
-              </w:rPr>
-            </w:pPr>
-            <w:r>
-              <w:rPr>
-                <w:rFonts w:ascii="Times New Roman" w:hAnsi="Times New Roman"/>
-                <w:sz w:val="18"/>
-                <w:szCs w:val="18"/>
-              </w:rPr>
-            </w:r>
-          </w:p>
-        </w:tc>
-        <w:tc>
-          <w:tcPr>
-            <w:tcW w:w="3451" w:type="dxa"/>
-            <w:tcBorders/>
-            <w:vAlign w:val="center"/>
-          </w:tcPr>
-          <w:p>
-            <w:pPr>
-              <w:pStyle w:val="Normal"/>
-              <w:widowControl/>
-              <w:suppressAutoHyphens w:val="true"/>
-              <w:spacing w:lineRule="auto" w:line="240" w:before="0" w:after="0"/>
-              <w:jc w:val="left"/>
-              <w:rPr/>
-            </w:pPr>
-            <w:r>
-              <w:rPr>
-                <w:rFonts w:eastAsia="Calibri" w:cs="Times New Roman" w:ascii="Times New Roman" w:hAnsi="Times New Roman"/>
-                <w:kern w:val="0"/>
-                <w:sz w:val="18"/>
-                <w:szCs w:val="18"/>
-                <w:lang w:val="fr-FR" w:eastAsia="en-US" w:bidi="ar-SA"/>
-              </w:rPr>
-              <w:t>+++ END-FOR std+++</w:t>
-            </w:r>
-          </w:p>
-        </w:tc>
-        <w:tc>
-          <w:tcPr>
-            <w:tcW w:w="2320" w:type="dxa"/>
             <w:tcBorders>
-              <w:right w:val="nil"/>
+              <w:left w:val="single" w:sz="4" w:space="0" w:color="000000"/>
+              <w:bottom w:val="single" w:sz="4" w:space="0" w:color="000000"/>
             </w:tcBorders>
             <w:vAlign w:val="center"/>
           </w:tcPr>
@@ -1056,14 +1227,14 @@
               <w:spacing w:lineRule="auto" w:line="240" w:before="0" w:after="0"/>
               <w:jc w:val="center"/>
               <w:rPr>
-                <w:rFonts w:ascii="Times New Roman" w:hAnsi="Times New Roman" w:cs="Times New Roman"/>
+                <w:rFonts w:ascii="Times New Roman" w:hAnsi="Times New Roman"/>
                 <w:sz w:val="18"/>
                 <w:szCs w:val="18"/>
               </w:rPr>
             </w:pPr>
             <w:r>
               <w:rPr>
-                <w:rFonts w:cs="Times New Roman" w:ascii="Times New Roman" w:hAnsi="Times New Roman"/>
+                <w:rFonts w:ascii="Times New Roman" w:hAnsi="Times New Roman"/>
                 <w:sz w:val="18"/>
                 <w:szCs w:val="18"/>
               </w:rPr>
@@ -1072,9 +1243,10 @@
         </w:tc>
         <w:tc>
           <w:tcPr>
-            <w:tcW w:w="510" w:type="dxa"/>
+            <w:tcW w:w="3402" w:type="dxa"/>
             <w:tcBorders>
-              <w:right w:val="nil"/>
+              <w:left w:val="single" w:sz="4" w:space="0" w:color="000000"/>
+              <w:bottom w:val="single" w:sz="4" w:space="0" w:color="000000"/>
             </w:tcBorders>
             <w:vAlign w:val="center"/>
           </w:tcPr>
@@ -1084,46 +1256,92 @@
               <w:widowControl/>
               <w:suppressAutoHyphens w:val="true"/>
               <w:spacing w:lineRule="auto" w:line="240" w:before="0" w:after="0"/>
-              <w:jc w:val="center"/>
-              <w:rPr>
-                <w:rFonts w:ascii="Times New Roman" w:hAnsi="Times New Roman" w:cs="Times New Roman"/>
+              <w:jc w:val="left"/>
+              <w:rPr>
+                <w:rFonts w:ascii="Times New Roman" w:hAnsi="Times New Roman"/>
+              </w:rPr>
+            </w:pPr>
+            <w:r>
+              <w:rPr>
+                <w:rFonts w:eastAsia="Calibri" w:cs="Times New Roman" w:ascii="Times New Roman" w:hAnsi="Times New Roman"/>
+                <w:kern w:val="0"/>
                 <w:sz w:val="18"/>
                 <w:szCs w:val="18"/>
-              </w:rPr>
-            </w:pPr>
-            <w:r>
-              <w:rPr>
-                <w:rFonts w:cs="Times New Roman" w:ascii="Times New Roman" w:hAnsi="Times New Roman"/>
-                <w:sz w:val="18"/>
-                <w:szCs w:val="18"/>
-              </w:rPr>
+                <w:lang w:val="fr-FR" w:eastAsia="en-US" w:bidi="ar-SA"/>
+              </w:rPr>
+              <w:t>+++ END-FOR std+++</w:t>
             </w:r>
           </w:p>
         </w:tc>
         <w:tc>
           <w:tcPr>
-            <w:tcW w:w="3866" w:type="dxa"/>
-            <w:tcBorders/>
+            <w:tcW w:w="2423" w:type="dxa"/>
+            <w:tcBorders>
+              <w:left w:val="single" w:sz="4" w:space="0" w:color="000000"/>
+              <w:bottom w:val="single" w:sz="4" w:space="0" w:color="000000"/>
+            </w:tcBorders>
             <w:vAlign w:val="center"/>
           </w:tcPr>
           <w:p>
             <w:pPr>
-              <w:pStyle w:val="Normal"/>
-              <w:widowControl/>
-              <w:suppressAutoHyphens w:val="true"/>
-              <w:spacing w:lineRule="auto" w:line="240" w:before="0" w:after="0"/>
-              <w:jc w:val="center"/>
-              <w:rPr>
-                <w:rFonts w:ascii="Times New Roman" w:hAnsi="Times New Roman" w:cs="Times New Roman"/>
-                <w:sz w:val="18"/>
-                <w:szCs w:val="18"/>
+              <w:pStyle w:val="Contenudetableau"/>
+              <w:spacing w:before="0" w:after="160"/>
+              <w:rPr>
+                <w:rFonts w:ascii="Times New Roman" w:hAnsi="Times New Roman"/>
               </w:rPr>
             </w:pPr>
             <w:r>
               <w:rPr>
-                <w:rFonts w:cs="Times New Roman" w:ascii="Times New Roman" w:hAnsi="Times New Roman"/>
-                <w:sz w:val="18"/>
-                <w:szCs w:val="18"/>
+                <w:rFonts w:ascii="Times New Roman" w:hAnsi="Times New Roman"/>
+              </w:rPr>
+            </w:r>
+          </w:p>
+        </w:tc>
+        <w:tc>
+          <w:tcPr>
+            <w:tcW w:w="454" w:type="dxa"/>
+            <w:tcBorders>
+              <w:left w:val="single" w:sz="4" w:space="0" w:color="000000"/>
+              <w:bottom w:val="single" w:sz="4" w:space="0" w:color="000000"/>
+            </w:tcBorders>
+            <w:vAlign w:val="center"/>
+          </w:tcPr>
+          <w:p>
+            <w:pPr>
+              <w:pStyle w:val="Contenudetableau"/>
+              <w:spacing w:before="0" w:after="160"/>
+              <w:rPr>
+                <w:rFonts w:ascii="Times New Roman" w:hAnsi="Times New Roman"/>
+              </w:rPr>
+            </w:pPr>
+            <w:r>
+              <w:rPr>
+                <w:rFonts w:ascii="Times New Roman" w:hAnsi="Times New Roman"/>
+              </w:rPr>
+            </w:r>
+          </w:p>
+        </w:tc>
+        <w:tc>
+          <w:tcPr>
+            <w:tcW w:w="3733" w:type="dxa"/>
+            <w:tcBorders>
+              <w:left w:val="single" w:sz="4" w:space="0" w:color="000000"/>
+              <w:bottom w:val="single" w:sz="4" w:space="0" w:color="000000"/>
+              <w:right w:val="single" w:sz="4" w:space="0" w:color="000000"/>
+            </w:tcBorders>
+            <w:vAlign w:val="center"/>
+          </w:tcPr>
+          <w:p>
+            <w:pPr>
+              <w:pStyle w:val="Contenudetableau"/>
+              <w:spacing w:before="0" w:after="160"/>
+              <w:rPr>
+                <w:rFonts w:ascii="Times New Roman" w:hAnsi="Times New Roman"/>
+              </w:rPr>
+            </w:pPr>
+            <w:r>
+              <w:rPr>
+                <w:rFonts w:ascii="Times New Roman" w:hAnsi="Times New Roman"/>
               </w:rPr>
             </w:r>
           </w:p>
@@ -1134,17 +1352,28 @@
       <w:pPr>
         <w:pStyle w:val="Normal"/>
         <w:spacing w:before="0" w:after="160"/>
-        <w:rPr/>
+        <w:rPr>
+          <w:rFonts w:cs="Times New Roman"/>
+          <w:sz w:val="10"/>
+          <w:szCs w:val="10"/>
+        </w:rPr>
       </w:pPr>
       <w:r>
-        <w:rPr/>
+        <w:rPr>
+          <w:rFonts w:ascii="Times New Roman" w:hAnsi="Times New Roman"/>
+        </w:rPr>
+      </w:r>
+      <w:r>
+        <w:br w:type="page"/>
       </w:r>
     </w:p>
     <w:p>
       <w:pPr>
         <w:pStyle w:val="Normal"/>
         <w:spacing w:before="0" w:after="160"/>
-        <w:rPr/>
+        <w:rPr>
+          <w:rFonts w:ascii="Times New Roman" w:hAnsi="Times New Roman"/>
+        </w:rPr>
       </w:pPr>
       <w:r>
         <w:rPr>
@@ -1156,9 +1385,10 @@
       </w:r>
     </w:p>
     <w:sectPr>
+      <w:footerReference w:type="default" r:id="rId3"/>
       <w:type w:val="nextPage"/>
       <w:pgSz w:w="11906" w:h="16838"/>
-      <w:pgMar w:left="720" w:right="720" w:gutter="0" w:header="0" w:top="720" w:footer="0" w:bottom="720"/>
+      <w:pgMar w:left="720" w:right="720" w:gutter="0" w:header="0" w:top="720" w:footer="720" w:bottom="1367"/>
       <w:pgNumType w:fmt="decimal"/>
       <w:formProt w:val="false"/>
       <w:textDirection w:val="lrTb"/>
@@ -1166,6 +1396,66 @@
     </w:sectPr>
   </w:body>
 </w:document>
+</file>
+
+<file path=word/footer1.xml><?xml version="1.0" encoding="utf-8"?>
+<w:ftr xmlns:o="urn:schemas-microsoft-com:office:office" xmlns:r="http://schemas.openxmlformats.org/officeDocument/2006/relationships" xmlns:v="urn:schemas-microsoft-com:vml" xmlns:w="http://schemas.openxmlformats.org/wordprocessingml/2006/main" xmlns:w10="urn:schemas-microsoft-com:office:word" xmlns:wp="http://schemas.openxmlformats.org/drawingml/2006/wordprocessingDrawing" xmlns:wps="http://schemas.microsoft.com/office/word/2010/wordprocessingShape" xmlns:wpg="http://schemas.microsoft.com/office/word/2010/wordprocessingGroup" xmlns:mc="http://schemas.openxmlformats.org/markup-compatibility/2006" xmlns:wp14="http://schemas.microsoft.com/office/word/2010/wordprocessingDrawing" xmlns:w14="http://schemas.microsoft.com/office/word/2010/wordml" xmlns:w15="http://schemas.microsoft.com/office/word/2012/wordml" mc:Ignorable="w14 wp14 w15">
+  <w:p>
+    <w:pPr>
+      <w:pStyle w:val="Footer"/>
+      <w:spacing w:before="0" w:after="160"/>
+      <w:jc w:val="right"/>
+      <w:rPr>
+        <w:sz w:val="16"/>
+        <w:szCs w:val="16"/>
+      </w:rPr>
+    </w:pPr>
+    <w:r>
+      <w:rPr>
+        <w:rFonts w:ascii="Times New Roman" w:hAnsi="Times New Roman"/>
+        <w:sz w:val="16"/>
+        <w:szCs w:val="16"/>
+      </w:rPr>
+      <w:t>Liste de présence</w:t>
+    </w:r>
+    <w:r>
+      <w:rPr>
+        <w:rFonts w:ascii="Times New Roman" w:hAnsi="Times New Roman"/>
+        <w:sz w:val="16"/>
+        <w:szCs w:val="16"/>
+      </w:rPr>
+      <w:t xml:space="preserve"> </w:t>
+    </w:r>
+    <w:r>
+      <w:rPr>
+        <w:rFonts w:cs="Times New Roman" w:ascii="Times New Roman" w:hAnsi="Times New Roman"/>
+        <w:sz w:val="16"/>
+        <w:szCs w:val="16"/>
+        <w:lang w:val="en-US"/>
+      </w:rPr>
+      <w:t xml:space="preserve">| +++assignment.sessionName+++ | </w:t>
+    </w:r>
+    <w:r>
+      <w:rPr>
+        <w:rFonts w:cs="Times New Roman" w:ascii="Times New Roman" w:hAnsi="Times New Roman"/>
+        <w:b/>
+        <w:sz w:val="16"/>
+        <w:szCs w:val="16"/>
+        <w:lang w:val="en-US"/>
+      </w:rPr>
+      <w:t>+++school.name+++</w:t>
+    </w:r>
+    <w:r>
+      <w:rPr>
+        <w:rFonts w:cs="Times New Roman" w:ascii="Times New Roman" w:hAnsi="Times New Roman"/>
+        <w:sz w:val="16"/>
+        <w:szCs w:val="16"/>
+        <w:lang w:val="en-US"/>
+      </w:rPr>
+      <w:t xml:space="preserve"> | +++school.studyYear.yearName+++</w:t>
+    </w:r>
+  </w:p>
+</w:ftr>
 </file>
 
 <file path=word/numbering.xml><?xml version="1.0" encoding="utf-8"?>
@@ -1292,8 +1582,8 @@
   <w:abstractNum w:abstractNumId="2">
     <w:lvl w:ilvl="0">
       <w:start w:val="1"/>
-      <w:numFmt w:val="decimal"/>
-      <w:lvlText w:val="%1."/>
+      <w:numFmt w:val="bullet"/>
+      <w:lvlText w:val=""/>
       <w:lvlJc w:val="left"/>
       <w:pPr>
         <w:tabs>
@@ -1301,12 +1591,14 @@
         </w:tabs>
         <w:ind w:left="720" w:hanging="360"/>
       </w:pPr>
-      <w:rPr/>
+      <w:rPr>
+        <w:rFonts w:ascii="Symbol" w:hAnsi="Symbol" w:cs="Symbol" w:hint="default"/>
+      </w:rPr>
     </w:lvl>
     <w:lvl w:ilvl="1">
       <w:start w:val="1"/>
-      <w:numFmt w:val="decimal"/>
-      <w:lvlText w:val="%2."/>
+      <w:numFmt w:val="bullet"/>
+      <w:lvlText w:val=""/>
       <w:lvlJc w:val="left"/>
       <w:pPr>
         <w:tabs>
@@ -1314,12 +1606,14 @@
         </w:tabs>
         <w:ind w:left="1080" w:hanging="360"/>
       </w:pPr>
-      <w:rPr/>
+      <w:rPr>
+        <w:rFonts w:ascii="Symbol" w:hAnsi="Symbol" w:cs="Symbol" w:hint="default"/>
+      </w:rPr>
     </w:lvl>
     <w:lvl w:ilvl="2">
       <w:start w:val="1"/>
-      <w:numFmt w:val="decimal"/>
-      <w:lvlText w:val="%3."/>
+      <w:numFmt w:val="bullet"/>
+      <w:lvlText w:val=""/>
       <w:lvlJc w:val="left"/>
       <w:pPr>
         <w:tabs>
@@ -1327,12 +1621,14 @@
         </w:tabs>
         <w:ind w:left="1440" w:hanging="360"/>
       </w:pPr>
-      <w:rPr/>
+      <w:rPr>
+        <w:rFonts w:ascii="Symbol" w:hAnsi="Symbol" w:cs="Symbol" w:hint="default"/>
+      </w:rPr>
     </w:lvl>
     <w:lvl w:ilvl="3">
       <w:start w:val="1"/>
-      <w:numFmt w:val="decimal"/>
-      <w:lvlText w:val="%4."/>
+      <w:numFmt w:val="bullet"/>
+      <w:lvlText w:val=""/>
       <w:lvlJc w:val="left"/>
       <w:pPr>
         <w:tabs>
@@ -1340,12 +1636,14 @@
         </w:tabs>
         <w:ind w:left="1800" w:hanging="360"/>
       </w:pPr>
-      <w:rPr/>
+      <w:rPr>
+        <w:rFonts w:ascii="Symbol" w:hAnsi="Symbol" w:cs="Symbol" w:hint="default"/>
+      </w:rPr>
     </w:lvl>
     <w:lvl w:ilvl="4">
       <w:start w:val="1"/>
-      <w:numFmt w:val="decimal"/>
-      <w:lvlText w:val="%5."/>
+      <w:numFmt w:val="bullet"/>
+      <w:lvlText w:val=""/>
       <w:lvlJc w:val="left"/>
       <w:pPr>
         <w:tabs>
@@ -1353,12 +1651,14 @@
         </w:tabs>
         <w:ind w:left="2160" w:hanging="360"/>
       </w:pPr>
-      <w:rPr/>
+      <w:rPr>
+        <w:rFonts w:ascii="Symbol" w:hAnsi="Symbol" w:cs="Symbol" w:hint="default"/>
+      </w:rPr>
     </w:lvl>
     <w:lvl w:ilvl="5">
       <w:start w:val="1"/>
-      <w:numFmt w:val="decimal"/>
-      <w:lvlText w:val="%6."/>
+      <w:numFmt w:val="bullet"/>
+      <w:lvlText w:val=""/>
       <w:lvlJc w:val="left"/>
       <w:pPr>
         <w:tabs>
@@ -1366,12 +1666,14 @@
         </w:tabs>
         <w:ind w:left="2520" w:hanging="360"/>
       </w:pPr>
-      <w:rPr/>
+      <w:rPr>
+        <w:rFonts w:ascii="Symbol" w:hAnsi="Symbol" w:cs="Symbol" w:hint="default"/>
+      </w:rPr>
     </w:lvl>
     <w:lvl w:ilvl="6">
       <w:start w:val="1"/>
-      <w:numFmt w:val="decimal"/>
-      <w:lvlText w:val="%7."/>
+      <w:numFmt w:val="bullet"/>
+      <w:lvlText w:val=""/>
       <w:lvlJc w:val="left"/>
       <w:pPr>
         <w:tabs>
@@ -1379,12 +1681,14 @@
         </w:tabs>
         <w:ind w:left="2880" w:hanging="360"/>
       </w:pPr>
-      <w:rPr/>
+      <w:rPr>
+        <w:rFonts w:ascii="Symbol" w:hAnsi="Symbol" w:cs="Symbol" w:hint="default"/>
+      </w:rPr>
     </w:lvl>
     <w:lvl w:ilvl="7">
       <w:start w:val="1"/>
-      <w:numFmt w:val="decimal"/>
-      <w:lvlText w:val="%8."/>
+      <w:numFmt w:val="bullet"/>
+      <w:lvlText w:val=""/>
       <w:lvlJc w:val="left"/>
       <w:pPr>
         <w:tabs>
@@ -1392,12 +1696,14 @@
         </w:tabs>
         <w:ind w:left="3240" w:hanging="360"/>
       </w:pPr>
-      <w:rPr/>
+      <w:rPr>
+        <w:rFonts w:ascii="Symbol" w:hAnsi="Symbol" w:cs="Symbol" w:hint="default"/>
+      </w:rPr>
     </w:lvl>
     <w:lvl w:ilvl="8">
       <w:start w:val="1"/>
-      <w:numFmt w:val="decimal"/>
-      <w:lvlText w:val="%9."/>
+      <w:numFmt w:val="bullet"/>
+      <w:lvlText w:val=""/>
       <w:lvlJc w:val="left"/>
       <w:pPr>
         <w:tabs>
@@ -1405,7 +1711,9 @@
         </w:tabs>
         <w:ind w:left="3600" w:hanging="360"/>
       </w:pPr>
-      <w:rPr/>
+      <w:rPr>
+        <w:rFonts w:ascii="Symbol" w:hAnsi="Symbol" w:cs="Symbol" w:hint="default"/>
+      </w:rPr>
     </w:lvl>
   </w:abstractNum>
   <w:num w:numId="1">
@@ -1812,6 +2120,7 @@
     <w:qFormat/>
     <w:pPr>
       <w:widowControl/>
+      <w:suppressAutoHyphens w:val="true"/>
       <w:bidi w:val="0"/>
       <w:spacing w:lineRule="auto" w:line="259" w:before="0" w:after="160"/>
       <w:jc w:val="left"/>
@@ -1838,6 +2147,7 @@
       <w:keepNext w:val="true"/>
       <w:keepLines/>
       <w:widowControl/>
+      <w:suppressAutoHyphens w:val="true"/>
       <w:bidi w:val="0"/>
       <w:spacing w:lineRule="auto" w:line="360" w:before="0" w:after="178"/>
       <w:ind w:hanging="10" w:left="-5" w:right="-15"/>
@@ -1851,7 +2161,7 @@
       <w:kern w:val="0"/>
       <w:sz w:val="28"/>
       <w:szCs w:val="22"/>
-      <w:lang w:eastAsia="fr-FR" w:val="fr-FR" w:bidi="ar-SA"/>
+      <w:lang w:val="fr-FR" w:eastAsia="fr-FR" w:bidi="ar-SA"/>
     </w:rPr>
   </w:style>
   <w:style w:type="paragraph" w:styleId="Heading2">
@@ -1867,6 +2177,7 @@
       <w:keepNext w:val="true"/>
       <w:keepLines/>
       <w:widowControl/>
+      <w:suppressAutoHyphens w:val="true"/>
       <w:bidi w:val="0"/>
       <w:spacing w:lineRule="auto" w:line="360" w:before="0" w:after="60"/>
       <w:ind w:hanging="10" w:left="-5" w:right="-15"/>
@@ -1880,7 +2191,7 @@
       <w:kern w:val="0"/>
       <w:sz w:val="24"/>
       <w:szCs w:val="22"/>
-      <w:lang w:eastAsia="fr-FR" w:val="fr-FR" w:bidi="ar-SA"/>
+      <w:lang w:val="fr-FR" w:eastAsia="fr-FR" w:bidi="ar-SA"/>
     </w:rPr>
   </w:style>
   <w:style w:type="paragraph" w:styleId="Heading3">
@@ -1896,6 +2207,7 @@
       <w:keepNext w:val="true"/>
       <w:keepLines/>
       <w:widowControl/>
+      <w:suppressAutoHyphens w:val="true"/>
       <w:bidi w:val="0"/>
       <w:spacing w:lineRule="auto" w:line="240" w:before="0" w:after="60"/>
       <w:ind w:hanging="10" w:left="-5" w:right="-15"/>
@@ -1908,7 +2220,7 @@
       <w:kern w:val="0"/>
       <w:sz w:val="24"/>
       <w:szCs w:val="22"/>
-      <w:lang w:eastAsia="fr-FR" w:val="fr-FR" w:bidi="ar-SA"/>
+      <w:lang w:val="fr-FR" w:eastAsia="fr-FR" w:bidi="ar-SA"/>
     </w:rPr>
   </w:style>
   <w:style w:type="character" w:styleId="DefaultParagraphFont" w:default="1">
@@ -2072,6 +2384,28 @@
       <w:b/>
       <w:bCs/>
     </w:rPr>
+  </w:style>
+  <w:style w:type="paragraph" w:styleId="En-tteetpieddepage">
+    <w:name w:val="En-tête et pied de page"/>
+    <w:basedOn w:val="Normal"/>
+    <w:qFormat/>
+    <w:pPr>
+      <w:suppressLineNumbers/>
+      <w:tabs>
+        <w:tab w:val="clear" w:pos="708"/>
+        <w:tab w:val="center" w:pos="5233" w:leader="none"/>
+        <w:tab w:val="right" w:pos="10466" w:leader="none"/>
+      </w:tabs>
+    </w:pPr>
+    <w:rPr/>
+  </w:style>
+  <w:style w:type="paragraph" w:styleId="Footer">
+    <w:name w:val="Footer"/>
+    <w:basedOn w:val="En-tteetpieddepage"/>
+    <w:pPr>
+      <w:suppressLineNumbers/>
+    </w:pPr>
+    <w:rPr/>
   </w:style>
   <w:style w:type="numbering" w:styleId="Pasdeliste" w:default="1">
     <w:name w:val="Pas de liste"/>

</xml_diff>

<commit_message>
feat: corriger les noms de variables pour la cohérence et ajouter la gestion des sièges dans les assignations
</commit_message>
<xml_diff>
--- a/documents_templates/seating-presence.docx
+++ b/documents_templates/seating-presence.docx
@@ -75,7 +75,7 @@
         <mc:AlternateContent>
           <mc:Choice Requires="wps">
             <w:drawing>
-              <wp:anchor behindDoc="0" distT="0" distB="0" distL="109855" distR="105410" simplePos="0" locked="0" layoutInCell="0" allowOverlap="1" relativeHeight="3">
+              <wp:anchor behindDoc="0" distT="0" distB="0" distL="109220" distR="104140" simplePos="0" locked="0" layoutInCell="0" allowOverlap="1" relativeHeight="3">
                 <wp:simplePos x="0" y="0"/>
                 <wp:positionH relativeFrom="margin">
                   <wp:posOffset>5918200</wp:posOffset>
@@ -240,29 +240,7 @@
           <w:szCs w:val="18"/>
           <w:lang w:val="en-US"/>
         </w:rPr>
-        <w:t>+++school.ad</w:t>
-      </w:r>
-      <w:r>
-        <w:rPr>
-          <w:rFonts w:cs="Times New Roman" w:ascii="Times New Roman" w:hAnsi="Times New Roman"/>
-          <w:i/>
-          <w:iCs/>
-          <w:sz w:val="18"/>
-          <w:szCs w:val="18"/>
-          <w:lang w:val="en-US"/>
-        </w:rPr>
-        <w:t>d</w:t>
-      </w:r>
-      <w:r>
-        <w:rPr>
-          <w:rFonts w:cs="Times New Roman" w:ascii="Times New Roman" w:hAnsi="Times New Roman"/>
-          <w:i/>
-          <w:iCs/>
-          <w:sz w:val="18"/>
-          <w:szCs w:val="18"/>
-          <w:lang w:val="en-US"/>
-        </w:rPr>
-        <w:t>ress+++, +++school.town+++</w:t>
+        <w:t>+++school.address+++, +++school.town+++</w:t>
       </w:r>
     </w:p>
     <w:p>
@@ -535,10 +513,10 @@
       </w:tblPr>
       <w:tblGrid>
         <w:gridCol w:w="454"/>
-        <w:gridCol w:w="3401"/>
+        <w:gridCol w:w="3400"/>
         <w:gridCol w:w="2423"/>
         <w:gridCol w:w="454"/>
-        <w:gridCol w:w="3734"/>
+        <w:gridCol w:w="3735"/>
       </w:tblGrid>
       <w:tr>
         <w:trPr>
@@ -566,7 +544,7 @@
         </w:tc>
         <w:tc>
           <w:tcPr>
-            <w:tcW w:w="3401" w:type="dxa"/>
+            <w:tcW w:w="3400" w:type="dxa"/>
             <w:tcBorders/>
             <w:textDirection w:val="btLr"/>
             <w:vAlign w:val="bottom"/>
@@ -669,7 +647,7 @@
         </w:tc>
         <w:tc>
           <w:tcPr>
-            <w:tcW w:w="3734" w:type="dxa"/>
+            <w:tcW w:w="3735" w:type="dxa"/>
             <w:tcBorders>
               <w:top w:val="single" w:sz="4" w:space="0" w:color="000000"/>
               <w:left w:val="single" w:sz="4" w:space="0" w:color="000000"/>
@@ -749,7 +727,7 @@
         </w:tc>
         <w:tc>
           <w:tcPr>
-            <w:tcW w:w="3401" w:type="dxa"/>
+            <w:tcW w:w="3400" w:type="dxa"/>
             <w:tcBorders>
               <w:top w:val="single" w:sz="4" w:space="0" w:color="000000"/>
               <w:left w:val="single" w:sz="4" w:space="0" w:color="000000"/>
@@ -851,7 +829,7 @@
         </w:tc>
         <w:tc>
           <w:tcPr>
-            <w:tcW w:w="3734" w:type="dxa"/>
+            <w:tcW w:w="3735" w:type="dxa"/>
             <w:tcBorders>
               <w:left w:val="single" w:sz="4" w:space="0" w:color="000000"/>
               <w:bottom w:val="single" w:sz="4" w:space="0" w:color="000000"/>
@@ -919,7 +897,7 @@
         </w:tc>
         <w:tc>
           <w:tcPr>
-            <w:tcW w:w="3401" w:type="dxa"/>
+            <w:tcW w:w="3400" w:type="dxa"/>
             <w:tcBorders>
               <w:left w:val="single" w:sz="4" w:space="0" w:color="000000"/>
               <w:bottom w:val="single" w:sz="4" w:space="0" w:color="000000"/>
@@ -999,7 +977,7 @@
         </w:tc>
         <w:tc>
           <w:tcPr>
-            <w:tcW w:w="3734" w:type="dxa"/>
+            <w:tcW w:w="3735" w:type="dxa"/>
             <w:tcBorders>
               <w:left w:val="single" w:sz="4" w:space="0" w:color="000000"/>
               <w:bottom w:val="single" w:sz="4" w:space="0" w:color="000000"/>
@@ -1061,7 +1039,7 @@
         </w:tc>
         <w:tc>
           <w:tcPr>
-            <w:tcW w:w="3401" w:type="dxa"/>
+            <w:tcW w:w="3400" w:type="dxa"/>
             <w:tcBorders>
               <w:left w:val="single" w:sz="4" w:space="0" w:color="000000"/>
               <w:bottom w:val="single" w:sz="4" w:space="0" w:color="000000"/>
@@ -1111,7 +1089,7 @@
                 <w:szCs w:val="16"/>
                 <w:lang w:val="fr-FR" w:eastAsia="en-US" w:bidi="ar-SA"/>
               </w:rPr>
-              <w:t>.enrolement.student.fullName+++</w:t>
+              <w:t>.enrollment.student.fullName+++</w:t>
             </w:r>
           </w:p>
         </w:tc>
@@ -1186,7 +1164,7 @@
         </w:tc>
         <w:tc>
           <w:tcPr>
-            <w:tcW w:w="3734" w:type="dxa"/>
+            <w:tcW w:w="3735" w:type="dxa"/>
             <w:tcBorders>
               <w:left w:val="single" w:sz="4" w:space="0" w:color="000000"/>
               <w:bottom w:val="single" w:sz="4" w:space="0" w:color="000000"/>
@@ -1255,7 +1233,7 @@
         </w:tc>
         <w:tc>
           <w:tcPr>
-            <w:tcW w:w="3401" w:type="dxa"/>
+            <w:tcW w:w="3400" w:type="dxa"/>
             <w:tcBorders>
               <w:left w:val="single" w:sz="4" w:space="0" w:color="000000"/>
               <w:bottom w:val="single" w:sz="4" w:space="0" w:color="000000"/>
@@ -1335,7 +1313,7 @@
         </w:tc>
         <w:tc>
           <w:tcPr>
-            <w:tcW w:w="3734" w:type="dxa"/>
+            <w:tcW w:w="3735" w:type="dxa"/>
             <w:tcBorders>
               <w:left w:val="single" w:sz="4" w:space="0" w:color="000000"/>
               <w:bottom w:val="single" w:sz="4" w:space="0" w:color="000000"/>
@@ -1419,7 +1397,6 @@
   <w:p>
     <w:pPr>
       <w:pStyle w:val="Footer"/>
-      <w:suppressLineNumbers/>
       <w:spacing w:before="0" w:after="160"/>
       <w:rPr/>
     </w:pPr>

</xml_diff>

<commit_message>
refactor: réorganiser l'exportation des documents de présence et supprimer les fichiers obsolètes
</commit_message>
<xml_diff>
--- a/documents_templates/seating-presence.docx
+++ b/documents_templates/seating-presence.docx
@@ -1,34 +1,38 @@
 
 <file path=word/document.xml><?xml version="1.0" encoding="utf-8"?>
-<w:document xmlns:o="urn:schemas-microsoft-com:office:office" xmlns:r="http://schemas.openxmlformats.org/officeDocument/2006/relationships" xmlns:v="urn:schemas-microsoft-com:vml" xmlns:w="http://schemas.openxmlformats.org/wordprocessingml/2006/main" xmlns:w10="urn:schemas-microsoft-com:office:word" xmlns:wp="http://schemas.openxmlformats.org/drawingml/2006/wordprocessingDrawing" xmlns:wps="http://schemas.microsoft.com/office/word/2010/wordprocessingShape" xmlns:wpg="http://schemas.microsoft.com/office/word/2010/wordprocessingGroup" xmlns:mc="http://schemas.openxmlformats.org/markup-compatibility/2006" xmlns:wp14="http://schemas.microsoft.com/office/word/2010/wordprocessingDrawing" xmlns:w14="http://schemas.microsoft.com/office/word/2010/wordml" xmlns:w15="http://schemas.microsoft.com/office/word/2012/wordml" mc:Ignorable="w14 wp14 w15">
+<w:document xmlns:wpc="http://schemas.microsoft.com/office/word/2010/wordprocessingCanvas" xmlns:mc="http://schemas.openxmlformats.org/markup-compatibility/2006" xmlns:o="urn:schemas-microsoft-com:office:office" xmlns:r="http://schemas.openxmlformats.org/officeDocument/2006/relationships" xmlns:m="http://schemas.openxmlformats.org/officeDocument/2006/math" xmlns:v="urn:schemas-microsoft-com:vml" xmlns:wp14="http://schemas.microsoft.com/office/word/2010/wordprocessingDrawing" xmlns:wp="http://schemas.openxmlformats.org/drawingml/2006/wordprocessingDrawing" xmlns:w10="urn:schemas-microsoft-com:office:word" xmlns:w="http://schemas.openxmlformats.org/wordprocessingml/2006/main" xmlns:w14="http://schemas.microsoft.com/office/word/2010/wordml" xmlns:w15="http://schemas.microsoft.com/office/word/2012/wordml" xmlns:wpg="http://schemas.microsoft.com/office/word/2010/wordprocessingGroup" xmlns:wpi="http://schemas.microsoft.com/office/word/2010/wordprocessingInk" xmlns:wne="http://schemas.microsoft.com/office/word/2006/wordml" xmlns:wps="http://schemas.microsoft.com/office/word/2010/wordprocessingShape" mc:Ignorable="w14 w15 wp14">
   <w:body>
     <w:p>
       <w:pPr>
-        <w:pStyle w:val="Normal"/>
         <w:rPr>
           <w:rFonts w:ascii="Times New Roman" w:hAnsi="Times New Roman"/>
-        </w:rPr>
-      </w:pPr>
-      <w:r>
-        <w:rPr>
-          <w:rFonts w:cs="Times New Roman" w:ascii="Times New Roman" w:hAnsi="Times New Roman"/>
+          <w:lang w:val="en-US"/>
+        </w:rPr>
+      </w:pPr>
+      <w:r>
+        <w:rPr>
+          <w:rFonts w:ascii="Times New Roman" w:hAnsi="Times New Roman" w:cs="Times New Roman"/>
           <w:sz w:val="10"/>
+          <w:lang w:val="en-US"/>
         </w:rPr>
         <w:t>+++FOR assign in assignment.assignments+++</w:t>
       </w:r>
     </w:p>
     <w:p>
       <w:pPr>
-        <w:pStyle w:val="Normal"/>
-        <w:spacing w:before="0" w:after="0"/>
+        <w:spacing w:after="0"/>
         <w:jc w:val="center"/>
         <w:rPr>
           <w:rFonts w:ascii="Times New Roman" w:hAnsi="Times New Roman"/>
         </w:rPr>
       </w:pPr>
       <w:r>
+        <w:rPr>
+          <w:noProof/>
+          <w:lang w:eastAsia="fr-FR"/>
+        </w:rPr>
         <w:drawing>
-          <wp:anchor behindDoc="0" distT="0" distB="0" distL="114300" distR="114300" simplePos="0" locked="0" layoutInCell="0" allowOverlap="1" relativeHeight="2">
+          <wp:anchor distT="0" distB="0" distL="114300" distR="114300" simplePos="0" relativeHeight="2" behindDoc="0" locked="0" layoutInCell="0" allowOverlap="1">
             <wp:simplePos x="0" y="0"/>
             <wp:positionH relativeFrom="column">
               <wp:posOffset>-635</wp:posOffset>
@@ -39,7 +43,7 @@
             <wp:extent cx="575310" cy="555625"/>
             <wp:effectExtent l="0" t="0" r="0" b="0"/>
             <wp:wrapSquare wrapText="bothSides"/>
-            <wp:docPr id="1" name="Picture 3" descr=""/>
+            <wp:docPr id="1" name="Picture 3"/>
             <wp:cNvGraphicFramePr>
               <a:graphicFrameLocks xmlns:a="http://schemas.openxmlformats.org/drawingml/2006/main" noChangeAspect="1"/>
             </wp:cNvGraphicFramePr>
@@ -47,13 +51,13 @@
               <a:graphicData uri="http://schemas.openxmlformats.org/drawingml/2006/picture">
                 <pic:pic xmlns:pic="http://schemas.openxmlformats.org/drawingml/2006/picture">
                   <pic:nvPicPr>
-                    <pic:cNvPr id="1" name="Picture 3" descr=""/>
+                    <pic:cNvPr id="1" name="Picture 3"/>
                     <pic:cNvPicPr>
                       <a:picLocks noChangeAspect="1" noChangeArrowheads="1"/>
                     </pic:cNvPicPr>
                   </pic:nvPicPr>
                   <pic:blipFill>
-                    <a:blip r:embed="rId2"/>
+                    <a:blip r:embed="rId7"/>
                     <a:stretch>
                       <a:fillRect/>
                     </a:stretch>
@@ -72,10 +76,16 @@
             </a:graphic>
           </wp:anchor>
         </w:drawing>
+      </w:r>
+      <w:r>
+        <w:rPr>
+          <w:noProof/>
+          <w:lang w:eastAsia="fr-FR"/>
+        </w:rPr>
         <mc:AlternateContent>
           <mc:Choice Requires="wps">
             <w:drawing>
-              <wp:anchor behindDoc="0" distT="0" distB="0" distL="109220" distR="104140" simplePos="0" locked="0" layoutInCell="0" allowOverlap="1" relativeHeight="3">
+              <wp:anchor distT="0" distB="0" distL="109220" distR="104140" simplePos="0" relativeHeight="3" behindDoc="0" locked="0" layoutInCell="0" allowOverlap="1">
                 <wp:simplePos x="0" y="0"/>
                 <wp:positionH relativeFrom="margin">
                   <wp:posOffset>5918200</wp:posOffset>
@@ -87,6 +97,7 @@
                 <wp:effectExtent l="0" t="0" r="0" b="0"/>
                 <wp:wrapSquare wrapText="bothSides"/>
                 <wp:docPr id="2" name="Cadre1"/>
+                <wp:cNvGraphicFramePr/>
                 <a:graphic xmlns:a="http://schemas.openxmlformats.org/drawingml/2006/main">
                   <a:graphicData uri="http://schemas.microsoft.com/office/word/2010/wordprocessingShape">
                     <wps:wsp>
@@ -108,9 +119,15 @@
                         </a:ln>
                       </wps:spPr>
                       <wps:style>
-                        <a:lnRef idx="0"/>
-                        <a:fillRef idx="0"/>
-                        <a:effectRef idx="0"/>
+                        <a:lnRef idx="0">
+                          <a:scrgbClr r="0" g="0" b="0"/>
+                        </a:lnRef>
+                        <a:fillRef idx="0">
+                          <a:scrgbClr r="0" g="0" b="0"/>
+                        </a:fillRef>
+                        <a:effectRef idx="0">
+                          <a:scrgbClr r="0" g="0" b="0"/>
+                        </a:effectRef>
                         <a:fontRef idx="minor"/>
                       </wps:style>
                       <wps:txbx>
@@ -118,7 +135,6 @@
                           <w:p>
                             <w:pPr>
                               <w:pStyle w:val="Contenudecadre"/>
-                              <w:spacing w:before="0" w:after="160"/>
                               <w:jc w:val="center"/>
                               <w:rPr>
                                 <w:sz w:val="16"/>
@@ -145,15 +161,13 @@
           </mc:Choice>
           <mc:Fallback>
             <w:pict>
-              <v:rect id="shape_0" ID="Cadre1" path="m0,0l-2147483645,0l-2147483645,-2147483646l0,-2147483646xe" stroked="t" o:allowincell="f" style="position:absolute;margin-left:466pt;margin-top:-0.9pt;width:56.65pt;height:56.65pt;mso-wrap-style:square;v-text-anchor:top;mso-position-horizontal-relative:margin;mso-position-vertical-relative:margin">
-                <v:fill o:detectmouseclick="t" on="false"/>
-                <v:stroke color="black" dashstyle="dash" joinstyle="round" endcap="flat"/>
+              <v:rect id="Cadre1" o:spid="_x0000_s1026" style="position:absolute;left:0;text-align:left;margin-left:466pt;margin-top:-.9pt;width:56.7pt;height:56.7pt;z-index:3;visibility:visible;mso-wrap-style:square;mso-wrap-distance-left:8.6pt;mso-wrap-distance-top:0;mso-wrap-distance-right:8.2pt;mso-wrap-distance-bottom:0;mso-position-horizontal:absolute;mso-position-horizontal-relative:margin;mso-position-vertical:absolute;mso-position-vertical-relative:margin;v-text-anchor:top" o:gfxdata="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" o:allowincell="f" filled="f" strokeweight="0">
+                <v:stroke dashstyle="dash"/>
                 <v:textbox>
                   <w:txbxContent>
                     <w:p>
                       <w:pPr>
                         <w:pStyle w:val="Contenudecadre"/>
-                        <w:spacing w:before="0" w:after="160"/>
                         <w:jc w:val="center"/>
                         <w:rPr>
                           <w:sz w:val="16"/>
@@ -169,7 +183,7 @@
                     </w:p>
                   </w:txbxContent>
                 </v:textbox>
-                <w10:wrap type="square"/>
+                <w10:wrap type="square" anchorx="margin" anchory="margin"/>
               </v:rect>
             </w:pict>
           </mc:Fallback>
@@ -177,7 +191,7 @@
       </w:r>
       <w:r>
         <w:rPr>
-          <w:rFonts w:cs="Times New Roman" w:ascii="Times New Roman" w:hAnsi="Times New Roman"/>
+          <w:rFonts w:ascii="Times New Roman" w:hAnsi="Times New Roman" w:cs="Times New Roman"/>
           <w:b/>
           <w:bCs/>
           <w:sz w:val="20"/>
@@ -188,8 +202,7 @@
     </w:p>
     <w:p>
       <w:pPr>
-        <w:pStyle w:val="Normal"/>
-        <w:spacing w:before="0" w:after="0"/>
+        <w:spacing w:after="0"/>
         <w:jc w:val="center"/>
         <w:rPr>
           <w:rFonts w:ascii="Times New Roman" w:hAnsi="Times New Roman"/>
@@ -197,7 +210,7 @@
       </w:pPr>
       <w:r>
         <w:rPr>
-          <w:rFonts w:cs="Times New Roman" w:ascii="Times New Roman" w:hAnsi="Times New Roman"/>
+          <w:rFonts w:ascii="Times New Roman" w:hAnsi="Times New Roman" w:cs="Times New Roman"/>
           <w:sz w:val="18"/>
           <w:szCs w:val="18"/>
         </w:rPr>
@@ -206,48 +219,122 @@
     </w:p>
     <w:p>
       <w:pPr>
-        <w:pStyle w:val="Normal"/>
         <w:spacing w:before="57" w:after="57"/>
         <w:jc w:val="center"/>
         <w:rPr>
           <w:rFonts w:ascii="Times New Roman" w:hAnsi="Times New Roman"/>
-        </w:rPr>
-      </w:pPr>
-      <w:r>
-        <w:rPr>
-          <w:rFonts w:cs="Times New Roman" w:ascii="Times New Roman" w:hAnsi="Times New Roman"/>
+          <w:lang w:val="en-US"/>
+        </w:rPr>
+      </w:pPr>
+      <w:r>
+        <w:rPr>
+          <w:rFonts w:ascii="Times New Roman" w:hAnsi="Times New Roman" w:cs="Times New Roman"/>
           <w:b/>
           <w:lang w:val="en-US"/>
         </w:rPr>
-        <w:t>+++toUpperCase(school.name)+++</w:t>
+        <w:t>+++</w:t>
+      </w:r>
+      <w:proofErr w:type="spellStart"/>
+      <w:proofErr w:type="gramStart"/>
+      <w:r>
+        <w:rPr>
+          <w:rFonts w:ascii="Times New Roman" w:hAnsi="Times New Roman" w:cs="Times New Roman"/>
+          <w:b/>
+          <w:lang w:val="en-US"/>
+        </w:rPr>
+        <w:t>toUpperCase</w:t>
+      </w:r>
+      <w:proofErr w:type="spellEnd"/>
+      <w:r>
+        <w:rPr>
+          <w:rFonts w:ascii="Times New Roman" w:hAnsi="Times New Roman" w:cs="Times New Roman"/>
+          <w:b/>
+          <w:lang w:val="en-US"/>
+        </w:rPr>
+        <w:t>(</w:t>
+      </w:r>
+      <w:proofErr w:type="gramEnd"/>
+      <w:r>
+        <w:rPr>
+          <w:rFonts w:ascii="Times New Roman" w:hAnsi="Times New Roman" w:cs="Times New Roman"/>
+          <w:b/>
+          <w:lang w:val="en-US"/>
+        </w:rPr>
+        <w:t>school.name)+++</w:t>
       </w:r>
     </w:p>
     <w:p>
       <w:pPr>
-        <w:pStyle w:val="Normal"/>
-        <w:spacing w:before="0" w:after="0"/>
+        <w:spacing w:after="0"/>
         <w:jc w:val="center"/>
         <w:rPr>
           <w:rFonts w:ascii="Times New Roman" w:hAnsi="Times New Roman"/>
-        </w:rPr>
-      </w:pPr>
-      <w:r>
-        <w:rPr>
-          <w:rFonts w:cs="Times New Roman" w:ascii="Times New Roman" w:hAnsi="Times New Roman"/>
+          <w:lang w:val="en-US"/>
+        </w:rPr>
+      </w:pPr>
+      <w:r>
+        <w:rPr>
+          <w:rFonts w:ascii="Times New Roman" w:hAnsi="Times New Roman" w:cs="Times New Roman"/>
           <w:i/>
           <w:iCs/>
           <w:sz w:val="18"/>
           <w:szCs w:val="18"/>
           <w:lang w:val="en-US"/>
         </w:rPr>
-        <w:t>+++school.address+++, +++school.town+++</w:t>
+        <w:t>+++</w:t>
+      </w:r>
+      <w:proofErr w:type="spellStart"/>
+      <w:r>
+        <w:rPr>
+          <w:rFonts w:ascii="Times New Roman" w:hAnsi="Times New Roman" w:cs="Times New Roman"/>
+          <w:i/>
+          <w:iCs/>
+          <w:sz w:val="18"/>
+          <w:szCs w:val="18"/>
+          <w:lang w:val="en-US"/>
+        </w:rPr>
+        <w:t>school.address</w:t>
+      </w:r>
+      <w:proofErr w:type="spellEnd"/>
+      <w:r>
+        <w:rPr>
+          <w:rFonts w:ascii="Times New Roman" w:hAnsi="Times New Roman" w:cs="Times New Roman"/>
+          <w:i/>
+          <w:iCs/>
+          <w:sz w:val="18"/>
+          <w:szCs w:val="18"/>
+          <w:lang w:val="en-US"/>
+        </w:rPr>
+        <w:t>+++, +++</w:t>
+      </w:r>
+      <w:proofErr w:type="spellStart"/>
+      <w:r>
+        <w:rPr>
+          <w:rFonts w:ascii="Times New Roman" w:hAnsi="Times New Roman" w:cs="Times New Roman"/>
+          <w:i/>
+          <w:iCs/>
+          <w:sz w:val="18"/>
+          <w:szCs w:val="18"/>
+          <w:lang w:val="en-US"/>
+        </w:rPr>
+        <w:t>school.town</w:t>
+      </w:r>
+      <w:proofErr w:type="spellEnd"/>
+      <w:r>
+        <w:rPr>
+          <w:rFonts w:ascii="Times New Roman" w:hAnsi="Times New Roman" w:cs="Times New Roman"/>
+          <w:i/>
+          <w:iCs/>
+          <w:sz w:val="18"/>
+          <w:szCs w:val="18"/>
+          <w:lang w:val="en-US"/>
+        </w:rPr>
+        <w:t>+++</w:t>
       </w:r>
     </w:p>
     <w:p>
       <w:pPr>
-        <w:pStyle w:val="Normal"/>
-        <w:spacing w:before="0" w:after="0"/>
-        <w:jc w:val="left"/>
+        <w:spacing w:after="0"/>
         <w:rPr>
           <w:rFonts w:ascii="Times New Roman" w:hAnsi="Times New Roman" w:cs="Times New Roman"/>
           <w:sz w:val="20"/>
@@ -255,18 +342,9 @@
           <w:lang w:val="en-US"/>
         </w:rPr>
       </w:pPr>
-      <w:r>
-        <w:rPr>
-          <w:rFonts w:cs="Times New Roman" w:ascii="Times New Roman" w:hAnsi="Times New Roman"/>
-          <w:sz w:val="20"/>
-          <w:szCs w:val="20"/>
-          <w:lang w:val="en-US"/>
-        </w:rPr>
-      </w:r>
     </w:p>
     <w:p>
       <w:pPr>
-        <w:pStyle w:val="Normal"/>
         <w:pBdr>
           <w:bottom w:val="single" w:sz="4" w:space="1" w:color="000000"/>
         </w:pBdr>
@@ -278,7 +356,7 @@
       </w:pPr>
       <w:r>
         <w:rPr>
-          <w:rFonts w:cs="Times New Roman" w:ascii="Times New Roman" w:hAnsi="Times New Roman"/>
+          <w:rFonts w:ascii="Times New Roman" w:hAnsi="Times New Roman" w:cs="Times New Roman"/>
           <w:sz w:val="20"/>
           <w:szCs w:val="20"/>
         </w:rPr>
@@ -286,16 +364,15 @@
       </w:r>
       <w:r>
         <w:rPr>
-          <w:rFonts w:cs="Times New Roman" w:ascii="Times New Roman" w:hAnsi="Times New Roman"/>
+          <w:rFonts w:ascii="Times New Roman" w:hAnsi="Times New Roman" w:cs="Times New Roman"/>
           <w:sz w:val="20"/>
           <w:szCs w:val="20"/>
-          <w:lang w:val="en-US"/>
         </w:rPr>
         <w:t xml:space="preserve">| </w:t>
       </w:r>
       <w:r>
         <w:rPr>
-          <w:rFonts w:cs="Times New Roman" w:ascii="Times New Roman" w:hAnsi="Times New Roman"/>
+          <w:rFonts w:ascii="Times New Roman" w:hAnsi="Times New Roman" w:cs="Times New Roman"/>
           <w:sz w:val="20"/>
           <w:szCs w:val="20"/>
         </w:rPr>
@@ -303,17 +380,16 @@
       </w:r>
       <w:r>
         <w:rPr>
-          <w:rFonts w:cs="Times New Roman" w:ascii="Times New Roman" w:hAnsi="Times New Roman"/>
+          <w:rFonts w:ascii="Times New Roman" w:hAnsi="Times New Roman" w:cs="Times New Roman"/>
           <w:b/>
           <w:sz w:val="20"/>
           <w:szCs w:val="20"/>
-          <w:lang w:val="en-US"/>
         </w:rPr>
         <w:t>+++$assign.name+++</w:t>
       </w:r>
       <w:r>
         <w:rPr>
-          <w:rFonts w:cs="Times New Roman" w:ascii="Times New Roman" w:hAnsi="Times New Roman"/>
+          <w:rFonts w:ascii="Times New Roman" w:hAnsi="Times New Roman" w:cs="Times New Roman"/>
           <w:sz w:val="20"/>
           <w:szCs w:val="20"/>
         </w:rPr>
@@ -321,19 +397,16 @@
       </w:r>
       <w:r>
         <w:rPr>
-          <w:rFonts w:cs="Times New Roman" w:ascii="Times New Roman" w:hAnsi="Times New Roman"/>
+          <w:rFonts w:ascii="Times New Roman" w:hAnsi="Times New Roman" w:cs="Times New Roman"/>
           <w:sz w:val="20"/>
           <w:szCs w:val="20"/>
-          <w:lang w:val="en-US"/>
         </w:rPr>
         <w:t>| +++toUpperCase(school.studyYear.yearName)+++</w:t>
       </w:r>
     </w:p>
     <w:p>
       <w:pPr>
-        <w:pStyle w:val="Normal"/>
-        <w:spacing w:before="0" w:after="0"/>
-        <w:jc w:val="left"/>
+        <w:spacing w:after="0"/>
         <w:rPr>
           <w:rFonts w:ascii="Times New Roman" w:hAnsi="Times New Roman"/>
           <w:sz w:val="14"/>
@@ -345,8 +418,6 @@
           <w:rFonts w:ascii="Times New Roman" w:hAnsi="Times New Roman"/>
           <w:b/>
           <w:bCs/>
-          <w:i w:val="false"/>
-          <w:iCs w:val="false"/>
           <w:sz w:val="14"/>
           <w:szCs w:val="14"/>
         </w:rPr>
@@ -355,13 +426,11 @@
     </w:p>
     <w:p>
       <w:pPr>
-        <w:pStyle w:val="Normal"/>
         <w:numPr>
           <w:ilvl w:val="0"/>
           <w:numId w:val="2"/>
         </w:numPr>
-        <w:spacing w:before="0" w:after="0"/>
-        <w:jc w:val="left"/>
+        <w:spacing w:after="0"/>
         <w:rPr>
           <w:rFonts w:ascii="Times New Roman" w:hAnsi="Times New Roman"/>
           <w:sz w:val="14"/>
@@ -401,13 +470,11 @@
     </w:p>
     <w:p>
       <w:pPr>
-        <w:pStyle w:val="Normal"/>
         <w:numPr>
           <w:ilvl w:val="0"/>
           <w:numId w:val="2"/>
         </w:numPr>
-        <w:spacing w:before="0" w:after="0"/>
-        <w:jc w:val="left"/>
+        <w:spacing w:after="0"/>
         <w:rPr>
           <w:rFonts w:ascii="Times New Roman" w:hAnsi="Times New Roman"/>
           <w:sz w:val="14"/>
@@ -449,13 +516,11 @@
     </w:p>
     <w:p>
       <w:pPr>
-        <w:pStyle w:val="Normal"/>
         <w:numPr>
           <w:ilvl w:val="0"/>
           <w:numId w:val="2"/>
         </w:numPr>
-        <w:spacing w:before="0" w:after="0"/>
-        <w:jc w:val="left"/>
+        <w:spacing w:after="0"/>
         <w:rPr>
           <w:rFonts w:ascii="Times New Roman" w:hAnsi="Times New Roman"/>
           <w:sz w:val="14"/>
@@ -470,7 +535,7 @@
           <w:sz w:val="14"/>
           <w:szCs w:val="14"/>
         </w:rPr>
-        <w:t xml:space="preserve">    </w:t>
+        <w:t xml:space="preserve">    La croix </w:t>
       </w:r>
       <w:r>
         <w:rPr>
@@ -480,28 +545,20 @@
           <w:sz w:val="14"/>
           <w:szCs w:val="14"/>
         </w:rPr>
-        <w:t>La croix atteste de la présence de l'élève et de la remise effective de sa copie.</w:t>
+        <w:t>atteste de la présence de l'élève et de la remise effective de sa copie.</w:t>
       </w:r>
     </w:p>
     <w:p>
       <w:pPr>
-        <w:pStyle w:val="Normal"/>
-        <w:spacing w:before="0" w:after="0"/>
-        <w:jc w:val="left"/>
+        <w:spacing w:after="0"/>
         <w:rPr>
           <w:rFonts w:ascii="Times New Roman" w:hAnsi="Times New Roman"/>
         </w:rPr>
       </w:pPr>
-      <w:r>
-        <w:rPr>
-          <w:rFonts w:ascii="Times New Roman" w:hAnsi="Times New Roman"/>
-        </w:rPr>
-      </w:r>
     </w:p>
     <w:tbl>
       <w:tblPr>
         <w:tblW w:w="5000" w:type="pct"/>
-        <w:jc w:val="left"/>
         <w:tblInd w:w="55" w:type="dxa"/>
         <w:tblLayout w:type="fixed"/>
         <w:tblCellMar>
@@ -510,50 +567,42 @@
           <w:bottom w:w="55" w:type="dxa"/>
           <w:right w:w="55" w:type="dxa"/>
         </w:tblCellMar>
+        <w:tblLook w:val="04A0" w:firstRow="1" w:lastRow="0" w:firstColumn="1" w:lastColumn="0" w:noHBand="0" w:noVBand="1"/>
       </w:tblPr>
       <w:tblGrid>
-        <w:gridCol w:w="454"/>
-        <w:gridCol w:w="3400"/>
-        <w:gridCol w:w="2423"/>
-        <w:gridCol w:w="454"/>
-        <w:gridCol w:w="3735"/>
+        <w:gridCol w:w="459"/>
+        <w:gridCol w:w="3436"/>
+        <w:gridCol w:w="2448"/>
+        <w:gridCol w:w="459"/>
+        <w:gridCol w:w="3774"/>
       </w:tblGrid>
       <w:tr>
         <w:trPr>
-          <w:trHeight w:val="1304" w:hRule="atLeast"/>
+          <w:trHeight w:val="1304"/>
         </w:trPr>
         <w:tc>
           <w:tcPr>
             <w:tcW w:w="454" w:type="dxa"/>
-            <w:tcBorders/>
           </w:tcPr>
           <w:p>
             <w:pPr>
               <w:pStyle w:val="Contenudetableau"/>
-              <w:spacing w:before="0" w:after="160"/>
               <w:rPr>
                 <w:rFonts w:ascii="Times New Roman" w:hAnsi="Times New Roman"/>
               </w:rPr>
             </w:pPr>
-            <w:r>
-              <w:rPr>
-                <w:rFonts w:ascii="Times New Roman" w:hAnsi="Times New Roman"/>
-              </w:rPr>
-            </w:r>
           </w:p>
         </w:tc>
         <w:tc>
           <w:tcPr>
             <w:tcW w:w="3400" w:type="dxa"/>
-            <w:tcBorders/>
             <w:textDirection w:val="btLr"/>
             <w:vAlign w:val="bottom"/>
           </w:tcPr>
           <w:p>
             <w:pPr>
               <w:pStyle w:val="Contenudetableau"/>
-              <w:spacing w:before="0" w:after="160"/>
-              <w:jc w:val="right"/>
+              <w:jc w:val="center"/>
               <w:rPr>
                 <w:rFonts w:ascii="Times New Roman" w:hAnsi="Times New Roman"/>
                 <w:sz w:val="18"/>
@@ -581,10 +630,7 @@
           </w:tcPr>
           <w:p>
             <w:pPr>
-              <w:pStyle w:val="Normal"/>
-              <w:widowControl/>
-              <w:suppressAutoHyphens w:val="true"/>
-              <w:spacing w:lineRule="auto" w:line="240" w:before="0" w:after="0"/>
+              <w:spacing w:after="0" w:line="240" w:lineRule="auto"/>
               <w:jc w:val="center"/>
               <w:rPr>
                 <w:rFonts w:ascii="Times New Roman" w:hAnsi="Times New Roman"/>
@@ -592,13 +638,47 @@
             </w:pPr>
             <w:r>
               <w:rPr>
-                <w:rFonts w:eastAsia="Calibri" w:cs="Times New Roman" w:ascii="Times New Roman" w:hAnsi="Times New Roman"/>
-                <w:kern w:val="0"/>
+                <w:rFonts w:ascii="Times New Roman" w:eastAsia="Calibri" w:hAnsi="Times New Roman" w:cs="Times New Roman"/>
                 <w:sz w:val="18"/>
                 <w:szCs w:val="18"/>
-                <w:lang w:val="fr-FR" w:eastAsia="en-US" w:bidi="ar-SA"/>
-              </w:rPr>
-              <w:t>+++ FOR day in days+++</w:t>
+              </w:rPr>
+              <w:t xml:space="preserve">+++ FOR </w:t>
+            </w:r>
+            <w:proofErr w:type="spellStart"/>
+            <w:r>
+              <w:rPr>
+                <w:rFonts w:ascii="Times New Roman" w:eastAsia="Calibri" w:hAnsi="Times New Roman" w:cs="Times New Roman"/>
+                <w:sz w:val="18"/>
+                <w:szCs w:val="18"/>
+              </w:rPr>
+              <w:t>day</w:t>
+            </w:r>
+            <w:proofErr w:type="spellEnd"/>
+            <w:r>
+              <w:rPr>
+                <w:rFonts w:ascii="Times New Roman" w:eastAsia="Calibri" w:hAnsi="Times New Roman" w:cs="Times New Roman"/>
+                <w:sz w:val="18"/>
+                <w:szCs w:val="18"/>
+              </w:rPr>
+              <w:t xml:space="preserve"> in </w:t>
+            </w:r>
+            <w:proofErr w:type="spellStart"/>
+            <w:r>
+              <w:rPr>
+                <w:rFonts w:ascii="Times New Roman" w:eastAsia="Calibri" w:hAnsi="Times New Roman" w:cs="Times New Roman"/>
+                <w:sz w:val="18"/>
+                <w:szCs w:val="18"/>
+              </w:rPr>
+              <w:t>days</w:t>
+            </w:r>
+            <w:proofErr w:type="spellEnd"/>
+            <w:r>
+              <w:rPr>
+                <w:rFonts w:ascii="Times New Roman" w:eastAsia="Calibri" w:hAnsi="Times New Roman" w:cs="Times New Roman"/>
+                <w:sz w:val="18"/>
+                <w:szCs w:val="18"/>
+              </w:rPr>
+              <w:t>+++</w:t>
             </w:r>
           </w:p>
         </w:tc>
@@ -611,37 +691,33 @@
               <w:bottom w:val="single" w:sz="4" w:space="0" w:color="000000"/>
             </w:tcBorders>
             <w:textDirection w:val="btLr"/>
+            <w:vAlign w:val="center"/>
           </w:tcPr>
           <w:p>
             <w:pPr>
-              <w:pStyle w:val="Normal"/>
-              <w:widowControl/>
-              <w:suppressAutoHyphens w:val="true"/>
-              <w:spacing w:lineRule="auto" w:line="240" w:before="0" w:after="0"/>
+              <w:spacing w:after="0" w:line="240" w:lineRule="auto"/>
               <w:jc w:val="center"/>
               <w:rPr>
                 <w:rFonts w:ascii="Times New Roman" w:hAnsi="Times New Roman"/>
               </w:rPr>
             </w:pPr>
-            <w:r>
-              <w:rPr>
-                <w:rFonts w:eastAsia="Calibri" w:cs="Times New Roman" w:ascii="Times New Roman" w:hAnsi="Times New Roman"/>
-                <w:kern w:val="0"/>
+            <w:proofErr w:type="gramStart"/>
+            <w:r>
+              <w:rPr>
+                <w:rFonts w:ascii="Times New Roman" w:eastAsia="Calibri" w:hAnsi="Times New Roman" w:cs="Times New Roman"/>
                 <w:sz w:val="18"/>
                 <w:szCs w:val="18"/>
-                <w:lang w:val="fr-FR" w:eastAsia="en-US" w:bidi="ar-SA"/>
-              </w:rPr>
-              <w:t>…</w:t>
-            </w:r>
-            <w:r>
-              <w:rPr>
-                <w:rFonts w:eastAsia="Calibri" w:cs="Times New Roman" w:ascii="Times New Roman" w:hAnsi="Times New Roman"/>
-                <w:kern w:val="0"/>
+              </w:rPr>
+              <w:t>…./</w:t>
+            </w:r>
+            <w:proofErr w:type="gramEnd"/>
+            <w:r>
+              <w:rPr>
+                <w:rFonts w:ascii="Times New Roman" w:eastAsia="Calibri" w:hAnsi="Times New Roman" w:cs="Times New Roman"/>
                 <w:sz w:val="18"/>
                 <w:szCs w:val="18"/>
-                <w:lang w:val="fr-FR" w:eastAsia="en-US" w:bidi="ar-SA"/>
-              </w:rPr>
-              <w:t>./…../ 202...</w:t>
+              </w:rPr>
+              <w:t>…../ 202...</w:t>
             </w:r>
           </w:p>
         </w:tc>
@@ -657,10 +733,7 @@
           </w:tcPr>
           <w:p>
             <w:pPr>
-              <w:pStyle w:val="Normal"/>
-              <w:widowControl/>
-              <w:suppressAutoHyphens w:val="true"/>
-              <w:spacing w:lineRule="auto" w:line="240" w:before="0" w:after="0"/>
+              <w:spacing w:after="0" w:line="240" w:lineRule="auto"/>
               <w:jc w:val="center"/>
               <w:rPr>
                 <w:rFonts w:ascii="Times New Roman" w:hAnsi="Times New Roman"/>
@@ -670,19 +743,34 @@
             </w:pPr>
             <w:r>
               <w:rPr>
-                <w:rFonts w:eastAsia="Calibri" w:cs="Times New Roman" w:ascii="Times New Roman" w:hAnsi="Times New Roman"/>
-                <w:kern w:val="0"/>
-                <w:sz w:val="16"/>
-                <w:szCs w:val="16"/>
-                <w:lang w:val="fr-FR" w:eastAsia="en-US" w:bidi="ar-SA"/>
-              </w:rPr>
-              <w:t>+++END-FOR day+++</w:t>
+                <w:rFonts w:ascii="Times New Roman" w:eastAsia="Calibri" w:hAnsi="Times New Roman" w:cs="Times New Roman"/>
+                <w:sz w:val="16"/>
+                <w:szCs w:val="16"/>
+              </w:rPr>
+              <w:t xml:space="preserve">+++END-FOR </w:t>
+            </w:r>
+            <w:proofErr w:type="spellStart"/>
+            <w:r>
+              <w:rPr>
+                <w:rFonts w:ascii="Times New Roman" w:eastAsia="Calibri" w:hAnsi="Times New Roman" w:cs="Times New Roman"/>
+                <w:sz w:val="16"/>
+                <w:szCs w:val="16"/>
+              </w:rPr>
+              <w:t>day</w:t>
+            </w:r>
+            <w:proofErr w:type="spellEnd"/>
+            <w:r>
+              <w:rPr>
+                <w:rFonts w:ascii="Times New Roman" w:eastAsia="Calibri" w:hAnsi="Times New Roman" w:cs="Times New Roman"/>
+                <w:sz w:val="16"/>
+                <w:szCs w:val="16"/>
+              </w:rPr>
+              <w:t>+++</w:t>
             </w:r>
           </w:p>
         </w:tc>
       </w:tr>
       <w:tr>
-        <w:trPr/>
         <w:tc>
           <w:tcPr>
             <w:tcW w:w="454" w:type="dxa"/>
@@ -695,10 +783,7 @@
           </w:tcPr>
           <w:p>
             <w:pPr>
-              <w:pStyle w:val="Normal"/>
-              <w:widowControl/>
-              <w:suppressAutoHyphens w:val="true"/>
-              <w:spacing w:lineRule="auto" w:line="240" w:before="0" w:after="0"/>
+              <w:spacing w:after="0" w:line="240" w:lineRule="auto"/>
               <w:jc w:val="center"/>
               <w:rPr>
                 <w:rFonts w:ascii="Times New Roman" w:hAnsi="Times New Roman"/>
@@ -706,7 +791,7 @@
             </w:pPr>
             <w:r>
               <w:rPr>
-                <w:rFonts w:cs="Times New Roman" w:ascii="Times New Roman" w:hAnsi="Times New Roman"/>
+                <w:rFonts w:ascii="Times New Roman" w:hAnsi="Times New Roman" w:cs="Times New Roman"/>
                 <w:sz w:val="18"/>
                 <w:szCs w:val="18"/>
               </w:rPr>
@@ -714,12 +799,9 @@
             </w:r>
             <w:r>
               <w:rPr>
-                <w:rFonts w:eastAsia="DejaVu Sans" w:cs="DejaVu Sans" w:ascii="Times New Roman" w:hAnsi="Times New Roman"/>
-                <w:position w:val="0"/>
-                <w:sz w:val="18"/>
+                <w:rFonts w:ascii="Times New Roman" w:eastAsia="DejaVu Sans" w:hAnsi="Times New Roman" w:cs="DejaVu Sans"/>
                 <w:sz w:val="18"/>
                 <w:szCs w:val="18"/>
-                <w:vertAlign w:val="baseline"/>
               </w:rPr>
               <w:t>∘</w:t>
             </w:r>
@@ -737,24 +819,18 @@
           </w:tcPr>
           <w:p>
             <w:pPr>
-              <w:pStyle w:val="Normal"/>
-              <w:widowControl/>
-              <w:suppressAutoHyphens w:val="true"/>
-              <w:bidi w:val="0"/>
-              <w:spacing w:lineRule="auto" w:line="240" w:before="0" w:after="0"/>
-              <w:ind w:hanging="0" w:left="113" w:right="0"/>
-              <w:jc w:val="left"/>
+              <w:spacing w:after="0" w:line="240" w:lineRule="auto"/>
+              <w:ind w:left="113"/>
+              <w:jc w:val="center"/>
               <w:rPr>
                 <w:rFonts w:ascii="Times New Roman" w:hAnsi="Times New Roman"/>
               </w:rPr>
             </w:pPr>
             <w:r>
               <w:rPr>
-                <w:rFonts w:eastAsia="Calibri" w:cs="Times New Roman" w:ascii="Times New Roman" w:hAnsi="Times New Roman"/>
-                <w:kern w:val="0"/>
+                <w:rFonts w:ascii="Times New Roman" w:eastAsia="Calibri" w:hAnsi="Times New Roman" w:cs="Times New Roman"/>
                 <w:sz w:val="18"/>
                 <w:szCs w:val="18"/>
-                <w:lang w:val="fr-FR" w:eastAsia="en-US" w:bidi="ar-SA"/>
               </w:rPr>
               <w:t>NOM, POST NOM ET PRÉNOM</w:t>
             </w:r>
@@ -767,13 +843,11 @@
               <w:left w:val="single" w:sz="4" w:space="0" w:color="000000"/>
               <w:bottom w:val="single" w:sz="4" w:space="0" w:color="000000"/>
             </w:tcBorders>
+            <w:vAlign w:val="center"/>
           </w:tcPr>
           <w:p>
             <w:pPr>
-              <w:pStyle w:val="Normal"/>
-              <w:widowControl/>
-              <w:suppressAutoHyphens w:val="true"/>
-              <w:spacing w:lineRule="auto" w:line="240" w:before="0" w:after="0"/>
+              <w:spacing w:after="0" w:line="240" w:lineRule="auto"/>
               <w:jc w:val="center"/>
               <w:rPr>
                 <w:rFonts w:ascii="Times New Roman" w:hAnsi="Times New Roman"/>
@@ -783,87 +857,50 @@
             </w:pPr>
             <w:r>
               <w:rPr>
-                <w:rFonts w:eastAsia="Calibri" w:cs="Times New Roman" w:ascii="Times New Roman" w:hAnsi="Times New Roman"/>
-                <w:kern w:val="0"/>
-                <w:sz w:val="16"/>
-                <w:szCs w:val="16"/>
-                <w:lang w:val="fr-FR" w:eastAsia="en-US" w:bidi="ar-SA"/>
-              </w:rPr>
-              <w:t>+++ FOR day in days+++</w:t>
+                <w:rFonts w:ascii="Times New Roman" w:eastAsia="Calibri" w:hAnsi="Times New Roman" w:cs="Times New Roman"/>
+                <w:sz w:val="16"/>
+                <w:szCs w:val="16"/>
+              </w:rPr>
+              <w:t xml:space="preserve">+++ FOR </w:t>
+            </w:r>
+            <w:proofErr w:type="spellStart"/>
+            <w:r>
+              <w:rPr>
+                <w:rFonts w:ascii="Times New Roman" w:eastAsia="Calibri" w:hAnsi="Times New Roman" w:cs="Times New Roman"/>
+                <w:sz w:val="16"/>
+                <w:szCs w:val="16"/>
+              </w:rPr>
+              <w:t>day</w:t>
+            </w:r>
+            <w:proofErr w:type="spellEnd"/>
+            <w:r>
+              <w:rPr>
+                <w:rFonts w:ascii="Times New Roman" w:eastAsia="Calibri" w:hAnsi="Times New Roman" w:cs="Times New Roman"/>
+                <w:sz w:val="16"/>
+                <w:szCs w:val="16"/>
+              </w:rPr>
+              <w:t xml:space="preserve"> in </w:t>
+            </w:r>
+            <w:proofErr w:type="spellStart"/>
+            <w:r>
+              <w:rPr>
+                <w:rFonts w:ascii="Times New Roman" w:eastAsia="Calibri" w:hAnsi="Times New Roman" w:cs="Times New Roman"/>
+                <w:sz w:val="16"/>
+                <w:szCs w:val="16"/>
+              </w:rPr>
+              <w:t>days</w:t>
+            </w:r>
+            <w:proofErr w:type="spellEnd"/>
+            <w:r>
+              <w:rPr>
+                <w:rFonts w:ascii="Times New Roman" w:eastAsia="Calibri" w:hAnsi="Times New Roman" w:cs="Times New Roman"/>
+                <w:sz w:val="16"/>
+                <w:szCs w:val="16"/>
+              </w:rPr>
+              <w:t>+++</w:t>
             </w:r>
           </w:p>
         </w:tc>
-        <w:tc>
-          <w:tcPr>
-            <w:tcW w:w="454" w:type="dxa"/>
-            <w:tcBorders>
-              <w:left w:val="single" w:sz="4" w:space="0" w:color="000000"/>
-              <w:bottom w:val="single" w:sz="4" w:space="0" w:color="000000"/>
-            </w:tcBorders>
-          </w:tcPr>
-          <w:p>
-            <w:pPr>
-              <w:pStyle w:val="Normal"/>
-              <w:widowControl/>
-              <w:suppressAutoHyphens w:val="true"/>
-              <w:spacing w:lineRule="auto" w:line="240" w:before="0" w:after="0"/>
-              <w:jc w:val="center"/>
-              <w:rPr>
-                <w:rFonts w:ascii="Times New Roman" w:hAnsi="Times New Roman" w:eastAsia="Calibri" w:cs="Times New Roman"/>
-                <w:kern w:val="0"/>
-                <w:sz w:val="16"/>
-                <w:szCs w:val="16"/>
-                <w:lang w:val="fr-FR" w:eastAsia="en-US" w:bidi="ar-SA"/>
-              </w:rPr>
-            </w:pPr>
-            <w:r>
-              <w:rPr>
-                <w:rFonts w:eastAsia="Calibri" w:cs="Times New Roman" w:ascii="Times New Roman" w:hAnsi="Times New Roman"/>
-                <w:kern w:val="0"/>
-                <w:sz w:val="16"/>
-                <w:szCs w:val="16"/>
-                <w:lang w:val="fr-FR" w:eastAsia="en-US" w:bidi="ar-SA"/>
-              </w:rPr>
-            </w:r>
-          </w:p>
-        </w:tc>
-        <w:tc>
-          <w:tcPr>
-            <w:tcW w:w="3735" w:type="dxa"/>
-            <w:tcBorders>
-              <w:left w:val="single" w:sz="4" w:space="0" w:color="000000"/>
-              <w:bottom w:val="single" w:sz="4" w:space="0" w:color="000000"/>
-              <w:right w:val="single" w:sz="4" w:space="0" w:color="000000"/>
-            </w:tcBorders>
-          </w:tcPr>
-          <w:p>
-            <w:pPr>
-              <w:pStyle w:val="Normal"/>
-              <w:widowControl/>
-              <w:suppressAutoHyphens w:val="true"/>
-              <w:spacing w:lineRule="auto" w:line="240" w:before="0" w:after="0"/>
-              <w:jc w:val="center"/>
-              <w:rPr>
-                <w:rFonts w:ascii="Times New Roman" w:hAnsi="Times New Roman"/>
-                <w:sz w:val="16"/>
-                <w:szCs w:val="16"/>
-              </w:rPr>
-            </w:pPr>
-            <w:r>
-              <w:rPr>
-                <w:rFonts w:eastAsia="Calibri" w:cs="Times New Roman" w:ascii="Times New Roman" w:hAnsi="Times New Roman"/>
-                <w:kern w:val="0"/>
-                <w:sz w:val="16"/>
-                <w:szCs w:val="16"/>
-                <w:lang w:val="fr-FR" w:eastAsia="en-US" w:bidi="ar-SA"/>
-              </w:rPr>
-              <w:t>+++END-FOR day+++</w:t>
-            </w:r>
-          </w:p>
-        </w:tc>
-      </w:tr>
-      <w:tr>
-        <w:trPr/>
         <w:tc>
           <w:tcPr>
             <w:tcW w:w="454" w:type="dxa"/>
@@ -875,10 +912,78 @@
           </w:tcPr>
           <w:p>
             <w:pPr>
-              <w:pStyle w:val="Normal"/>
-              <w:widowControl/>
-              <w:suppressAutoHyphens w:val="true"/>
-              <w:spacing w:lineRule="auto" w:line="240" w:before="0" w:after="0"/>
+              <w:spacing w:after="0" w:line="240" w:lineRule="auto"/>
+              <w:jc w:val="center"/>
+              <w:rPr>
+                <w:rFonts w:ascii="Times New Roman" w:eastAsia="Calibri" w:hAnsi="Times New Roman" w:cs="Times New Roman"/>
+                <w:sz w:val="16"/>
+                <w:szCs w:val="16"/>
+              </w:rPr>
+            </w:pPr>
+          </w:p>
+        </w:tc>
+        <w:tc>
+          <w:tcPr>
+            <w:tcW w:w="3735" w:type="dxa"/>
+            <w:tcBorders>
+              <w:left w:val="single" w:sz="4" w:space="0" w:color="000000"/>
+              <w:bottom w:val="single" w:sz="4" w:space="0" w:color="000000"/>
+              <w:right w:val="single" w:sz="4" w:space="0" w:color="000000"/>
+            </w:tcBorders>
+            <w:vAlign w:val="center"/>
+          </w:tcPr>
+          <w:p>
+            <w:pPr>
+              <w:spacing w:after="0" w:line="240" w:lineRule="auto"/>
+              <w:jc w:val="center"/>
+              <w:rPr>
+                <w:rFonts w:ascii="Times New Roman" w:hAnsi="Times New Roman"/>
+                <w:sz w:val="16"/>
+                <w:szCs w:val="16"/>
+              </w:rPr>
+            </w:pPr>
+            <w:r>
+              <w:rPr>
+                <w:rFonts w:ascii="Times New Roman" w:eastAsia="Calibri" w:hAnsi="Times New Roman" w:cs="Times New Roman"/>
+                <w:sz w:val="16"/>
+                <w:szCs w:val="16"/>
+              </w:rPr>
+              <w:t xml:space="preserve">+++END-FOR </w:t>
+            </w:r>
+            <w:proofErr w:type="spellStart"/>
+            <w:r>
+              <w:rPr>
+                <w:rFonts w:ascii="Times New Roman" w:eastAsia="Calibri" w:hAnsi="Times New Roman" w:cs="Times New Roman"/>
+                <w:sz w:val="16"/>
+                <w:szCs w:val="16"/>
+              </w:rPr>
+              <w:t>day</w:t>
+            </w:r>
+            <w:proofErr w:type="spellEnd"/>
+            <w:r>
+              <w:rPr>
+                <w:rFonts w:ascii="Times New Roman" w:eastAsia="Calibri" w:hAnsi="Times New Roman" w:cs="Times New Roman"/>
+                <w:sz w:val="16"/>
+                <w:szCs w:val="16"/>
+              </w:rPr>
+              <w:t>+++</w:t>
+            </w:r>
+          </w:p>
+        </w:tc>
+      </w:tr>
+      <w:tr>
+        <w:tc>
+          <w:tcPr>
+            <w:tcW w:w="454" w:type="dxa"/>
+            <w:tcBorders>
+              <w:left w:val="single" w:sz="4" w:space="0" w:color="000000"/>
+              <w:bottom w:val="single" w:sz="4" w:space="0" w:color="000000"/>
+            </w:tcBorders>
+            <w:vAlign w:val="center"/>
+          </w:tcPr>
+          <w:p>
+            <w:pPr>
+              <w:spacing w:after="0" w:line="240" w:lineRule="auto"/>
               <w:jc w:val="center"/>
               <w:rPr>
                 <w:rFonts w:ascii="Times New Roman" w:hAnsi="Times New Roman"/>
@@ -886,13 +991,6 @@
                 <w:szCs w:val="18"/>
               </w:rPr>
             </w:pPr>
-            <w:r>
-              <w:rPr>
-                <w:rFonts w:ascii="Times New Roman" w:hAnsi="Times New Roman"/>
-                <w:sz w:val="18"/>
-                <w:szCs w:val="18"/>
-              </w:rPr>
-            </w:r>
           </w:p>
         </w:tc>
         <w:tc>
@@ -906,24 +1004,60 @@
           </w:tcPr>
           <w:p>
             <w:pPr>
-              <w:pStyle w:val="Normal"/>
-              <w:widowControl/>
-              <w:suppressAutoHyphens w:val="true"/>
-              <w:spacing w:lineRule="auto" w:line="240" w:before="0" w:after="0"/>
-              <w:jc w:val="left"/>
+              <w:spacing w:after="0" w:line="240" w:lineRule="auto"/>
               <w:rPr>
                 <w:rFonts w:ascii="Times New Roman" w:hAnsi="Times New Roman"/>
+                <w:lang w:val="en-US"/>
               </w:rPr>
             </w:pPr>
             <w:r>
               <w:rPr>
-                <w:rFonts w:eastAsia="Calibri" w:cs="Times New Roman" w:ascii="Times New Roman" w:hAnsi="Times New Roman"/>
-                <w:kern w:val="0"/>
+                <w:rFonts w:ascii="Times New Roman" w:eastAsia="Calibri" w:hAnsi="Times New Roman" w:cs="Times New Roman"/>
                 <w:sz w:val="18"/>
                 <w:szCs w:val="18"/>
-                <w:lang w:val="en-US" w:eastAsia="en-US" w:bidi="ar-SA"/>
-              </w:rPr>
-              <w:t>+++ FOR std in $assign.students +++</w:t>
+                <w:lang w:val="en-US"/>
+              </w:rPr>
+              <w:t xml:space="preserve">+++ FOR </w:t>
+            </w:r>
+            <w:proofErr w:type="spellStart"/>
+            <w:r>
+              <w:rPr>
+                <w:rFonts w:ascii="Times New Roman" w:eastAsia="Calibri" w:hAnsi="Times New Roman" w:cs="Times New Roman"/>
+                <w:sz w:val="18"/>
+                <w:szCs w:val="18"/>
+                <w:lang w:val="en-US"/>
+              </w:rPr>
+              <w:t>std</w:t>
+            </w:r>
+            <w:proofErr w:type="spellEnd"/>
+            <w:r>
+              <w:rPr>
+                <w:rFonts w:ascii="Times New Roman" w:eastAsia="Calibri" w:hAnsi="Times New Roman" w:cs="Times New Roman"/>
+                <w:sz w:val="18"/>
+                <w:szCs w:val="18"/>
+                <w:lang w:val="en-US"/>
+              </w:rPr>
+              <w:t xml:space="preserve"> in $</w:t>
+            </w:r>
+            <w:proofErr w:type="spellStart"/>
+            <w:r>
+              <w:rPr>
+                <w:rFonts w:ascii="Times New Roman" w:eastAsia="Calibri" w:hAnsi="Times New Roman" w:cs="Times New Roman"/>
+                <w:sz w:val="18"/>
+                <w:szCs w:val="18"/>
+                <w:lang w:val="en-US"/>
+              </w:rPr>
+              <w:t>assign.students</w:t>
+            </w:r>
+            <w:proofErr w:type="spellEnd"/>
+            <w:r>
+              <w:rPr>
+                <w:rFonts w:ascii="Times New Roman" w:eastAsia="Calibri" w:hAnsi="Times New Roman" w:cs="Times New Roman"/>
+                <w:sz w:val="18"/>
+                <w:szCs w:val="18"/>
+                <w:lang w:val="en-US"/>
+              </w:rPr>
+              <w:t xml:space="preserve"> +++</w:t>
             </w:r>
           </w:p>
         </w:tc>
@@ -939,16 +1073,11 @@
           <w:p>
             <w:pPr>
               <w:pStyle w:val="Contenudetableau"/>
-              <w:spacing w:before="0" w:after="160"/>
               <w:rPr>
                 <w:rFonts w:ascii="Times New Roman" w:hAnsi="Times New Roman"/>
+                <w:lang w:val="en-US"/>
               </w:rPr>
             </w:pPr>
-            <w:r>
-              <w:rPr>
-                <w:rFonts w:ascii="Times New Roman" w:hAnsi="Times New Roman"/>
-              </w:rPr>
-            </w:r>
           </w:p>
         </w:tc>
         <w:tc>
@@ -963,16 +1092,12 @@
           <w:p>
             <w:pPr>
               <w:pStyle w:val="Contenudetableau"/>
-              <w:spacing w:before="0" w:after="160"/>
+              <w:jc w:val="center"/>
               <w:rPr>
                 <w:rFonts w:ascii="Times New Roman" w:hAnsi="Times New Roman"/>
+                <w:lang w:val="en-US"/>
               </w:rPr>
             </w:pPr>
-            <w:r>
-              <w:rPr>
-                <w:rFonts w:ascii="Times New Roman" w:hAnsi="Times New Roman"/>
-              </w:rPr>
-            </w:r>
           </w:p>
         </w:tc>
         <w:tc>
@@ -988,21 +1113,15 @@
           <w:p>
             <w:pPr>
               <w:pStyle w:val="Contenudetableau"/>
-              <w:spacing w:before="0" w:after="160"/>
               <w:rPr>
                 <w:rFonts w:ascii="Times New Roman" w:hAnsi="Times New Roman"/>
+                <w:lang w:val="en-US"/>
               </w:rPr>
             </w:pPr>
-            <w:r>
-              <w:rPr>
-                <w:rFonts w:ascii="Times New Roman" w:hAnsi="Times New Roman"/>
-              </w:rPr>
-            </w:r>
           </w:p>
         </w:tc>
       </w:tr>
       <w:tr>
-        <w:trPr/>
         <w:tc>
           <w:tcPr>
             <w:tcW w:w="454" w:type="dxa"/>
@@ -1014,10 +1133,7 @@
           </w:tcPr>
           <w:p>
             <w:pPr>
-              <w:pStyle w:val="Normal"/>
-              <w:widowControl/>
-              <w:suppressAutoHyphens w:val="true"/>
-              <w:spacing w:lineRule="auto" w:line="240" w:before="0" w:after="0"/>
+              <w:spacing w:after="0" w:line="240" w:lineRule="auto"/>
               <w:jc w:val="center"/>
               <w:rPr>
                 <w:rFonts w:ascii="Times New Roman" w:hAnsi="Times New Roman"/>
@@ -1027,13 +1143,19 @@
             </w:pPr>
             <w:r>
               <w:rPr>
-                <w:rFonts w:eastAsia="Calibri" w:cs="Times New Roman" w:ascii="Times New Roman" w:hAnsi="Times New Roman"/>
-                <w:kern w:val="0"/>
-                <w:sz w:val="16"/>
-                <w:szCs w:val="16"/>
-                <w:lang w:val="fr-FR" w:eastAsia="en-US" w:bidi="ar-SA"/>
-              </w:rPr>
-              <w:t>+++ $idx+1 +++</w:t>
+                <w:rFonts w:ascii="Times New Roman" w:eastAsia="Calibri" w:hAnsi="Times New Roman" w:cs="Times New Roman"/>
+                <w:sz w:val="16"/>
+                <w:szCs w:val="16"/>
+              </w:rPr>
+              <w:t xml:space="preserve">+++ </w:t>
+            </w:r>
+            <w:r>
+              <w:rPr>
+                <w:rFonts w:ascii="Times New Roman" w:eastAsia="Calibri" w:hAnsi="Times New Roman" w:cs="Times New Roman"/>
+                <w:sz w:val="16"/>
+                <w:szCs w:val="16"/>
+              </w:rPr>
+              <w:t>$idx+1 +++</w:t>
             </w:r>
           </w:p>
         </w:tc>
@@ -1048,13 +1170,8 @@
           </w:tcPr>
           <w:p>
             <w:pPr>
-              <w:pStyle w:val="Normal"/>
-              <w:widowControl/>
-              <w:suppressAutoHyphens w:val="true"/>
-              <w:bidi w:val="0"/>
-              <w:spacing w:lineRule="auto" w:line="240" w:before="0" w:after="0"/>
-              <w:ind w:hanging="0" w:left="113" w:right="0"/>
-              <w:jc w:val="left"/>
+              <w:spacing w:after="0" w:line="240" w:lineRule="auto"/>
+              <w:ind w:left="113"/>
               <w:rPr>
                 <w:rFonts w:ascii="Times New Roman" w:hAnsi="Times New Roman"/>
                 <w:sz w:val="16"/>
@@ -1063,33 +1180,50 @@
             </w:pPr>
             <w:r>
               <w:rPr>
-                <w:rFonts w:eastAsia="Calibri" w:cs="Times New Roman" w:ascii="Times New Roman" w:hAnsi="Times New Roman"/>
-                <w:kern w:val="0"/>
-                <w:sz w:val="16"/>
-                <w:szCs w:val="16"/>
-                <w:lang w:val="fr-FR" w:eastAsia="en-US" w:bidi="ar-SA"/>
+                <w:rFonts w:ascii="Times New Roman" w:eastAsia="Calibri" w:hAnsi="Times New Roman" w:cs="Times New Roman"/>
+                <w:sz w:val="16"/>
+                <w:szCs w:val="16"/>
               </w:rPr>
               <w:t>+++$</w:t>
             </w:r>
-            <w:r>
-              <w:rPr>
-                <w:rFonts w:eastAsia="Calibri" w:cs="Times New Roman" w:ascii="Times New Roman" w:hAnsi="Times New Roman"/>
-                <w:kern w:val="0"/>
-                <w:sz w:val="16"/>
-                <w:szCs w:val="16"/>
-                <w:lang w:val="en-US" w:eastAsia="en-US" w:bidi="ar-SA"/>
+            <w:bookmarkStart w:id="0" w:name="_GoBack"/>
+            <w:bookmarkEnd w:id="0"/>
+            <w:proofErr w:type="spellStart"/>
+            <w:r>
+              <w:rPr>
+                <w:rFonts w:ascii="Times New Roman" w:eastAsia="Calibri" w:hAnsi="Times New Roman" w:cs="Times New Roman"/>
+                <w:sz w:val="16"/>
+                <w:szCs w:val="16"/>
+                <w:lang w:val="en-US"/>
               </w:rPr>
               <w:t>std</w:t>
             </w:r>
-            <w:r>
-              <w:rPr>
-                <w:rFonts w:eastAsia="Calibri" w:cs="Times New Roman" w:ascii="Times New Roman" w:hAnsi="Times New Roman"/>
-                <w:kern w:val="0"/>
-                <w:sz w:val="16"/>
-                <w:szCs w:val="16"/>
-                <w:lang w:val="fr-FR" w:eastAsia="en-US" w:bidi="ar-SA"/>
-              </w:rPr>
-              <w:t>.enrollment.student.fullName+++</w:t>
+            <w:proofErr w:type="spellEnd"/>
+            <w:r>
+              <w:rPr>
+                <w:rFonts w:ascii="Times New Roman" w:eastAsia="Calibri" w:hAnsi="Times New Roman" w:cs="Times New Roman"/>
+                <w:sz w:val="16"/>
+                <w:szCs w:val="16"/>
+              </w:rPr>
+              <w:t>.</w:t>
+            </w:r>
+            <w:proofErr w:type="spellStart"/>
+            <w:r>
+              <w:rPr>
+                <w:rFonts w:ascii="Times New Roman" w:eastAsia="Calibri" w:hAnsi="Times New Roman" w:cs="Times New Roman"/>
+                <w:sz w:val="16"/>
+                <w:szCs w:val="16"/>
+              </w:rPr>
+              <w:t>enrollment.student.fullName</w:t>
+            </w:r>
+            <w:proofErr w:type="spellEnd"/>
+            <w:r>
+              <w:rPr>
+                <w:rFonts w:ascii="Times New Roman" w:eastAsia="Calibri" w:hAnsi="Times New Roman" w:cs="Times New Roman"/>
+                <w:sz w:val="16"/>
+                <w:szCs w:val="16"/>
+              </w:rPr>
+              <w:t>+++</w:t>
             </w:r>
           </w:p>
         </w:tc>
@@ -1104,10 +1238,7 @@
           </w:tcPr>
           <w:p>
             <w:pPr>
-              <w:pStyle w:val="Normal"/>
-              <w:widowControl/>
-              <w:suppressAutoHyphens w:val="true"/>
-              <w:spacing w:lineRule="auto" w:line="240" w:before="0" w:after="0"/>
+              <w:spacing w:after="0" w:line="240" w:lineRule="auto"/>
               <w:jc w:val="center"/>
               <w:rPr>
                 <w:rFonts w:ascii="Times New Roman" w:hAnsi="Times New Roman"/>
@@ -1117,13 +1248,47 @@
             </w:pPr>
             <w:r>
               <w:rPr>
-                <w:rFonts w:eastAsia="Calibri" w:cs="Times New Roman" w:ascii="Times New Roman" w:hAnsi="Times New Roman"/>
-                <w:kern w:val="0"/>
-                <w:sz w:val="16"/>
-                <w:szCs w:val="16"/>
-                <w:lang w:val="fr-FR" w:eastAsia="en-US" w:bidi="ar-SA"/>
-              </w:rPr>
-              <w:t>+++ FOR day in days+++</w:t>
+                <w:rFonts w:ascii="Times New Roman" w:eastAsia="Calibri" w:hAnsi="Times New Roman" w:cs="Times New Roman"/>
+                <w:sz w:val="16"/>
+                <w:szCs w:val="16"/>
+              </w:rPr>
+              <w:t xml:space="preserve">+++ FOR </w:t>
+            </w:r>
+            <w:proofErr w:type="spellStart"/>
+            <w:r>
+              <w:rPr>
+                <w:rFonts w:ascii="Times New Roman" w:eastAsia="Calibri" w:hAnsi="Times New Roman" w:cs="Times New Roman"/>
+                <w:sz w:val="16"/>
+                <w:szCs w:val="16"/>
+              </w:rPr>
+              <w:t>day</w:t>
+            </w:r>
+            <w:proofErr w:type="spellEnd"/>
+            <w:r>
+              <w:rPr>
+                <w:rFonts w:ascii="Times New Roman" w:eastAsia="Calibri" w:hAnsi="Times New Roman" w:cs="Times New Roman"/>
+                <w:sz w:val="16"/>
+                <w:szCs w:val="16"/>
+              </w:rPr>
+              <w:t xml:space="preserve"> in </w:t>
+            </w:r>
+            <w:proofErr w:type="spellStart"/>
+            <w:r>
+              <w:rPr>
+                <w:rFonts w:ascii="Times New Roman" w:eastAsia="Calibri" w:hAnsi="Times New Roman" w:cs="Times New Roman"/>
+                <w:sz w:val="16"/>
+                <w:szCs w:val="16"/>
+              </w:rPr>
+              <w:t>days</w:t>
+            </w:r>
+            <w:proofErr w:type="spellEnd"/>
+            <w:r>
+              <w:rPr>
+                <w:rFonts w:ascii="Times New Roman" w:eastAsia="Calibri" w:hAnsi="Times New Roman" w:cs="Times New Roman"/>
+                <w:sz w:val="16"/>
+                <w:szCs w:val="16"/>
+              </w:rPr>
+              <w:t>+++</w:t>
             </w:r>
           </w:p>
         </w:tc>
@@ -1138,28 +1303,14 @@
           </w:tcPr>
           <w:p>
             <w:pPr>
-              <w:pStyle w:val="Normal"/>
-              <w:widowControl/>
-              <w:suppressAutoHyphens w:val="true"/>
-              <w:spacing w:lineRule="auto" w:line="240" w:before="0" w:after="0"/>
+              <w:spacing w:after="0" w:line="240" w:lineRule="auto"/>
               <w:jc w:val="center"/>
               <w:rPr>
-                <w:rFonts w:ascii="Times New Roman" w:hAnsi="Times New Roman" w:eastAsia="Calibri" w:cs="Times New Roman"/>
-                <w:kern w:val="0"/>
-                <w:sz w:val="16"/>
-                <w:szCs w:val="16"/>
-                <w:lang w:val="fr-FR" w:eastAsia="en-US" w:bidi="ar-SA"/>
+                <w:rFonts w:ascii="Times New Roman" w:eastAsia="Calibri" w:hAnsi="Times New Roman" w:cs="Times New Roman"/>
+                <w:sz w:val="16"/>
+                <w:szCs w:val="16"/>
               </w:rPr>
             </w:pPr>
-            <w:r>
-              <w:rPr>
-                <w:rFonts w:eastAsia="Calibri" w:cs="Times New Roman" w:ascii="Times New Roman" w:hAnsi="Times New Roman"/>
-                <w:kern w:val="0"/>
-                <w:sz w:val="16"/>
-                <w:szCs w:val="16"/>
-                <w:lang w:val="fr-FR" w:eastAsia="en-US" w:bidi="ar-SA"/>
-              </w:rPr>
-            </w:r>
           </w:p>
         </w:tc>
         <w:tc>
@@ -1174,10 +1325,7 @@
           </w:tcPr>
           <w:p>
             <w:pPr>
-              <w:pStyle w:val="Normal"/>
-              <w:widowControl/>
-              <w:suppressAutoHyphens w:val="true"/>
-              <w:spacing w:lineRule="auto" w:line="240" w:before="0" w:after="0"/>
+              <w:spacing w:after="0" w:line="240" w:lineRule="auto"/>
               <w:jc w:val="center"/>
               <w:rPr>
                 <w:rFonts w:ascii="Times New Roman" w:hAnsi="Times New Roman"/>
@@ -1187,19 +1335,34 @@
             </w:pPr>
             <w:r>
               <w:rPr>
-                <w:rFonts w:eastAsia="Calibri" w:cs="Times New Roman" w:ascii="Times New Roman" w:hAnsi="Times New Roman"/>
-                <w:kern w:val="0"/>
-                <w:sz w:val="16"/>
-                <w:szCs w:val="16"/>
-                <w:lang w:val="fr-FR" w:eastAsia="en-US" w:bidi="ar-SA"/>
-              </w:rPr>
-              <w:t>+++END-FOR day+++</w:t>
+                <w:rFonts w:ascii="Times New Roman" w:eastAsia="Calibri" w:hAnsi="Times New Roman" w:cs="Times New Roman"/>
+                <w:sz w:val="16"/>
+                <w:szCs w:val="16"/>
+              </w:rPr>
+              <w:t xml:space="preserve">+++END-FOR </w:t>
+            </w:r>
+            <w:proofErr w:type="spellStart"/>
+            <w:r>
+              <w:rPr>
+                <w:rFonts w:ascii="Times New Roman" w:eastAsia="Calibri" w:hAnsi="Times New Roman" w:cs="Times New Roman"/>
+                <w:sz w:val="16"/>
+                <w:szCs w:val="16"/>
+              </w:rPr>
+              <w:t>day</w:t>
+            </w:r>
+            <w:proofErr w:type="spellEnd"/>
+            <w:r>
+              <w:rPr>
+                <w:rFonts w:ascii="Times New Roman" w:eastAsia="Calibri" w:hAnsi="Times New Roman" w:cs="Times New Roman"/>
+                <w:sz w:val="16"/>
+                <w:szCs w:val="16"/>
+              </w:rPr>
+              <w:t>+++</w:t>
             </w:r>
           </w:p>
         </w:tc>
       </w:tr>
       <w:tr>
-        <w:trPr/>
         <w:tc>
           <w:tcPr>
             <w:tcW w:w="454" w:type="dxa"/>
@@ -1211,10 +1374,7 @@
           </w:tcPr>
           <w:p>
             <w:pPr>
-              <w:pStyle w:val="Normal"/>
-              <w:widowControl/>
-              <w:suppressAutoHyphens w:val="true"/>
-              <w:spacing w:lineRule="auto" w:line="240" w:before="0" w:after="0"/>
+              <w:spacing w:after="0" w:line="240" w:lineRule="auto"/>
               <w:jc w:val="center"/>
               <w:rPr>
                 <w:rFonts w:ascii="Times New Roman" w:hAnsi="Times New Roman"/>
@@ -1222,13 +1382,6 @@
                 <w:szCs w:val="18"/>
               </w:rPr>
             </w:pPr>
-            <w:r>
-              <w:rPr>
-                <w:rFonts w:ascii="Times New Roman" w:hAnsi="Times New Roman"/>
-                <w:sz w:val="18"/>
-                <w:szCs w:val="18"/>
-              </w:rPr>
-            </w:r>
           </w:p>
         </w:tc>
         <w:tc>
@@ -1242,24 +1395,36 @@
           </w:tcPr>
           <w:p>
             <w:pPr>
-              <w:pStyle w:val="Normal"/>
-              <w:widowControl/>
-              <w:suppressAutoHyphens w:val="true"/>
-              <w:spacing w:lineRule="auto" w:line="240" w:before="0" w:after="0"/>
-              <w:jc w:val="left"/>
+              <w:spacing w:after="0" w:line="240" w:lineRule="auto"/>
               <w:rPr>
                 <w:rFonts w:ascii="Times New Roman" w:hAnsi="Times New Roman"/>
               </w:rPr>
             </w:pPr>
             <w:r>
               <w:rPr>
-                <w:rFonts w:eastAsia="Calibri" w:cs="Times New Roman" w:ascii="Times New Roman" w:hAnsi="Times New Roman"/>
-                <w:kern w:val="0"/>
+                <w:rFonts w:ascii="Times New Roman" w:eastAsia="Calibri" w:hAnsi="Times New Roman" w:cs="Times New Roman"/>
                 <w:sz w:val="18"/>
                 <w:szCs w:val="18"/>
-                <w:lang w:val="fr-FR" w:eastAsia="en-US" w:bidi="ar-SA"/>
-              </w:rPr>
-              <w:t>+++ END-FOR std+++</w:t>
+              </w:rPr>
+              <w:t xml:space="preserve">+++ END-FOR </w:t>
+            </w:r>
+            <w:proofErr w:type="spellStart"/>
+            <w:r>
+              <w:rPr>
+                <w:rFonts w:ascii="Times New Roman" w:eastAsia="Calibri" w:hAnsi="Times New Roman" w:cs="Times New Roman"/>
+                <w:sz w:val="18"/>
+                <w:szCs w:val="18"/>
+              </w:rPr>
+              <w:t>std</w:t>
+            </w:r>
+            <w:proofErr w:type="spellEnd"/>
+            <w:r>
+              <w:rPr>
+                <w:rFonts w:ascii="Times New Roman" w:eastAsia="Calibri" w:hAnsi="Times New Roman" w:cs="Times New Roman"/>
+                <w:sz w:val="18"/>
+                <w:szCs w:val="18"/>
+              </w:rPr>
+              <w:t>+++</w:t>
             </w:r>
           </w:p>
         </w:tc>
@@ -1275,16 +1440,10 @@
           <w:p>
             <w:pPr>
               <w:pStyle w:val="Contenudetableau"/>
-              <w:spacing w:before="0" w:after="160"/>
               <w:rPr>
                 <w:rFonts w:ascii="Times New Roman" w:hAnsi="Times New Roman"/>
               </w:rPr>
             </w:pPr>
-            <w:r>
-              <w:rPr>
-                <w:rFonts w:ascii="Times New Roman" w:hAnsi="Times New Roman"/>
-              </w:rPr>
-            </w:r>
           </w:p>
         </w:tc>
         <w:tc>
@@ -1299,16 +1458,11 @@
           <w:p>
             <w:pPr>
               <w:pStyle w:val="Contenudetableau"/>
-              <w:spacing w:before="0" w:after="160"/>
+              <w:jc w:val="center"/>
               <w:rPr>
                 <w:rFonts w:ascii="Times New Roman" w:hAnsi="Times New Roman"/>
               </w:rPr>
             </w:pPr>
-            <w:r>
-              <w:rPr>
-                <w:rFonts w:ascii="Times New Roman" w:hAnsi="Times New Roman"/>
-              </w:rPr>
-            </w:r>
           </w:p>
         </w:tc>
         <w:tc>
@@ -1324,24 +1478,16 @@
           <w:p>
             <w:pPr>
               <w:pStyle w:val="Contenudetableau"/>
-              <w:spacing w:before="0" w:after="160"/>
               <w:rPr>
                 <w:rFonts w:ascii="Times New Roman" w:hAnsi="Times New Roman"/>
               </w:rPr>
             </w:pPr>
-            <w:r>
-              <w:rPr>
-                <w:rFonts w:ascii="Times New Roman" w:hAnsi="Times New Roman"/>
-              </w:rPr>
-            </w:r>
           </w:p>
         </w:tc>
       </w:tr>
     </w:tbl>
     <w:p>
       <w:pPr>
-        <w:pStyle w:val="Normal"/>
-        <w:spacing w:before="0" w:after="160"/>
         <w:rPr>
           <w:rFonts w:cs="Times New Roman"/>
           <w:sz w:val="10"/>
@@ -1349,70 +1495,97 @@
         </w:rPr>
       </w:pPr>
       <w:r>
-        <w:rPr>
-          <w:rFonts w:cs="Times New Roman"/>
+        <w:br w:type="page"/>
+      </w:r>
+    </w:p>
+    <w:p>
+      <w:pPr>
+        <w:rPr>
+          <w:rFonts w:ascii="Times New Roman" w:hAnsi="Times New Roman"/>
+        </w:rPr>
+      </w:pPr>
+      <w:r>
+        <w:rPr>
+          <w:rFonts w:ascii="Times New Roman" w:hAnsi="Times New Roman" w:cs="Times New Roman"/>
           <w:sz w:val="10"/>
           <w:szCs w:val="10"/>
         </w:rPr>
-      </w:r>
-      <w:r>
-        <w:br w:type="page"/>
-      </w:r>
-    </w:p>
-    <w:p>
-      <w:pPr>
-        <w:pStyle w:val="Normal"/>
-        <w:spacing w:before="0" w:after="160"/>
-        <w:rPr>
-          <w:rFonts w:ascii="Times New Roman" w:hAnsi="Times New Roman"/>
-        </w:rPr>
-      </w:pPr>
-      <w:r>
-        <w:rPr>
-          <w:rFonts w:cs="Times New Roman" w:ascii="Times New Roman" w:hAnsi="Times New Roman"/>
+        <w:lastRenderedPageBreak/>
+        <w:t xml:space="preserve">+++END-FOR </w:t>
+      </w:r>
+      <w:proofErr w:type="spellStart"/>
+      <w:r>
+        <w:rPr>
+          <w:rFonts w:ascii="Times New Roman" w:hAnsi="Times New Roman" w:cs="Times New Roman"/>
           <w:sz w:val="10"/>
           <w:szCs w:val="10"/>
         </w:rPr>
-        <w:t>+++END-FOR assign+++</w:t>
+        <w:t>assign</w:t>
+      </w:r>
+      <w:proofErr w:type="spellEnd"/>
+      <w:r>
+        <w:rPr>
+          <w:rFonts w:ascii="Times New Roman" w:hAnsi="Times New Roman" w:cs="Times New Roman"/>
+          <w:sz w:val="10"/>
+          <w:szCs w:val="10"/>
+        </w:rPr>
+        <w:t>+++</w:t>
       </w:r>
     </w:p>
     <w:sectPr>
-      <w:footerReference w:type="even" r:id="rId3"/>
-      <w:footerReference w:type="default" r:id="rId4"/>
-      <w:footerReference w:type="first" r:id="rId5"/>
-      <w:type w:val="nextPage"/>
+      <w:footerReference w:type="even" r:id="rId8"/>
+      <w:footerReference w:type="default" r:id="rId9"/>
+      <w:footerReference w:type="first" r:id="rId10"/>
       <w:pgSz w:w="11906" w:h="16838"/>
-      <w:pgMar w:left="720" w:right="720" w:gutter="0" w:header="0" w:top="720" w:footer="720" w:bottom="1367"/>
-      <w:pgNumType w:fmt="decimal"/>
-      <w:formProt w:val="false"/>
-      <w:textDirection w:val="lrTb"/>
-      <w:docGrid w:type="default" w:linePitch="360" w:charSpace="4096"/>
+      <w:pgMar w:top="720" w:right="720" w:bottom="1367" w:left="720" w:header="0" w:footer="720" w:gutter="0"/>
+      <w:cols w:space="720"/>
+      <w:formProt w:val="0"/>
+      <w:docGrid w:linePitch="360" w:charSpace="4096"/>
     </w:sectPr>
   </w:body>
 </w:document>
 </file>
 
+<file path=word/endnotes.xml><?xml version="1.0" encoding="utf-8"?>
+<w:endnotes xmlns:wpc="http://schemas.microsoft.com/office/word/2010/wordprocessingCanvas" xmlns:mc="http://schemas.openxmlformats.org/markup-compatibility/2006" xmlns:o="urn:schemas-microsoft-com:office:office" xmlns:r="http://schemas.openxmlformats.org/officeDocument/2006/relationships" xmlns:m="http://schemas.openxmlformats.org/officeDocument/2006/math" xmlns:v="urn:schemas-microsoft-com:vml" xmlns:wp14="http://schemas.microsoft.com/office/word/2010/wordprocessingDrawing" xmlns:wp="http://schemas.openxmlformats.org/drawingml/2006/wordprocessingDrawing" xmlns:w10="urn:schemas-microsoft-com:office:word" xmlns:w="http://schemas.openxmlformats.org/wordprocessingml/2006/main" xmlns:w14="http://schemas.microsoft.com/office/word/2010/wordml" xmlns:w15="http://schemas.microsoft.com/office/word/2012/wordml" xmlns:wpg="http://schemas.microsoft.com/office/word/2010/wordprocessingGroup" xmlns:wpi="http://schemas.microsoft.com/office/word/2010/wordprocessingInk" xmlns:wne="http://schemas.microsoft.com/office/word/2006/wordml" xmlns:wps="http://schemas.microsoft.com/office/word/2010/wordprocessingShape" mc:Ignorable="w14 w15 wp14">
+  <w:endnote w:type="separator" w:id="-1">
+    <w:p>
+      <w:pPr>
+        <w:spacing w:after="0" w:line="240" w:lineRule="auto"/>
+      </w:pPr>
+      <w:r>
+        <w:separator/>
+      </w:r>
+    </w:p>
+  </w:endnote>
+  <w:endnote w:type="continuationSeparator" w:id="0">
+    <w:p>
+      <w:pPr>
+        <w:spacing w:after="0" w:line="240" w:lineRule="auto"/>
+      </w:pPr>
+      <w:r>
+        <w:continuationSeparator/>
+      </w:r>
+    </w:p>
+  </w:endnote>
+</w:endnotes>
+</file>
+
 <file path=word/footer1.xml><?xml version="1.0" encoding="utf-8"?>
-<w:ftr xmlns:o="urn:schemas-microsoft-com:office:office" xmlns:r="http://schemas.openxmlformats.org/officeDocument/2006/relationships" xmlns:v="urn:schemas-microsoft-com:vml" xmlns:w="http://schemas.openxmlformats.org/wordprocessingml/2006/main" xmlns:w10="urn:schemas-microsoft-com:office:word" xmlns:wp="http://schemas.openxmlformats.org/drawingml/2006/wordprocessingDrawing" xmlns:wps="http://schemas.microsoft.com/office/word/2010/wordprocessingShape" xmlns:wpg="http://schemas.microsoft.com/office/word/2010/wordprocessingGroup" xmlns:mc="http://schemas.openxmlformats.org/markup-compatibility/2006" xmlns:wp14="http://schemas.microsoft.com/office/word/2010/wordprocessingDrawing" xmlns:w14="http://schemas.microsoft.com/office/word/2010/wordml" xmlns:w15="http://schemas.microsoft.com/office/word/2012/wordml" mc:Ignorable="w14 wp14 w15">
+<w:ftr xmlns:wpc="http://schemas.microsoft.com/office/word/2010/wordprocessingCanvas" xmlns:mc="http://schemas.openxmlformats.org/markup-compatibility/2006" xmlns:o="urn:schemas-microsoft-com:office:office" xmlns:r="http://schemas.openxmlformats.org/officeDocument/2006/relationships" xmlns:m="http://schemas.openxmlformats.org/officeDocument/2006/math" xmlns:v="urn:schemas-microsoft-com:vml" xmlns:wp14="http://schemas.microsoft.com/office/word/2010/wordprocessingDrawing" xmlns:wp="http://schemas.openxmlformats.org/drawingml/2006/wordprocessingDrawing" xmlns:w10="urn:schemas-microsoft-com:office:word" xmlns:w="http://schemas.openxmlformats.org/wordprocessingml/2006/main" xmlns:w14="http://schemas.microsoft.com/office/word/2010/wordml" xmlns:w15="http://schemas.microsoft.com/office/word/2012/wordml" xmlns:wpg="http://schemas.microsoft.com/office/word/2010/wordprocessingGroup" xmlns:wpi="http://schemas.microsoft.com/office/word/2010/wordprocessingInk" xmlns:wne="http://schemas.microsoft.com/office/word/2006/wordml" xmlns:wps="http://schemas.microsoft.com/office/word/2010/wordprocessingShape" mc:Ignorable="w14 w15 wp14">
   <w:p>
     <w:pPr>
-      <w:pStyle w:val="Footer"/>
-      <w:spacing w:before="0" w:after="160"/>
-      <w:rPr/>
+      <w:pStyle w:val="Pieddepage"/>
     </w:pPr>
-    <w:r>
-      <w:rPr/>
-    </w:r>
   </w:p>
 </w:ftr>
 </file>
 
 <file path=word/footer2.xml><?xml version="1.0" encoding="utf-8"?>
-<w:ftr xmlns:o="urn:schemas-microsoft-com:office:office" xmlns:r="http://schemas.openxmlformats.org/officeDocument/2006/relationships" xmlns:v="urn:schemas-microsoft-com:vml" xmlns:w="http://schemas.openxmlformats.org/wordprocessingml/2006/main" xmlns:w10="urn:schemas-microsoft-com:office:word" xmlns:wp="http://schemas.openxmlformats.org/drawingml/2006/wordprocessingDrawing" xmlns:wps="http://schemas.microsoft.com/office/word/2010/wordprocessingShape" xmlns:wpg="http://schemas.microsoft.com/office/word/2010/wordprocessingGroup" xmlns:mc="http://schemas.openxmlformats.org/markup-compatibility/2006" xmlns:wp14="http://schemas.microsoft.com/office/word/2010/wordprocessingDrawing" xmlns:w14="http://schemas.microsoft.com/office/word/2010/wordml" xmlns:w15="http://schemas.microsoft.com/office/word/2012/wordml" mc:Ignorable="w14 wp14 w15">
+<w:ftr xmlns:wpc="http://schemas.microsoft.com/office/word/2010/wordprocessingCanvas" xmlns:mc="http://schemas.openxmlformats.org/markup-compatibility/2006" xmlns:o="urn:schemas-microsoft-com:office:office" xmlns:r="http://schemas.openxmlformats.org/officeDocument/2006/relationships" xmlns:m="http://schemas.openxmlformats.org/officeDocument/2006/math" xmlns:v="urn:schemas-microsoft-com:vml" xmlns:wp14="http://schemas.microsoft.com/office/word/2010/wordprocessingDrawing" xmlns:wp="http://schemas.openxmlformats.org/drawingml/2006/wordprocessingDrawing" xmlns:w10="urn:schemas-microsoft-com:office:word" xmlns:w="http://schemas.openxmlformats.org/wordprocessingml/2006/main" xmlns:w14="http://schemas.microsoft.com/office/word/2010/wordml" xmlns:w15="http://schemas.microsoft.com/office/word/2012/wordml" xmlns:wpg="http://schemas.microsoft.com/office/word/2010/wordprocessingGroup" xmlns:wpi="http://schemas.microsoft.com/office/word/2010/wordprocessingInk" xmlns:wne="http://schemas.microsoft.com/office/word/2006/wordml" xmlns:wps="http://schemas.microsoft.com/office/word/2010/wordprocessingShape" mc:Ignorable="w14 w15 wp14">
   <w:p>
     <w:pPr>
-      <w:pStyle w:val="Footer"/>
-      <w:spacing w:before="0" w:after="160"/>
+      <w:pStyle w:val="Pieddepage"/>
       <w:jc w:val="right"/>
       <w:rPr>
         <w:sz w:val="16"/>
@@ -1429,16 +1602,36 @@
     </w:r>
     <w:r>
       <w:rPr>
-        <w:rFonts w:cs="Times New Roman" w:ascii="Times New Roman" w:hAnsi="Times New Roman"/>
+        <w:rFonts w:ascii="Times New Roman" w:hAnsi="Times New Roman" w:cs="Times New Roman"/>
         <w:sz w:val="16"/>
         <w:szCs w:val="16"/>
         <w:lang w:val="en-US"/>
       </w:rPr>
-      <w:t xml:space="preserve">| +++assignment.sessionName+++ | </w:t>
+      <w:t>| +++</w:t>
+    </w:r>
+    <w:proofErr w:type="spellStart"/>
+    <w:r>
+      <w:rPr>
+        <w:rFonts w:ascii="Times New Roman" w:hAnsi="Times New Roman" w:cs="Times New Roman"/>
+        <w:sz w:val="16"/>
+        <w:szCs w:val="16"/>
+        <w:lang w:val="en-US"/>
+      </w:rPr>
+      <w:t>assignment.sessionName</w:t>
+    </w:r>
+    <w:proofErr w:type="spellEnd"/>
+    <w:r>
+      <w:rPr>
+        <w:rFonts w:ascii="Times New Roman" w:hAnsi="Times New Roman" w:cs="Times New Roman"/>
+        <w:sz w:val="16"/>
+        <w:szCs w:val="16"/>
+        <w:lang w:val="en-US"/>
+      </w:rPr>
+      <w:t xml:space="preserve">+++ | </w:t>
     </w:r>
     <w:r>
       <w:rPr>
-        <w:rFonts w:cs="Times New Roman" w:ascii="Times New Roman" w:hAnsi="Times New Roman"/>
+        <w:rFonts w:ascii="Times New Roman" w:hAnsi="Times New Roman" w:cs="Times New Roman"/>
         <w:b/>
         <w:sz w:val="16"/>
         <w:szCs w:val="16"/>
@@ -1448,23 +1641,42 @@
     </w:r>
     <w:r>
       <w:rPr>
-        <w:rFonts w:cs="Times New Roman" w:ascii="Times New Roman" w:hAnsi="Times New Roman"/>
+        <w:rFonts w:ascii="Times New Roman" w:hAnsi="Times New Roman" w:cs="Times New Roman"/>
         <w:sz w:val="16"/>
         <w:szCs w:val="16"/>
         <w:lang w:val="en-US"/>
       </w:rPr>
-      <w:t xml:space="preserve"> | +++school.studyYear.yearName+++</w:t>
+      <w:t xml:space="preserve"> | +++</w:t>
+    </w:r>
+    <w:proofErr w:type="spellStart"/>
+    <w:r>
+      <w:rPr>
+        <w:rFonts w:ascii="Times New Roman" w:hAnsi="Times New Roman" w:cs="Times New Roman"/>
+        <w:sz w:val="16"/>
+        <w:szCs w:val="16"/>
+        <w:lang w:val="en-US"/>
+      </w:rPr>
+      <w:t>school.studyYear.yearName</w:t>
+    </w:r>
+    <w:proofErr w:type="spellEnd"/>
+    <w:r>
+      <w:rPr>
+        <w:rFonts w:ascii="Times New Roman" w:hAnsi="Times New Roman" w:cs="Times New Roman"/>
+        <w:sz w:val="16"/>
+        <w:szCs w:val="16"/>
+        <w:lang w:val="en-US"/>
+      </w:rPr>
+      <w:t>+++</w:t>
     </w:r>
   </w:p>
 </w:ftr>
 </file>
 
 <file path=word/footer3.xml><?xml version="1.0" encoding="utf-8"?>
-<w:ftr xmlns:o="urn:schemas-microsoft-com:office:office" xmlns:r="http://schemas.openxmlformats.org/officeDocument/2006/relationships" xmlns:v="urn:schemas-microsoft-com:vml" xmlns:w="http://schemas.openxmlformats.org/wordprocessingml/2006/main" xmlns:w10="urn:schemas-microsoft-com:office:word" xmlns:wp="http://schemas.openxmlformats.org/drawingml/2006/wordprocessingDrawing" xmlns:wps="http://schemas.microsoft.com/office/word/2010/wordprocessingShape" xmlns:wpg="http://schemas.microsoft.com/office/word/2010/wordprocessingGroup" xmlns:mc="http://schemas.openxmlformats.org/markup-compatibility/2006" xmlns:wp14="http://schemas.microsoft.com/office/word/2010/wordprocessingDrawing" xmlns:w14="http://schemas.microsoft.com/office/word/2010/wordml" xmlns:w15="http://schemas.microsoft.com/office/word/2012/wordml" mc:Ignorable="w14 wp14 w15">
+<w:ftr xmlns:wpc="http://schemas.microsoft.com/office/word/2010/wordprocessingCanvas" xmlns:mc="http://schemas.openxmlformats.org/markup-compatibility/2006" xmlns:o="urn:schemas-microsoft-com:office:office" xmlns:r="http://schemas.openxmlformats.org/officeDocument/2006/relationships" xmlns:m="http://schemas.openxmlformats.org/officeDocument/2006/math" xmlns:v="urn:schemas-microsoft-com:vml" xmlns:wp14="http://schemas.microsoft.com/office/word/2010/wordprocessingDrawing" xmlns:wp="http://schemas.openxmlformats.org/drawingml/2006/wordprocessingDrawing" xmlns:w10="urn:schemas-microsoft-com:office:word" xmlns:w="http://schemas.openxmlformats.org/wordprocessingml/2006/main" xmlns:w14="http://schemas.microsoft.com/office/word/2010/wordml" xmlns:w15="http://schemas.microsoft.com/office/word/2012/wordml" xmlns:wpg="http://schemas.microsoft.com/office/word/2010/wordprocessingGroup" xmlns:wpi="http://schemas.microsoft.com/office/word/2010/wordprocessingInk" xmlns:wne="http://schemas.microsoft.com/office/word/2006/wordml" xmlns:wps="http://schemas.microsoft.com/office/word/2010/wordprocessingShape" mc:Ignorable="w14 w15 wp14">
   <w:p>
     <w:pPr>
-      <w:pStyle w:val="Footer"/>
-      <w:spacing w:before="0" w:after="160"/>
+      <w:pStyle w:val="Pieddepage"/>
       <w:jc w:val="right"/>
       <w:rPr>
         <w:sz w:val="16"/>
@@ -1481,16 +1693,36 @@
     </w:r>
     <w:r>
       <w:rPr>
-        <w:rFonts w:cs="Times New Roman" w:ascii="Times New Roman" w:hAnsi="Times New Roman"/>
+        <w:rFonts w:ascii="Times New Roman" w:hAnsi="Times New Roman" w:cs="Times New Roman"/>
         <w:sz w:val="16"/>
         <w:szCs w:val="16"/>
         <w:lang w:val="en-US"/>
       </w:rPr>
-      <w:t xml:space="preserve">| +++assignment.sessionName+++ | </w:t>
+      <w:t>| +++</w:t>
+    </w:r>
+    <w:proofErr w:type="spellStart"/>
+    <w:r>
+      <w:rPr>
+        <w:rFonts w:ascii="Times New Roman" w:hAnsi="Times New Roman" w:cs="Times New Roman"/>
+        <w:sz w:val="16"/>
+        <w:szCs w:val="16"/>
+        <w:lang w:val="en-US"/>
+      </w:rPr>
+      <w:t>assignment.sessionName</w:t>
+    </w:r>
+    <w:proofErr w:type="spellEnd"/>
+    <w:r>
+      <w:rPr>
+        <w:rFonts w:ascii="Times New Roman" w:hAnsi="Times New Roman" w:cs="Times New Roman"/>
+        <w:sz w:val="16"/>
+        <w:szCs w:val="16"/>
+        <w:lang w:val="en-US"/>
+      </w:rPr>
+      <w:t xml:space="preserve">+++ | </w:t>
     </w:r>
     <w:r>
       <w:rPr>
-        <w:rFonts w:cs="Times New Roman" w:ascii="Times New Roman" w:hAnsi="Times New Roman"/>
+        <w:rFonts w:ascii="Times New Roman" w:hAnsi="Times New Roman" w:cs="Times New Roman"/>
         <w:b/>
         <w:sz w:val="16"/>
         <w:szCs w:val="16"/>
@@ -1500,139 +1732,68 @@
     </w:r>
     <w:r>
       <w:rPr>
-        <w:rFonts w:cs="Times New Roman" w:ascii="Times New Roman" w:hAnsi="Times New Roman"/>
+        <w:rFonts w:ascii="Times New Roman" w:hAnsi="Times New Roman" w:cs="Times New Roman"/>
         <w:sz w:val="16"/>
         <w:szCs w:val="16"/>
         <w:lang w:val="en-US"/>
       </w:rPr>
-      <w:t xml:space="preserve"> | +++school.studyYear.yearName+++</w:t>
+      <w:t xml:space="preserve"> | +++</w:t>
+    </w:r>
+    <w:proofErr w:type="spellStart"/>
+    <w:r>
+      <w:rPr>
+        <w:rFonts w:ascii="Times New Roman" w:hAnsi="Times New Roman" w:cs="Times New Roman"/>
+        <w:sz w:val="16"/>
+        <w:szCs w:val="16"/>
+        <w:lang w:val="en-US"/>
+      </w:rPr>
+      <w:t>school.studyYear.yearName</w:t>
+    </w:r>
+    <w:proofErr w:type="spellEnd"/>
+    <w:r>
+      <w:rPr>
+        <w:rFonts w:ascii="Times New Roman" w:hAnsi="Times New Roman" w:cs="Times New Roman"/>
+        <w:sz w:val="16"/>
+        <w:szCs w:val="16"/>
+        <w:lang w:val="en-US"/>
+      </w:rPr>
+      <w:t>+++</w:t>
     </w:r>
   </w:p>
 </w:ftr>
 </file>
 
+<file path=word/footnotes.xml><?xml version="1.0" encoding="utf-8"?>
+<w:footnotes xmlns:wpc="http://schemas.microsoft.com/office/word/2010/wordprocessingCanvas" xmlns:mc="http://schemas.openxmlformats.org/markup-compatibility/2006" xmlns:o="urn:schemas-microsoft-com:office:office" xmlns:r="http://schemas.openxmlformats.org/officeDocument/2006/relationships" xmlns:m="http://schemas.openxmlformats.org/officeDocument/2006/math" xmlns:v="urn:schemas-microsoft-com:vml" xmlns:wp14="http://schemas.microsoft.com/office/word/2010/wordprocessingDrawing" xmlns:wp="http://schemas.openxmlformats.org/drawingml/2006/wordprocessingDrawing" xmlns:w10="urn:schemas-microsoft-com:office:word" xmlns:w="http://schemas.openxmlformats.org/wordprocessingml/2006/main" xmlns:w14="http://schemas.microsoft.com/office/word/2010/wordml" xmlns:w15="http://schemas.microsoft.com/office/word/2012/wordml" xmlns:wpg="http://schemas.microsoft.com/office/word/2010/wordprocessingGroup" xmlns:wpi="http://schemas.microsoft.com/office/word/2010/wordprocessingInk" xmlns:wne="http://schemas.microsoft.com/office/word/2006/wordml" xmlns:wps="http://schemas.microsoft.com/office/word/2010/wordprocessingShape" mc:Ignorable="w14 w15 wp14">
+  <w:footnote w:type="separator" w:id="-1">
+    <w:p>
+      <w:pPr>
+        <w:spacing w:after="0" w:line="240" w:lineRule="auto"/>
+      </w:pPr>
+      <w:r>
+        <w:separator/>
+      </w:r>
+    </w:p>
+  </w:footnote>
+  <w:footnote w:type="continuationSeparator" w:id="0">
+    <w:p>
+      <w:pPr>
+        <w:spacing w:after="0" w:line="240" w:lineRule="auto"/>
+      </w:pPr>
+      <w:r>
+        <w:continuationSeparator/>
+      </w:r>
+    </w:p>
+  </w:footnote>
+</w:footnotes>
+</file>
+
 <file path=word/numbering.xml><?xml version="1.0" encoding="utf-8"?>
-<w:numbering xmlns:w="http://schemas.openxmlformats.org/wordprocessingml/2006/main" xmlns:o="urn:schemas-microsoft-com:office:office" xmlns:r="http://schemas.openxmlformats.org/officeDocument/2006/relationships" xmlns:v="urn:schemas-microsoft-com:vml" xmlns:mc="http://schemas.openxmlformats.org/markup-compatibility/2006" xmlns:w14="http://schemas.microsoft.com/office/word/2010/wordml" mc:Ignorable="w14">
-  <w:abstractNum w:abstractNumId="1">
-    <w:lvl w:ilvl="0">
-      <w:start w:val="1"/>
-      <w:numFmt w:val="none"/>
-      <w:suff w:val="nothing"/>
-      <w:lvlText w:val=""/>
-      <w:lvlJc w:val="left"/>
-      <w:pPr>
-        <w:tabs>
-          <w:tab w:val="num" w:pos="0"/>
-        </w:tabs>
-        <w:ind w:left="0" w:hanging="0"/>
-      </w:pPr>
-    </w:lvl>
-    <w:lvl w:ilvl="1">
-      <w:start w:val="1"/>
-      <w:numFmt w:val="none"/>
-      <w:suff w:val="nothing"/>
-      <w:lvlText w:val=""/>
-      <w:lvlJc w:val="left"/>
-      <w:pPr>
-        <w:tabs>
-          <w:tab w:val="num" w:pos="0"/>
-        </w:tabs>
-        <w:ind w:left="0" w:hanging="0"/>
-      </w:pPr>
-    </w:lvl>
-    <w:lvl w:ilvl="2">
-      <w:start w:val="1"/>
-      <w:numFmt w:val="none"/>
-      <w:suff w:val="nothing"/>
-      <w:lvlText w:val=""/>
-      <w:lvlJc w:val="left"/>
-      <w:pPr>
-        <w:tabs>
-          <w:tab w:val="num" w:pos="0"/>
-        </w:tabs>
-        <w:ind w:left="0" w:hanging="0"/>
-      </w:pPr>
-    </w:lvl>
-    <w:lvl w:ilvl="3">
-      <w:start w:val="1"/>
-      <w:numFmt w:val="none"/>
-      <w:suff w:val="nothing"/>
-      <w:lvlText w:val=""/>
-      <w:lvlJc w:val="left"/>
-      <w:pPr>
-        <w:tabs>
-          <w:tab w:val="num" w:pos="0"/>
-        </w:tabs>
-        <w:ind w:left="0" w:hanging="0"/>
-      </w:pPr>
-    </w:lvl>
-    <w:lvl w:ilvl="4">
-      <w:start w:val="1"/>
-      <w:numFmt w:val="none"/>
-      <w:suff w:val="nothing"/>
-      <w:lvlText w:val=""/>
-      <w:lvlJc w:val="left"/>
-      <w:pPr>
-        <w:tabs>
-          <w:tab w:val="num" w:pos="0"/>
-        </w:tabs>
-        <w:ind w:left="0" w:hanging="0"/>
-      </w:pPr>
-    </w:lvl>
-    <w:lvl w:ilvl="5">
-      <w:start w:val="1"/>
-      <w:numFmt w:val="none"/>
-      <w:suff w:val="nothing"/>
-      <w:lvlText w:val=""/>
-      <w:lvlJc w:val="left"/>
-      <w:pPr>
-        <w:tabs>
-          <w:tab w:val="num" w:pos="0"/>
-        </w:tabs>
-        <w:ind w:left="0" w:hanging="0"/>
-      </w:pPr>
-    </w:lvl>
-    <w:lvl w:ilvl="6">
-      <w:start w:val="1"/>
-      <w:numFmt w:val="none"/>
-      <w:suff w:val="nothing"/>
-      <w:lvlText w:val=""/>
-      <w:lvlJc w:val="left"/>
-      <w:pPr>
-        <w:tabs>
-          <w:tab w:val="num" w:pos="0"/>
-        </w:tabs>
-        <w:ind w:left="0" w:hanging="0"/>
-      </w:pPr>
-    </w:lvl>
-    <w:lvl w:ilvl="7">
-      <w:start w:val="1"/>
-      <w:numFmt w:val="none"/>
-      <w:suff w:val="nothing"/>
-      <w:lvlText w:val=""/>
-      <w:lvlJc w:val="left"/>
-      <w:pPr>
-        <w:tabs>
-          <w:tab w:val="num" w:pos="0"/>
-        </w:tabs>
-        <w:ind w:left="0" w:hanging="0"/>
-      </w:pPr>
-    </w:lvl>
-    <w:lvl w:ilvl="8">
-      <w:start w:val="1"/>
-      <w:numFmt w:val="none"/>
-      <w:suff w:val="nothing"/>
-      <w:lvlText w:val=""/>
-      <w:lvlJc w:val="left"/>
-      <w:pPr>
-        <w:tabs>
-          <w:tab w:val="num" w:pos="0"/>
-        </w:tabs>
-        <w:ind w:left="0" w:hanging="0"/>
-      </w:pPr>
-    </w:lvl>
-  </w:abstractNum>
-  <w:abstractNum w:abstractNumId="2">
+<w:numbering xmlns:wpc="http://schemas.microsoft.com/office/word/2010/wordprocessingCanvas" xmlns:mc="http://schemas.openxmlformats.org/markup-compatibility/2006" xmlns:o="urn:schemas-microsoft-com:office:office" xmlns:r="http://schemas.openxmlformats.org/officeDocument/2006/relationships" xmlns:m="http://schemas.openxmlformats.org/officeDocument/2006/math" xmlns:v="urn:schemas-microsoft-com:vml" xmlns:wp14="http://schemas.microsoft.com/office/word/2010/wordprocessingDrawing" xmlns:wp="http://schemas.openxmlformats.org/drawingml/2006/wordprocessingDrawing" xmlns:w10="urn:schemas-microsoft-com:office:word" xmlns:w="http://schemas.openxmlformats.org/wordprocessingml/2006/main" xmlns:w14="http://schemas.microsoft.com/office/word/2010/wordml" xmlns:w15="http://schemas.microsoft.com/office/word/2012/wordml" xmlns:wpg="http://schemas.microsoft.com/office/word/2010/wordprocessingGroup" xmlns:wpi="http://schemas.microsoft.com/office/word/2010/wordprocessingInk" xmlns:wne="http://schemas.microsoft.com/office/word/2006/wordml" xmlns:wps="http://schemas.microsoft.com/office/word/2010/wordprocessingShape" mc:Ignorable="w14 w15 wp14">
+  <w:abstractNum w:abstractNumId="0">
+    <w:nsid w:val="3C900DBA"/>
+    <w:multiLevelType w:val="multilevel"/>
+    <w:tmpl w:val="AB16F23A"/>
     <w:lvl w:ilvl="0">
       <w:start w:val="1"/>
       <w:numFmt w:val="bullet"/>
@@ -1769,21 +1930,143 @@
       </w:rPr>
     </w:lvl>
   </w:abstractNum>
+  <w:abstractNum w:abstractNumId="1">
+    <w:nsid w:val="55EF6B8E"/>
+    <w:multiLevelType w:val="multilevel"/>
+    <w:tmpl w:val="D9486216"/>
+    <w:lvl w:ilvl="0">
+      <w:start w:val="1"/>
+      <w:numFmt w:val="none"/>
+      <w:suff w:val="nothing"/>
+      <w:lvlText w:val=""/>
+      <w:lvlJc w:val="left"/>
+      <w:pPr>
+        <w:tabs>
+          <w:tab w:val="num" w:pos="0"/>
+        </w:tabs>
+        <w:ind w:left="0" w:firstLine="0"/>
+      </w:pPr>
+    </w:lvl>
+    <w:lvl w:ilvl="1">
+      <w:start w:val="1"/>
+      <w:numFmt w:val="none"/>
+      <w:suff w:val="nothing"/>
+      <w:lvlText w:val=""/>
+      <w:lvlJc w:val="left"/>
+      <w:pPr>
+        <w:tabs>
+          <w:tab w:val="num" w:pos="0"/>
+        </w:tabs>
+        <w:ind w:left="0" w:firstLine="0"/>
+      </w:pPr>
+    </w:lvl>
+    <w:lvl w:ilvl="2">
+      <w:start w:val="1"/>
+      <w:numFmt w:val="none"/>
+      <w:suff w:val="nothing"/>
+      <w:lvlText w:val=""/>
+      <w:lvlJc w:val="left"/>
+      <w:pPr>
+        <w:tabs>
+          <w:tab w:val="num" w:pos="0"/>
+        </w:tabs>
+        <w:ind w:left="0" w:firstLine="0"/>
+      </w:pPr>
+    </w:lvl>
+    <w:lvl w:ilvl="3">
+      <w:start w:val="1"/>
+      <w:numFmt w:val="none"/>
+      <w:suff w:val="nothing"/>
+      <w:lvlText w:val=""/>
+      <w:lvlJc w:val="left"/>
+      <w:pPr>
+        <w:tabs>
+          <w:tab w:val="num" w:pos="0"/>
+        </w:tabs>
+        <w:ind w:left="0" w:firstLine="0"/>
+      </w:pPr>
+    </w:lvl>
+    <w:lvl w:ilvl="4">
+      <w:start w:val="1"/>
+      <w:numFmt w:val="none"/>
+      <w:suff w:val="nothing"/>
+      <w:lvlText w:val=""/>
+      <w:lvlJc w:val="left"/>
+      <w:pPr>
+        <w:tabs>
+          <w:tab w:val="num" w:pos="0"/>
+        </w:tabs>
+        <w:ind w:left="0" w:firstLine="0"/>
+      </w:pPr>
+    </w:lvl>
+    <w:lvl w:ilvl="5">
+      <w:start w:val="1"/>
+      <w:numFmt w:val="none"/>
+      <w:suff w:val="nothing"/>
+      <w:lvlText w:val=""/>
+      <w:lvlJc w:val="left"/>
+      <w:pPr>
+        <w:tabs>
+          <w:tab w:val="num" w:pos="0"/>
+        </w:tabs>
+        <w:ind w:left="0" w:firstLine="0"/>
+      </w:pPr>
+    </w:lvl>
+    <w:lvl w:ilvl="6">
+      <w:start w:val="1"/>
+      <w:numFmt w:val="none"/>
+      <w:suff w:val="nothing"/>
+      <w:lvlText w:val=""/>
+      <w:lvlJc w:val="left"/>
+      <w:pPr>
+        <w:tabs>
+          <w:tab w:val="num" w:pos="0"/>
+        </w:tabs>
+        <w:ind w:left="0" w:firstLine="0"/>
+      </w:pPr>
+    </w:lvl>
+    <w:lvl w:ilvl="7">
+      <w:start w:val="1"/>
+      <w:numFmt w:val="none"/>
+      <w:suff w:val="nothing"/>
+      <w:lvlText w:val=""/>
+      <w:lvlJc w:val="left"/>
+      <w:pPr>
+        <w:tabs>
+          <w:tab w:val="num" w:pos="0"/>
+        </w:tabs>
+        <w:ind w:left="0" w:firstLine="0"/>
+      </w:pPr>
+    </w:lvl>
+    <w:lvl w:ilvl="8">
+      <w:start w:val="1"/>
+      <w:numFmt w:val="none"/>
+      <w:suff w:val="nothing"/>
+      <w:lvlText w:val=""/>
+      <w:lvlJc w:val="left"/>
+      <w:pPr>
+        <w:tabs>
+          <w:tab w:val="num" w:pos="0"/>
+        </w:tabs>
+        <w:ind w:left="0" w:firstLine="0"/>
+      </w:pPr>
+    </w:lvl>
+  </w:abstractNum>
   <w:num w:numId="1">
     <w:abstractNumId w:val="1"/>
   </w:num>
   <w:num w:numId="2">
-    <w:abstractNumId w:val="2"/>
+    <w:abstractNumId w:val="0"/>
   </w:num>
 </w:numbering>
 </file>
 
 <file path=word/styles.xml><?xml version="1.0" encoding="utf-8"?>
-<w:styles xmlns:w="http://schemas.openxmlformats.org/wordprocessingml/2006/main" xmlns:w14="http://schemas.microsoft.com/office/word/2010/wordml" xmlns:mc="http://schemas.openxmlformats.org/markup-compatibility/2006" mc:Ignorable="w14">
+<w:styles xmlns:mc="http://schemas.openxmlformats.org/markup-compatibility/2006" xmlns:r="http://schemas.openxmlformats.org/officeDocument/2006/relationships" xmlns:w="http://schemas.openxmlformats.org/wordprocessingml/2006/main" xmlns:w14="http://schemas.microsoft.com/office/word/2010/wordml" xmlns:w15="http://schemas.microsoft.com/office/word/2012/wordml" mc:Ignorable="w14 w15">
   <w:docDefaults>
     <w:rPrDefault>
       <w:rPr>
-        <w:rFonts w:ascii="Calibri" w:hAnsi="Calibri" w:eastAsia="Calibri" w:cs="" w:asciiTheme="minorHAnsi" w:cstheme="minorBidi" w:eastAsiaTheme="minorHAnsi" w:hAnsiTheme="minorHAnsi"/>
+        <w:rFonts w:asciiTheme="minorHAnsi" w:eastAsiaTheme="minorHAnsi" w:hAnsiTheme="minorHAnsi" w:cstheme="minorBidi"/>
         <w:sz w:val="22"/>
         <w:szCs w:val="22"/>
         <w:lang w:val="fr-FR" w:eastAsia="en-US" w:bidi="ar-SA"/>
@@ -1791,21 +2074,21 @@
     </w:rPrDefault>
     <w:pPrDefault>
       <w:pPr>
-        <w:suppressAutoHyphens w:val="true"/>
+        <w:suppressAutoHyphens/>
       </w:pPr>
     </w:pPrDefault>
   </w:docDefaults>
   <w:latentStyles w:defLockedState="0" w:defUIPriority="99" w:defSemiHidden="0" w:defUnhideWhenUsed="0" w:defQFormat="0" w:count="371">
     <w:lsdException w:name="Normal" w:uiPriority="0" w:qFormat="1"/>
     <w:lsdException w:name="heading 1" w:uiPriority="9" w:qFormat="1"/>
-    <w:lsdException w:name="heading 2" w:uiPriority="9" w:semiHidden="1" w:unhideWhenUsed="1" w:qFormat="1"/>
-    <w:lsdException w:name="heading 3" w:uiPriority="9" w:semiHidden="1" w:unhideWhenUsed="1" w:qFormat="1"/>
-    <w:lsdException w:name="heading 4" w:uiPriority="9" w:semiHidden="1" w:unhideWhenUsed="1" w:qFormat="1"/>
-    <w:lsdException w:name="heading 5" w:uiPriority="9" w:semiHidden="1" w:unhideWhenUsed="1" w:qFormat="1"/>
-    <w:lsdException w:name="heading 6" w:uiPriority="9" w:semiHidden="1" w:unhideWhenUsed="1" w:qFormat="1"/>
-    <w:lsdException w:name="heading 7" w:uiPriority="9" w:semiHidden="1" w:unhideWhenUsed="1" w:qFormat="1"/>
-    <w:lsdException w:name="heading 8" w:uiPriority="9" w:semiHidden="1" w:unhideWhenUsed="1" w:qFormat="1"/>
-    <w:lsdException w:name="heading 9" w:uiPriority="9" w:semiHidden="1" w:unhideWhenUsed="1" w:qFormat="1"/>
+    <w:lsdException w:name="heading 2" w:semiHidden="1" w:uiPriority="9" w:unhideWhenUsed="1" w:qFormat="1"/>
+    <w:lsdException w:name="heading 3" w:semiHidden="1" w:uiPriority="9" w:unhideWhenUsed="1" w:qFormat="1"/>
+    <w:lsdException w:name="heading 4" w:semiHidden="1" w:uiPriority="9" w:unhideWhenUsed="1" w:qFormat="1"/>
+    <w:lsdException w:name="heading 5" w:semiHidden="1" w:uiPriority="9" w:unhideWhenUsed="1" w:qFormat="1"/>
+    <w:lsdException w:name="heading 6" w:semiHidden="1" w:uiPriority="9" w:unhideWhenUsed="1" w:qFormat="1"/>
+    <w:lsdException w:name="heading 7" w:semiHidden="1" w:uiPriority="9" w:unhideWhenUsed="1" w:qFormat="1"/>
+    <w:lsdException w:name="heading 8" w:semiHidden="1" w:uiPriority="9" w:unhideWhenUsed="1" w:qFormat="1"/>
+    <w:lsdException w:name="heading 9" w:semiHidden="1" w:uiPriority="9" w:unhideWhenUsed="1" w:qFormat="1"/>
     <w:lsdException w:name="index 1" w:semiHidden="1" w:unhideWhenUsed="1"/>
     <w:lsdException w:name="index 2" w:semiHidden="1" w:unhideWhenUsed="1"/>
     <w:lsdException w:name="index 3" w:semiHidden="1" w:unhideWhenUsed="1"/>
@@ -1815,22 +2098,22 @@
     <w:lsdException w:name="index 7" w:semiHidden="1" w:unhideWhenUsed="1"/>
     <w:lsdException w:name="index 8" w:semiHidden="1" w:unhideWhenUsed="1"/>
     <w:lsdException w:name="index 9" w:semiHidden="1" w:unhideWhenUsed="1"/>
-    <w:lsdException w:name="toc 1" w:uiPriority="39" w:semiHidden="1" w:unhideWhenUsed="1"/>
-    <w:lsdException w:name="toc 2" w:uiPriority="39" w:semiHidden="1" w:unhideWhenUsed="1"/>
-    <w:lsdException w:name="toc 3" w:uiPriority="39" w:semiHidden="1" w:unhideWhenUsed="1"/>
-    <w:lsdException w:name="toc 4" w:uiPriority="39" w:semiHidden="1" w:unhideWhenUsed="1"/>
-    <w:lsdException w:name="toc 5" w:uiPriority="39" w:semiHidden="1" w:unhideWhenUsed="1"/>
-    <w:lsdException w:name="toc 6" w:uiPriority="39" w:semiHidden="1" w:unhideWhenUsed="1"/>
-    <w:lsdException w:name="toc 7" w:uiPriority="39" w:semiHidden="1" w:unhideWhenUsed="1"/>
-    <w:lsdException w:name="toc 8" w:uiPriority="39" w:semiHidden="1" w:unhideWhenUsed="1"/>
-    <w:lsdException w:name="toc 9" w:uiPriority="39" w:semiHidden="1" w:unhideWhenUsed="1"/>
+    <w:lsdException w:name="toc 1" w:semiHidden="1" w:uiPriority="39" w:unhideWhenUsed="1"/>
+    <w:lsdException w:name="toc 2" w:semiHidden="1" w:uiPriority="39" w:unhideWhenUsed="1"/>
+    <w:lsdException w:name="toc 3" w:semiHidden="1" w:uiPriority="39" w:unhideWhenUsed="1"/>
+    <w:lsdException w:name="toc 4" w:semiHidden="1" w:uiPriority="39" w:unhideWhenUsed="1"/>
+    <w:lsdException w:name="toc 5" w:semiHidden="1" w:uiPriority="39" w:unhideWhenUsed="1"/>
+    <w:lsdException w:name="toc 6" w:semiHidden="1" w:uiPriority="39" w:unhideWhenUsed="1"/>
+    <w:lsdException w:name="toc 7" w:semiHidden="1" w:uiPriority="39" w:unhideWhenUsed="1"/>
+    <w:lsdException w:name="toc 8" w:semiHidden="1" w:uiPriority="39" w:unhideWhenUsed="1"/>
+    <w:lsdException w:name="toc 9" w:semiHidden="1" w:uiPriority="39" w:unhideWhenUsed="1"/>
     <w:lsdException w:name="Normal Indent" w:semiHidden="1" w:unhideWhenUsed="1"/>
     <w:lsdException w:name="footnote text" w:semiHidden="1" w:unhideWhenUsed="1"/>
     <w:lsdException w:name="annotation text" w:semiHidden="1" w:unhideWhenUsed="1"/>
     <w:lsdException w:name="header" w:semiHidden="1" w:unhideWhenUsed="1"/>
     <w:lsdException w:name="footer" w:semiHidden="1" w:unhideWhenUsed="1"/>
     <w:lsdException w:name="index heading" w:semiHidden="1" w:unhideWhenUsed="1"/>
-    <w:lsdException w:name="caption" w:uiPriority="35" w:semiHidden="1" w:unhideWhenUsed="1" w:qFormat="1"/>
+    <w:lsdException w:name="caption" w:semiHidden="1" w:uiPriority="35" w:unhideWhenUsed="1" w:qFormat="1"/>
     <w:lsdException w:name="table of figures" w:semiHidden="1" w:unhideWhenUsed="1"/>
     <w:lsdException w:name="envelope address" w:semiHidden="1" w:unhideWhenUsed="1"/>
     <w:lsdException w:name="envelope return" w:semiHidden="1" w:unhideWhenUsed="1"/>
@@ -1861,7 +2144,7 @@
     <w:lsdException w:name="Title" w:uiPriority="10" w:qFormat="1"/>
     <w:lsdException w:name="Closing" w:semiHidden="1" w:unhideWhenUsed="1"/>
     <w:lsdException w:name="Signature" w:semiHidden="1" w:unhideWhenUsed="1"/>
-    <w:lsdException w:name="Default Paragraph Font" w:uiPriority="1" w:semiHidden="1" w:unhideWhenUsed="1"/>
+    <w:lsdException w:name="Default Paragraph Font" w:semiHidden="1" w:uiPriority="1" w:unhideWhenUsed="1"/>
     <w:lsdException w:name="Body Text" w:semiHidden="1" w:unhideWhenUsed="1"/>
     <w:lsdException w:name="Body Text Indent" w:semiHidden="1" w:unhideWhenUsed="1"/>
     <w:lsdException w:name="List Continue" w:semiHidden="1" w:unhideWhenUsed="1"/>
@@ -2061,8 +2344,8 @@
     <w:lsdException w:name="Subtle Reference" w:uiPriority="31" w:qFormat="1"/>
     <w:lsdException w:name="Intense Reference" w:uiPriority="32" w:qFormat="1"/>
     <w:lsdException w:name="Book Title" w:uiPriority="33" w:qFormat="1"/>
-    <w:lsdException w:name="Bibliography" w:uiPriority="37" w:semiHidden="1" w:unhideWhenUsed="1"/>
-    <w:lsdException w:name="TOC Heading" w:uiPriority="39" w:semiHidden="1" w:unhideWhenUsed="1" w:qFormat="1"/>
+    <w:lsdException w:name="Bibliography" w:semiHidden="1" w:uiPriority="37" w:unhideWhenUsed="1"/>
+    <w:lsdException w:name="TOC Heading" w:semiHidden="1" w:uiPriority="39" w:unhideWhenUsed="1" w:qFormat="1"/>
     <w:lsdException w:name="Plain Table 1" w:uiPriority="41"/>
     <w:lsdException w:name="Plain Table 2" w:uiPriority="42"/>
     <w:lsdException w:name="Plain Table 3" w:uiPriority="43"/>
@@ -2168,208 +2451,198 @@
     <w:lsdException w:name="List Table 6 Colorful Accent 6" w:uiPriority="51"/>
     <w:lsdException w:name="List Table 7 Colorful Accent 6" w:uiPriority="52"/>
   </w:latentStyles>
-  <w:style w:type="paragraph" w:styleId="Normal" w:default="1">
+  <w:style w:type="paragraph" w:default="1" w:styleId="Normal">
     <w:name w:val="Normal"/>
     <w:qFormat/>
     <w:pPr>
-      <w:widowControl/>
-      <w:suppressAutoHyphens w:val="true"/>
-      <w:bidi w:val="0"/>
-      <w:spacing w:lineRule="auto" w:line="259" w:before="0" w:after="160"/>
-      <w:jc w:val="left"/>
+      <w:spacing w:after="160" w:line="259" w:lineRule="auto"/>
     </w:pPr>
-    <w:rPr>
-      <w:rFonts w:ascii="Calibri" w:hAnsi="Calibri" w:eastAsia="Calibri" w:cs="" w:asciiTheme="minorHAnsi" w:cstheme="minorBidi" w:eastAsiaTheme="minorHAnsi" w:hAnsiTheme="minorHAnsi"/>
-      <w:color w:val="auto"/>
-      <w:kern w:val="0"/>
-      <w:sz w:val="22"/>
-      <w:szCs w:val="22"/>
-      <w:lang w:val="fr-FR" w:eastAsia="en-US" w:bidi="ar-SA"/>
-    </w:rPr>
   </w:style>
-  <w:style w:type="paragraph" w:styleId="Heading1">
-    <w:name w:val="Heading 1"/>
+  <w:style w:type="paragraph" w:styleId="Titre1">
+    <w:name w:val="heading 1"/>
     <w:next w:val="Normal"/>
     <w:link w:val="Titre1Car"/>
     <w:autoRedefine/>
     <w:uiPriority w:val="9"/>
     <w:unhideWhenUsed/>
     <w:qFormat/>
-    <w:rsid w:val="005253e4"/>
+    <w:rsid w:val="005253E4"/>
     <w:pPr>
-      <w:keepNext w:val="true"/>
+      <w:keepNext/>
       <w:keepLines/>
-      <w:widowControl/>
-      <w:suppressAutoHyphens w:val="true"/>
-      <w:bidi w:val="0"/>
-      <w:spacing w:lineRule="auto" w:line="360" w:before="0" w:after="178"/>
-      <w:ind w:hanging="10" w:left="-5" w:right="-15"/>
+      <w:spacing w:after="178" w:line="360" w:lineRule="auto"/>
+      <w:ind w:left="-5" w:right="-15" w:hanging="10"/>
       <w:jc w:val="center"/>
       <w:outlineLvl w:val="0"/>
     </w:pPr>
     <w:rPr>
-      <w:rFonts w:ascii="Times New Roman" w:hAnsi="Times New Roman" w:eastAsia="Times New Roman" w:cs="Times New Roman"/>
+      <w:rFonts w:ascii="Times New Roman" w:eastAsia="Times New Roman" w:hAnsi="Times New Roman" w:cs="Times New Roman"/>
       <w:caps/>
       <w:color w:val="2E74B5"/>
-      <w:kern w:val="0"/>
       <w:sz w:val="28"/>
-      <w:szCs w:val="22"/>
-      <w:lang w:val="fr-FR" w:eastAsia="fr-FR" w:bidi="ar-SA"/>
+      <w:lang w:eastAsia="fr-FR"/>
     </w:rPr>
   </w:style>
-  <w:style w:type="paragraph" w:styleId="Heading2">
-    <w:name w:val="Heading 2"/>
+  <w:style w:type="paragraph" w:styleId="Titre2">
+    <w:name w:val="heading 2"/>
     <w:next w:val="Normal"/>
     <w:link w:val="Titre2Car"/>
     <w:autoRedefine/>
     <w:uiPriority w:val="9"/>
     <w:unhideWhenUsed/>
     <w:qFormat/>
-    <w:rsid w:val="005253e4"/>
+    <w:rsid w:val="005253E4"/>
     <w:pPr>
-      <w:keepNext w:val="true"/>
+      <w:keepNext/>
       <w:keepLines/>
-      <w:widowControl/>
-      <w:suppressAutoHyphens w:val="true"/>
-      <w:bidi w:val="0"/>
-      <w:spacing w:lineRule="auto" w:line="360" w:before="0" w:after="60"/>
-      <w:ind w:hanging="10" w:left="-5" w:right="-15"/>
-      <w:jc w:val="left"/>
+      <w:spacing w:after="60" w:line="360" w:lineRule="auto"/>
+      <w:ind w:left="-5" w:right="-15" w:hanging="10"/>
       <w:outlineLvl w:val="1"/>
     </w:pPr>
     <w:rPr>
-      <w:rFonts w:ascii="Times New Roman" w:hAnsi="Times New Roman" w:eastAsia="Calibri" w:cs="Calibri"/>
+      <w:rFonts w:ascii="Times New Roman" w:eastAsia="Calibri" w:hAnsi="Times New Roman" w:cs="Calibri"/>
       <w:caps/>
       <w:color w:val="1F4D78"/>
-      <w:kern w:val="0"/>
       <w:sz w:val="24"/>
-      <w:szCs w:val="22"/>
-      <w:lang w:val="fr-FR" w:eastAsia="fr-FR" w:bidi="ar-SA"/>
+      <w:lang w:eastAsia="fr-FR"/>
     </w:rPr>
   </w:style>
-  <w:style w:type="paragraph" w:styleId="Heading3">
-    <w:name w:val="Heading 3"/>
+  <w:style w:type="paragraph" w:styleId="Titre3">
+    <w:name w:val="heading 3"/>
     <w:next w:val="Normal"/>
     <w:link w:val="Titre3Car"/>
     <w:autoRedefine/>
     <w:uiPriority w:val="9"/>
     <w:unhideWhenUsed/>
     <w:qFormat/>
-    <w:rsid w:val="005253e4"/>
+    <w:rsid w:val="005253E4"/>
     <w:pPr>
-      <w:keepNext w:val="true"/>
+      <w:keepNext/>
       <w:keepLines/>
-      <w:widowControl/>
-      <w:suppressAutoHyphens w:val="true"/>
-      <w:bidi w:val="0"/>
-      <w:spacing w:lineRule="auto" w:line="240" w:before="0" w:after="60"/>
-      <w:ind w:hanging="10" w:left="-5" w:right="-15"/>
-      <w:jc w:val="left"/>
+      <w:spacing w:after="60"/>
+      <w:ind w:left="-5" w:right="-15" w:hanging="10"/>
       <w:outlineLvl w:val="2"/>
     </w:pPr>
     <w:rPr>
-      <w:rFonts w:ascii="Times New Roman" w:hAnsi="Times New Roman" w:eastAsia="Calibri" w:cs="Calibri"/>
+      <w:rFonts w:ascii="Times New Roman" w:eastAsia="Calibri" w:hAnsi="Times New Roman" w:cs="Calibri"/>
       <w:color w:val="1F4D78"/>
-      <w:kern w:val="0"/>
       <w:sz w:val="24"/>
-      <w:szCs w:val="22"/>
-      <w:lang w:val="fr-FR" w:eastAsia="fr-FR" w:bidi="ar-SA"/>
+      <w:lang w:eastAsia="fr-FR"/>
     </w:rPr>
   </w:style>
-  <w:style w:type="character" w:styleId="DefaultParagraphFont" w:default="1">
+  <w:style w:type="character" w:default="1" w:styleId="Policepardfaut">
     <w:name w:val="Default Paragraph Font"/>
     <w:uiPriority w:val="1"/>
     <w:semiHidden/>
     <w:unhideWhenUsed/>
-    <w:qFormat/>
-    <w:rPr/>
   </w:style>
-  <w:style w:type="character" w:styleId="Titre1Car" w:customStyle="1">
+  <w:style w:type="table" w:default="1" w:styleId="TableauNormal">
+    <w:name w:val="Normal Table"/>
+    <w:uiPriority w:val="99"/>
+    <w:semiHidden/>
+    <w:unhideWhenUsed/>
+    <w:tblPr>
+      <w:tblInd w:w="0" w:type="dxa"/>
+      <w:tblCellMar>
+        <w:top w:w="0" w:type="dxa"/>
+        <w:left w:w="108" w:type="dxa"/>
+        <w:bottom w:w="0" w:type="dxa"/>
+        <w:right w:w="108" w:type="dxa"/>
+      </w:tblCellMar>
+    </w:tblPr>
+  </w:style>
+  <w:style w:type="numbering" w:default="1" w:styleId="Aucuneliste">
+    <w:name w:val="No List"/>
+    <w:uiPriority w:val="99"/>
+    <w:semiHidden/>
+    <w:unhideWhenUsed/>
+  </w:style>
+  <w:style w:type="character" w:customStyle="1" w:styleId="Titre1Car">
     <w:name w:val="Titre 1 Car"/>
-    <w:basedOn w:val="DefaultParagraphFont"/>
+    <w:basedOn w:val="Policepardfaut"/>
+    <w:link w:val="Titre1"/>
     <w:uiPriority w:val="9"/>
     <w:qFormat/>
-    <w:rsid w:val="005253e4"/>
+    <w:rsid w:val="005253E4"/>
     <w:rPr>
-      <w:rFonts w:ascii="Times New Roman" w:hAnsi="Times New Roman" w:eastAsia="Times New Roman" w:cs="Times New Roman"/>
+      <w:rFonts w:ascii="Times New Roman" w:eastAsia="Times New Roman" w:hAnsi="Times New Roman" w:cs="Times New Roman"/>
       <w:caps/>
       <w:color w:val="2E74B5"/>
       <w:sz w:val="28"/>
       <w:lang w:eastAsia="fr-FR"/>
     </w:rPr>
   </w:style>
-  <w:style w:type="character" w:styleId="Titre2Car" w:customStyle="1">
+  <w:style w:type="character" w:customStyle="1" w:styleId="Titre2Car">
     <w:name w:val="Titre 2 Car"/>
-    <w:basedOn w:val="DefaultParagraphFont"/>
+    <w:basedOn w:val="Policepardfaut"/>
+    <w:link w:val="Titre2"/>
     <w:uiPriority w:val="9"/>
     <w:qFormat/>
-    <w:rsid w:val="005253e4"/>
+    <w:rsid w:val="005253E4"/>
     <w:rPr>
-      <w:rFonts w:ascii="Times New Roman" w:hAnsi="Times New Roman" w:eastAsia="Calibri" w:cs="Calibri"/>
+      <w:rFonts w:ascii="Times New Roman" w:eastAsia="Calibri" w:hAnsi="Times New Roman" w:cs="Calibri"/>
       <w:caps/>
       <w:color w:val="1F4D78"/>
       <w:sz w:val="24"/>
       <w:lang w:eastAsia="fr-FR"/>
     </w:rPr>
   </w:style>
-  <w:style w:type="character" w:styleId="Titre3Car" w:customStyle="1">
+  <w:style w:type="character" w:customStyle="1" w:styleId="Titre3Car">
     <w:name w:val="Titre 3 Car"/>
-    <w:basedOn w:val="DefaultParagraphFont"/>
+    <w:basedOn w:val="Policepardfaut"/>
+    <w:link w:val="Titre3"/>
     <w:uiPriority w:val="9"/>
     <w:qFormat/>
-    <w:rsid w:val="005253e4"/>
+    <w:rsid w:val="005253E4"/>
     <w:rPr>
-      <w:rFonts w:ascii="Times New Roman" w:hAnsi="Times New Roman" w:eastAsia="Calibri" w:cs="Calibri"/>
+      <w:rFonts w:ascii="Times New Roman" w:eastAsia="Calibri" w:hAnsi="Times New Roman" w:cs="Calibri"/>
       <w:color w:val="1F4D78"/>
       <w:sz w:val="24"/>
       <w:lang w:eastAsia="fr-FR"/>
     </w:rPr>
   </w:style>
-  <w:style w:type="character" w:styleId="Puces">
+  <w:style w:type="character" w:customStyle="1" w:styleId="Puces">
     <w:name w:val="Puces"/>
     <w:qFormat/>
     <w:rPr>
-      <w:rFonts w:ascii="OpenSymbol" w:hAnsi="OpenSymbol" w:eastAsia="OpenSymbol" w:cs="OpenSymbol"/>
+      <w:rFonts w:ascii="OpenSymbol" w:eastAsia="OpenSymbol" w:hAnsi="OpenSymbol" w:cs="OpenSymbol"/>
     </w:rPr>
   </w:style>
-  <w:style w:type="character" w:styleId="Caractresdenumrotation">
+  <w:style w:type="character" w:customStyle="1" w:styleId="Caractresdenumrotation">
     <w:name w:val="Caractères de numérotation"/>
     <w:qFormat/>
-    <w:rPr/>
   </w:style>
   <w:style w:type="paragraph" w:styleId="Titre">
-    <w:name w:val="Titre"/>
+    <w:name w:val="Title"/>
     <w:basedOn w:val="Normal"/>
-    <w:next w:val="BodyText"/>
+    <w:next w:val="Corpsdetexte"/>
     <w:qFormat/>
     <w:pPr>
-      <w:keepNext w:val="true"/>
+      <w:keepNext/>
       <w:spacing w:before="240" w:after="120"/>
     </w:pPr>
     <w:rPr>
-      <w:rFonts w:ascii="Liberation Sans" w:hAnsi="Liberation Sans" w:eastAsia="Noto Sans CJK SC" w:cs="FreeSans"/>
+      <w:rFonts w:ascii="Liberation Sans" w:eastAsia="Noto Sans CJK SC" w:hAnsi="Liberation Sans" w:cs="FreeSans"/>
       <w:sz w:val="28"/>
       <w:szCs w:val="28"/>
     </w:rPr>
   </w:style>
-  <w:style w:type="paragraph" w:styleId="BodyText">
+  <w:style w:type="paragraph" w:styleId="Corpsdetexte">
     <w:name w:val="Body Text"/>
     <w:basedOn w:val="Normal"/>
     <w:pPr>
-      <w:spacing w:lineRule="auto" w:line="276" w:before="0" w:after="140"/>
+      <w:spacing w:after="140" w:line="276" w:lineRule="auto"/>
     </w:pPr>
-    <w:rPr/>
   </w:style>
-  <w:style w:type="paragraph" w:styleId="List">
+  <w:style w:type="paragraph" w:styleId="Liste">
     <w:name w:val="List"/>
-    <w:basedOn w:val="BodyText"/>
-    <w:pPr/>
+    <w:basedOn w:val="Corpsdetexte"/>
     <w:rPr>
       <w:rFonts w:cs="FreeSans"/>
     </w:rPr>
   </w:style>
-  <w:style w:type="paragraph" w:styleId="Caption">
-    <w:name w:val="Caption"/>
+  <w:style w:type="paragraph" w:styleId="Lgende">
+    <w:name w:val="caption"/>
     <w:basedOn w:val="Normal"/>
     <w:qFormat/>
     <w:pPr>
@@ -2384,7 +2657,7 @@
       <w:szCs w:val="24"/>
     </w:rPr>
   </w:style>
-  <w:style w:type="paragraph" w:styleId="Index">
+  <w:style w:type="paragraph" w:customStyle="1" w:styleId="Index">
     <w:name w:val="Index"/>
     <w:basedOn w:val="Normal"/>
     <w:qFormat/>
@@ -2395,42 +2668,36 @@
       <w:rFonts w:cs="FreeSans"/>
     </w:rPr>
   </w:style>
-  <w:style w:type="paragraph" w:styleId="ListParagraph">
+  <w:style w:type="paragraph" w:styleId="Paragraphedeliste">
     <w:name w:val="List Paragraph"/>
     <w:basedOn w:val="Normal"/>
     <w:uiPriority w:val="34"/>
     <w:qFormat/>
-    <w:rsid w:val="001f045d"/>
+    <w:rsid w:val="001F045D"/>
     <w:pPr>
-      <w:spacing w:before="0" w:after="160"/>
       <w:ind w:left="720"/>
       <w:contextualSpacing/>
     </w:pPr>
-    <w:rPr/>
   </w:style>
-  <w:style w:type="paragraph" w:styleId="Contenudecadre">
+  <w:style w:type="paragraph" w:customStyle="1" w:styleId="Contenudecadre">
     <w:name w:val="Contenu de cadre"/>
     <w:basedOn w:val="Normal"/>
     <w:qFormat/>
-    <w:pPr/>
-    <w:rPr/>
   </w:style>
-  <w:style w:type="paragraph" w:styleId="Contenudetableau">
+  <w:style w:type="paragraph" w:customStyle="1" w:styleId="Contenudetableau">
     <w:name w:val="Contenu de tableau"/>
     <w:basedOn w:val="Normal"/>
     <w:qFormat/>
     <w:pPr>
-      <w:widowControl w:val="false"/>
+      <w:widowControl w:val="0"/>
       <w:suppressLineNumbers/>
     </w:pPr>
-    <w:rPr/>
   </w:style>
-  <w:style w:type="paragraph" w:styleId="Titredetableau">
+  <w:style w:type="paragraph" w:customStyle="1" w:styleId="Titredetableau">
     <w:name w:val="Titre de tableau"/>
     <w:basedOn w:val="Contenudetableau"/>
     <w:qFormat/>
     <w:pPr>
-      <w:suppressLineNumbers/>
       <w:jc w:val="center"/>
     </w:pPr>
     <w:rPr>
@@ -2438,65 +2705,43 @@
       <w:bCs/>
     </w:rPr>
   </w:style>
-  <w:style w:type="paragraph" w:styleId="En-tteetpieddepage">
+  <w:style w:type="paragraph" w:customStyle="1" w:styleId="En-tteetpieddepage">
     <w:name w:val="En-tête et pied de page"/>
     <w:basedOn w:val="Normal"/>
     <w:qFormat/>
     <w:pPr>
       <w:suppressLineNumbers/>
       <w:tabs>
-        <w:tab w:val="clear" w:pos="708"/>
-        <w:tab w:val="center" w:pos="5233" w:leader="none"/>
-        <w:tab w:val="right" w:pos="10466" w:leader="none"/>
+        <w:tab w:val="center" w:pos="5233"/>
+        <w:tab w:val="right" w:pos="10466"/>
       </w:tabs>
     </w:pPr>
-    <w:rPr/>
   </w:style>
-  <w:style w:type="paragraph" w:styleId="Footer">
-    <w:name w:val="Footer"/>
+  <w:style w:type="paragraph" w:styleId="Pieddepage">
+    <w:name w:val="footer"/>
     <w:basedOn w:val="En-tteetpieddepage"/>
-    <w:pPr>
-      <w:suppressLineNumbers/>
-    </w:pPr>
-    <w:rPr/>
   </w:style>
-  <w:style w:type="numbering" w:styleId="Pasdeliste" w:default="1">
+  <w:style w:type="numbering" w:customStyle="1" w:styleId="Pasdeliste">
     <w:name w:val="Pas de liste"/>
     <w:uiPriority w:val="99"/>
     <w:semiHidden/>
     <w:unhideWhenUsed/>
     <w:qFormat/>
   </w:style>
-  <w:style w:type="table" w:default="1" w:styleId="TableauNormal">
-    <w:name w:val="Normal Table"/>
-    <w:uiPriority w:val="99"/>
-    <w:semiHidden/>
-    <w:unhideWhenUsed/>
-    <w:tblPr>
-      <w:tblCellMar>
-        <w:top w:w="0" w:type="dxa"/>
-        <w:left w:w="108" w:type="dxa"/>
-        <w:bottom w:w="0" w:type="dxa"/>
-        <w:right w:w="108" w:type="dxa"/>
-      </w:tblCellMar>
-    </w:tblPr>
-  </w:style>
   <w:style w:type="table" w:styleId="Grilledutableau">
     <w:name w:val="Table Grid"/>
     <w:basedOn w:val="TableauNormal"/>
     <w:uiPriority w:val="39"/>
-    <w:rsid w:val="009402c3"/>
-    <w:pPr>
-      <w:spacing w:after="0" w:line="240" w:lineRule="auto"/>
-    </w:pPr>
+    <w:rsid w:val="009402C3"/>
     <w:tblPr>
+      <w:tblInd w:w="0" w:type="dxa"/>
       <w:tblBorders>
-        <w:top w:val="single" w:color="auto" w:sz="4" w:space="0"/>
-        <w:left w:val="single" w:color="auto" w:sz="4" w:space="0"/>
-        <w:bottom w:val="single" w:color="auto" w:sz="4" w:space="0"/>
-        <w:right w:val="single" w:color="auto" w:sz="4" w:space="0"/>
-        <w:insideH w:val="single" w:color="auto" w:sz="4" w:space="0"/>
-        <w:insideV w:val="single" w:color="auto" w:sz="4" w:space="0"/>
+        <w:top w:val="single" w:sz="4" w:space="0" w:color="auto"/>
+        <w:left w:val="single" w:sz="4" w:space="0" w:color="auto"/>
+        <w:bottom w:val="single" w:sz="4" w:space="0" w:color="auto"/>
+        <w:right w:val="single" w:sz="4" w:space="0" w:color="auto"/>
+        <w:insideH w:val="single" w:sz="4" w:space="0" w:color="auto"/>
+        <w:insideV w:val="single" w:sz="4" w:space="0" w:color="auto"/>
       </w:tblBorders>
       <w:tblCellMar>
         <w:top w:w="0" w:type="dxa"/>
@@ -2510,54 +2755,54 @@
 </file>
 
 <file path=word/theme/theme1.xml><?xml version="1.0" encoding="utf-8"?>
-<a:theme xmlns:a="http://schemas.openxmlformats.org/drawingml/2006/main" xmlns:r="http://schemas.openxmlformats.org/officeDocument/2006/relationships" name="Thème Office">
+<a:theme xmlns:a="http://schemas.openxmlformats.org/drawingml/2006/main" name="Thème Office">
   <a:themeElements>
     <a:clrScheme name="Office">
       <a:dk1>
         <a:srgbClr val="000000"/>
       </a:dk1>
       <a:lt1>
-        <a:srgbClr val="ffffff"/>
+        <a:srgbClr val="FFFFFF"/>
       </a:lt1>
       <a:dk2>
-        <a:srgbClr val="44546a"/>
+        <a:srgbClr val="44546A"/>
       </a:dk2>
       <a:lt2>
-        <a:srgbClr val="e7e6e6"/>
+        <a:srgbClr val="E7E6E6"/>
       </a:lt2>
       <a:accent1>
-        <a:srgbClr val="5b9bd5"/>
+        <a:srgbClr val="5B9BD5"/>
       </a:accent1>
       <a:accent2>
-        <a:srgbClr val="ed7d31"/>
+        <a:srgbClr val="ED7D31"/>
       </a:accent2>
       <a:accent3>
-        <a:srgbClr val="a5a5a5"/>
+        <a:srgbClr val="A5A5A5"/>
       </a:accent3>
       <a:accent4>
-        <a:srgbClr val="ffc000"/>
+        <a:srgbClr val="FFC000"/>
       </a:accent4>
       <a:accent5>
-        <a:srgbClr val="4472c4"/>
+        <a:srgbClr val="4472C4"/>
       </a:accent5>
       <a:accent6>
-        <a:srgbClr val="70ad47"/>
+        <a:srgbClr val="70AD47"/>
       </a:accent6>
       <a:hlink>
-        <a:srgbClr val="0563c1"/>
+        <a:srgbClr val="0563C1"/>
       </a:hlink>
       <a:folHlink>
-        <a:srgbClr val="954f72"/>
+        <a:srgbClr val="954F72"/>
       </a:folHlink>
     </a:clrScheme>
     <a:fontScheme name="Office">
       <a:majorFont>
-        <a:latin typeface="Calibri Light" panose="020F0302020204030204" pitchFamily="0" charset="1"/>
+        <a:latin typeface="Calibri Light" panose="020F0302020204030204"/>
         <a:ea typeface=""/>
         <a:cs typeface=""/>
       </a:majorFont>
       <a:minorFont>
-        <a:latin typeface="Calibri" panose="020F0502020204030204" pitchFamily="0" charset="1"/>
+        <a:latin typeface="Calibri" panose="020F0502020204030204"/>
         <a:ea typeface=""/>
         <a:cs typeface=""/>
       </a:minorFont>
@@ -2589,7 +2834,7 @@
             </a:gs>
           </a:gsLst>
           <a:lin ang="5400000" scaled="0"/>
-          <a:tileRect l="0" t="0" r="0" b="0"/>
+          <a:tileRect/>
         </a:gradFill>
         <a:gradFill>
           <a:gsLst>
@@ -2613,7 +2858,7 @@
             </a:gs>
           </a:gsLst>
           <a:lin ang="5400000" scaled="0"/>
-          <a:tileRect l="0" t="0" r="0" b="0"/>
+          <a:tileRect/>
         </a:gradFill>
       </a:fillStyleLst>
       <a:lnStyleLst>
@@ -2673,10 +2918,12 @@
             </a:gs>
           </a:gsLst>
           <a:lin ang="5400000" scaled="0"/>
-          <a:tileRect l="0" t="0" r="0" b="0"/>
+          <a:tileRect/>
         </a:gradFill>
       </a:bgFillStyleLst>
     </a:fmtScheme>
   </a:themeElements>
+  <a:objectDefaults/>
+  <a:extraClrSchemeLst/>
 </a:theme>
 </file>
</xml_diff>

<commit_message>
refactor: améliorer la documentation et la structure des services de génération de documents
</commit_message>
<xml_diff>
--- a/documents_templates/seating-presence.docx
+++ b/documents_templates/seating-presence.docx
@@ -5,7 +5,7 @@
     <w:p>
       <w:pPr>
         <w:rPr>
-          <w:rFonts w:ascii="Times New Roman" w:hAnsi="Times New Roman"/>
+          <w:rFonts w:ascii="Times New Roman" w:hAnsi="Times New Roman" w:cs="Times New Roman"/>
           <w:lang w:val="en-US"/>
         </w:rPr>
       </w:pPr>
@@ -23,11 +23,12 @@
         <w:spacing w:after="0"/>
         <w:jc w:val="center"/>
         <w:rPr>
-          <w:rFonts w:ascii="Times New Roman" w:hAnsi="Times New Roman"/>
-        </w:rPr>
-      </w:pPr>
-      <w:r>
-        <w:rPr>
+          <w:rFonts w:ascii="Times New Roman" w:hAnsi="Times New Roman" w:cs="Times New Roman"/>
+        </w:rPr>
+      </w:pPr>
+      <w:r>
+        <w:rPr>
+          <w:rFonts w:ascii="Times New Roman" w:hAnsi="Times New Roman" w:cs="Times New Roman"/>
           <w:noProof/>
           <w:lang w:eastAsia="fr-FR"/>
         </w:rPr>
@@ -79,6 +80,7 @@
       </w:r>
       <w:r>
         <w:rPr>
+          <w:rFonts w:ascii="Times New Roman" w:hAnsi="Times New Roman" w:cs="Times New Roman"/>
           <w:noProof/>
           <w:lang w:eastAsia="fr-FR"/>
         </w:rPr>
@@ -205,7 +207,7 @@
         <w:spacing w:after="0"/>
         <w:jc w:val="center"/>
         <w:rPr>
-          <w:rFonts w:ascii="Times New Roman" w:hAnsi="Times New Roman"/>
+          <w:rFonts w:ascii="Times New Roman" w:hAnsi="Times New Roman" w:cs="Times New Roman"/>
         </w:rPr>
       </w:pPr>
       <w:r>
@@ -222,7 +224,7 @@
         <w:spacing w:before="57" w:after="57"/>
         <w:jc w:val="center"/>
         <w:rPr>
-          <w:rFonts w:ascii="Times New Roman" w:hAnsi="Times New Roman"/>
+          <w:rFonts w:ascii="Times New Roman" w:hAnsi="Times New Roman" w:cs="Times New Roman"/>
           <w:lang w:val="en-US"/>
         </w:rPr>
       </w:pPr>
@@ -268,7 +270,7 @@
         <w:spacing w:after="0"/>
         <w:jc w:val="center"/>
         <w:rPr>
-          <w:rFonts w:ascii="Times New Roman" w:hAnsi="Times New Roman"/>
+          <w:rFonts w:ascii="Times New Roman" w:hAnsi="Times New Roman" w:cs="Times New Roman"/>
           <w:lang w:val="en-US"/>
         </w:rPr>
       </w:pPr>
@@ -351,7 +353,7 @@
         <w:spacing w:before="57" w:after="217"/>
         <w:jc w:val="center"/>
         <w:rPr>
-          <w:rFonts w:ascii="Times New Roman" w:hAnsi="Times New Roman"/>
+          <w:rFonts w:ascii="Times New Roman" w:hAnsi="Times New Roman" w:cs="Times New Roman"/>
         </w:rPr>
       </w:pPr>
       <w:r>
@@ -360,23 +362,7 @@
           <w:sz w:val="20"/>
           <w:szCs w:val="20"/>
         </w:rPr>
-        <w:t xml:space="preserve">FICHE DE PRÉSENCE </w:t>
-      </w:r>
-      <w:r>
-        <w:rPr>
-          <w:rFonts w:ascii="Times New Roman" w:hAnsi="Times New Roman" w:cs="Times New Roman"/>
-          <w:sz w:val="20"/>
-          <w:szCs w:val="20"/>
-        </w:rPr>
-        <w:t xml:space="preserve">| </w:t>
-      </w:r>
-      <w:r>
-        <w:rPr>
-          <w:rFonts w:ascii="Times New Roman" w:hAnsi="Times New Roman" w:cs="Times New Roman"/>
-          <w:sz w:val="20"/>
-          <w:szCs w:val="20"/>
-        </w:rPr>
-        <w:t xml:space="preserve"> </w:t>
+        <w:t xml:space="preserve">FICHE DE PRÉSENCE |  </w:t>
       </w:r>
       <w:r>
         <w:rPr>
@@ -393,29 +379,21 @@
           <w:sz w:val="20"/>
           <w:szCs w:val="20"/>
         </w:rPr>
-        <w:t xml:space="preserve"> </w:t>
-      </w:r>
-      <w:r>
-        <w:rPr>
-          <w:rFonts w:ascii="Times New Roman" w:hAnsi="Times New Roman" w:cs="Times New Roman"/>
-          <w:sz w:val="20"/>
-          <w:szCs w:val="20"/>
-        </w:rPr>
-        <w:t>| +++toUpperCase(school.studyYear.yearName)+++</w:t>
+        <w:t xml:space="preserve"> | +++toUpperCase(school.studyYear.yearName)+++</w:t>
       </w:r>
     </w:p>
     <w:p>
       <w:pPr>
         <w:spacing w:after="0"/>
         <w:rPr>
-          <w:rFonts w:ascii="Times New Roman" w:hAnsi="Times New Roman"/>
+          <w:rFonts w:ascii="Times New Roman" w:hAnsi="Times New Roman" w:cs="Times New Roman"/>
           <w:sz w:val="14"/>
           <w:szCs w:val="14"/>
         </w:rPr>
       </w:pPr>
       <w:r>
         <w:rPr>
-          <w:rFonts w:ascii="Times New Roman" w:hAnsi="Times New Roman"/>
+          <w:rFonts w:ascii="Times New Roman" w:hAnsi="Times New Roman" w:cs="Times New Roman"/>
           <w:b/>
           <w:bCs/>
           <w:sz w:val="14"/>
@@ -432,14 +410,14 @@
         </w:numPr>
         <w:spacing w:after="0"/>
         <w:rPr>
-          <w:rFonts w:ascii="Times New Roman" w:hAnsi="Times New Roman"/>
+          <w:rFonts w:ascii="Times New Roman" w:hAnsi="Times New Roman" w:cs="Times New Roman"/>
           <w:sz w:val="14"/>
           <w:szCs w:val="14"/>
         </w:rPr>
       </w:pPr>
       <w:r>
         <w:rPr>
-          <w:rFonts w:ascii="Times New Roman" w:hAnsi="Times New Roman"/>
+          <w:rFonts w:ascii="Times New Roman" w:hAnsi="Times New Roman" w:cs="Times New Roman"/>
           <w:sz w:val="14"/>
           <w:szCs w:val="14"/>
         </w:rPr>
@@ -447,7 +425,7 @@
       </w:r>
       <w:r>
         <w:rPr>
-          <w:rFonts w:ascii="Times New Roman" w:hAnsi="Times New Roman"/>
+          <w:rFonts w:ascii="Times New Roman" w:hAnsi="Times New Roman" w:cs="Times New Roman"/>
           <w:b/>
           <w:bCs/>
           <w:i/>
@@ -459,7 +437,7 @@
       </w:r>
       <w:r>
         <w:rPr>
-          <w:rFonts w:ascii="Times New Roman" w:hAnsi="Times New Roman"/>
+          <w:rFonts w:ascii="Times New Roman" w:hAnsi="Times New Roman" w:cs="Times New Roman"/>
           <w:i/>
           <w:iCs/>
           <w:sz w:val="14"/>
@@ -476,14 +454,14 @@
         </w:numPr>
         <w:spacing w:after="0"/>
         <w:rPr>
-          <w:rFonts w:ascii="Times New Roman" w:hAnsi="Times New Roman"/>
+          <w:rFonts w:ascii="Times New Roman" w:hAnsi="Times New Roman" w:cs="Times New Roman"/>
           <w:sz w:val="14"/>
           <w:szCs w:val="14"/>
         </w:rPr>
       </w:pPr>
       <w:r>
         <w:rPr>
-          <w:rFonts w:ascii="Times New Roman" w:hAnsi="Times New Roman"/>
+          <w:rFonts w:ascii="Times New Roman" w:hAnsi="Times New Roman" w:cs="Times New Roman"/>
           <w:i/>
           <w:iCs/>
           <w:sz w:val="14"/>
@@ -493,7 +471,7 @@
       </w:r>
       <w:r>
         <w:rPr>
-          <w:rFonts w:ascii="Times New Roman" w:hAnsi="Times New Roman"/>
+          <w:rFonts w:ascii="Times New Roman" w:hAnsi="Times New Roman" w:cs="Times New Roman"/>
           <w:b/>
           <w:bCs/>
           <w:i/>
@@ -505,7 +483,7 @@
       </w:r>
       <w:r>
         <w:rPr>
-          <w:rFonts w:ascii="Times New Roman" w:hAnsi="Times New Roman"/>
+          <w:rFonts w:ascii="Times New Roman" w:hAnsi="Times New Roman" w:cs="Times New Roman"/>
           <w:i/>
           <w:iCs/>
           <w:sz w:val="14"/>
@@ -522,45 +500,41 @@
         </w:numPr>
         <w:spacing w:after="0"/>
         <w:rPr>
-          <w:rFonts w:ascii="Times New Roman" w:hAnsi="Times New Roman"/>
+          <w:rFonts w:ascii="Times New Roman" w:hAnsi="Times New Roman" w:cs="Times New Roman"/>
           <w:sz w:val="14"/>
           <w:szCs w:val="14"/>
         </w:rPr>
       </w:pPr>
       <w:r>
         <w:rPr>
-          <w:rFonts w:ascii="Times New Roman" w:hAnsi="Times New Roman"/>
+          <w:rFonts w:ascii="Times New Roman" w:hAnsi="Times New Roman" w:cs="Times New Roman"/>
           <w:i/>
           <w:iCs/>
           <w:sz w:val="14"/>
           <w:szCs w:val="14"/>
         </w:rPr>
-        <w:t xml:space="preserve">    La croix </w:t>
-      </w:r>
-      <w:r>
-        <w:rPr>
-          <w:rFonts w:ascii="Times New Roman" w:hAnsi="Times New Roman"/>
-          <w:i/>
-          <w:iCs/>
-          <w:sz w:val="14"/>
-          <w:szCs w:val="14"/>
-        </w:rPr>
-        <w:t>atteste de la présence de l'élève et de la remise effective de sa copie.</w:t>
+        <w:t xml:space="preserve">    La croix atteste de la présence de l'élève et de la remise effective de sa copie.</w:t>
       </w:r>
     </w:p>
     <w:p>
       <w:pPr>
         <w:spacing w:after="0"/>
         <w:rPr>
-          <w:rFonts w:ascii="Times New Roman" w:hAnsi="Times New Roman"/>
+          <w:rFonts w:ascii="Times New Roman" w:hAnsi="Times New Roman" w:cs="Times New Roman"/>
         </w:rPr>
       </w:pPr>
     </w:p>
     <w:tbl>
       <w:tblPr>
         <w:tblW w:w="5000" w:type="pct"/>
-        <w:tblInd w:w="55" w:type="dxa"/>
-        <w:tblLayout w:type="fixed"/>
+        <w:tblBorders>
+          <w:top w:val="single" w:sz="4" w:space="0" w:color="auto"/>
+          <w:left w:val="single" w:sz="4" w:space="0" w:color="auto"/>
+          <w:bottom w:val="single" w:sz="4" w:space="0" w:color="auto"/>
+          <w:right w:val="single" w:sz="4" w:space="0" w:color="auto"/>
+          <w:insideH w:val="single" w:sz="4" w:space="0" w:color="auto"/>
+          <w:insideV w:val="single" w:sz="4" w:space="0" w:color="auto"/>
+        </w:tblBorders>
         <w:tblCellMar>
           <w:top w:w="55" w:type="dxa"/>
           <w:left w:w="55" w:type="dxa"/>
@@ -570,32 +544,46 @@
         <w:tblLook w:val="04A0" w:firstRow="1" w:lastRow="0" w:firstColumn="1" w:lastColumn="0" w:noHBand="0" w:noVBand="1"/>
       </w:tblPr>
       <w:tblGrid>
-        <w:gridCol w:w="459"/>
-        <w:gridCol w:w="3436"/>
-        <w:gridCol w:w="2448"/>
-        <w:gridCol w:w="459"/>
-        <w:gridCol w:w="3774"/>
+        <w:gridCol w:w="565"/>
+        <w:gridCol w:w="4554"/>
+        <w:gridCol w:w="3571"/>
+        <w:gridCol w:w="800"/>
+        <w:gridCol w:w="323"/>
+        <w:gridCol w:w="763"/>
       </w:tblGrid>
       <w:tr>
         <w:trPr>
+          <w:cantSplit/>
           <w:trHeight w:val="1304"/>
         </w:trPr>
         <w:tc>
           <w:tcPr>
-            <w:tcW w:w="454" w:type="dxa"/>
+            <w:tcW w:w="412" w:type="pct"/>
+            <w:tcBorders>
+              <w:top w:val="nil"/>
+              <w:left w:val="nil"/>
+              <w:bottom w:val="single" w:sz="4" w:space="0" w:color="auto"/>
+              <w:right w:val="nil"/>
+            </w:tcBorders>
           </w:tcPr>
           <w:p>
             <w:pPr>
               <w:pStyle w:val="Contenudetableau"/>
               <w:rPr>
-                <w:rFonts w:ascii="Times New Roman" w:hAnsi="Times New Roman"/>
+                <w:rFonts w:ascii="Times New Roman" w:hAnsi="Times New Roman" w:cs="Times New Roman"/>
               </w:rPr>
             </w:pPr>
           </w:p>
         </w:tc>
         <w:tc>
           <w:tcPr>
-            <w:tcW w:w="3400" w:type="dxa"/>
+            <w:tcW w:w="2327" w:type="pct"/>
+            <w:tcBorders>
+              <w:top w:val="nil"/>
+              <w:left w:val="nil"/>
+              <w:bottom w:val="single" w:sz="4" w:space="0" w:color="auto"/>
+              <w:right w:val="single" w:sz="4" w:space="0" w:color="auto"/>
+            </w:tcBorders>
             <w:textDirection w:val="btLr"/>
             <w:vAlign w:val="bottom"/>
           </w:tcPr>
@@ -604,28 +592,49 @@
               <w:pStyle w:val="Contenudetableau"/>
               <w:jc w:val="center"/>
               <w:rPr>
-                <w:rFonts w:ascii="Times New Roman" w:hAnsi="Times New Roman"/>
+                <w:rFonts w:ascii="Times New Roman" w:hAnsi="Times New Roman" w:cs="Times New Roman"/>
                 <w:sz w:val="18"/>
                 <w:szCs w:val="18"/>
               </w:rPr>
             </w:pPr>
-            <w:r>
-              <w:rPr>
-                <w:rFonts w:ascii="Times New Roman" w:hAnsi="Times New Roman"/>
-                <w:sz w:val="18"/>
-                <w:szCs w:val="18"/>
-              </w:rPr>
-              <w:t>Date</w:t>
-            </w:r>
           </w:p>
         </w:tc>
         <w:tc>
           <w:tcPr>
-            <w:tcW w:w="2423" w:type="dxa"/>
+            <w:tcW w:w="924" w:type="pct"/>
             <w:tcBorders>
-              <w:top w:val="single" w:sz="4" w:space="0" w:color="000000"/>
-              <w:left w:val="single" w:sz="4" w:space="0" w:color="000000"/>
-              <w:bottom w:val="single" w:sz="4" w:space="0" w:color="000000"/>
+              <w:left w:val="single" w:sz="4" w:space="0" w:color="auto"/>
+              <w:bottom w:val="single" w:sz="4" w:space="0" w:color="auto"/>
+            </w:tcBorders>
+            <w:textDirection w:val="btLr"/>
+            <w:vAlign w:val="bottom"/>
+          </w:tcPr>
+          <w:p>
+            <w:pPr>
+              <w:spacing w:after="0" w:line="240" w:lineRule="auto"/>
+              <w:ind w:left="113" w:right="113"/>
+              <w:jc w:val="center"/>
+              <w:rPr>
+                <w:rFonts w:ascii="Times New Roman" w:eastAsia="Calibri" w:hAnsi="Times New Roman" w:cs="Times New Roman"/>
+                <w:sz w:val="18"/>
+                <w:szCs w:val="18"/>
+              </w:rPr>
+            </w:pPr>
+            <w:r>
+              <w:rPr>
+                <w:rFonts w:ascii="Times New Roman" w:hAnsi="Times New Roman" w:cs="Times New Roman"/>
+                <w:sz w:val="18"/>
+                <w:szCs w:val="18"/>
+              </w:rPr>
+              <w:t>Date</w:t>
+            </w:r>
+          </w:p>
+        </w:tc>
+        <w:tc>
+          <w:tcPr>
+            <w:tcW w:w="544" w:type="pct"/>
+            <w:tcBorders>
+              <w:bottom w:val="single" w:sz="4" w:space="0" w:color="auto"/>
             </w:tcBorders>
           </w:tcPr>
           <w:p>
@@ -633,7 +642,7 @@
               <w:spacing w:after="0" w:line="240" w:lineRule="auto"/>
               <w:jc w:val="center"/>
               <w:rPr>
-                <w:rFonts w:ascii="Times New Roman" w:hAnsi="Times New Roman"/>
+                <w:rFonts w:ascii="Times New Roman" w:hAnsi="Times New Roman" w:cs="Times New Roman"/>
               </w:rPr>
             </w:pPr>
             <w:r>
@@ -684,11 +693,9 @@
         </w:tc>
         <w:tc>
           <w:tcPr>
-            <w:tcW w:w="454" w:type="dxa"/>
+            <w:tcW w:w="236" w:type="pct"/>
             <w:tcBorders>
-              <w:top w:val="single" w:sz="4" w:space="0" w:color="000000"/>
-              <w:left w:val="single" w:sz="4" w:space="0" w:color="000000"/>
-              <w:bottom w:val="single" w:sz="4" w:space="0" w:color="000000"/>
+              <w:bottom w:val="single" w:sz="4" w:space="0" w:color="auto"/>
             </w:tcBorders>
             <w:textDirection w:val="btLr"/>
             <w:vAlign w:val="center"/>
@@ -698,37 +705,40 @@
               <w:spacing w:after="0" w:line="240" w:lineRule="auto"/>
               <w:jc w:val="center"/>
               <w:rPr>
-                <w:rFonts w:ascii="Times New Roman" w:hAnsi="Times New Roman"/>
+                <w:rFonts w:ascii="Times New Roman" w:hAnsi="Times New Roman" w:cs="Times New Roman"/>
               </w:rPr>
             </w:pPr>
-            <w:proofErr w:type="gramStart"/>
             <w:r>
               <w:rPr>
                 <w:rFonts w:ascii="Times New Roman" w:eastAsia="Calibri" w:hAnsi="Times New Roman" w:cs="Times New Roman"/>
                 <w:sz w:val="18"/>
                 <w:szCs w:val="18"/>
               </w:rPr>
-              <w:t>…./</w:t>
-            </w:r>
-            <w:proofErr w:type="gramEnd"/>
+              <w:t>…. /</w:t>
+            </w:r>
             <w:r>
               <w:rPr>
                 <w:rFonts w:ascii="Times New Roman" w:eastAsia="Calibri" w:hAnsi="Times New Roman" w:cs="Times New Roman"/>
                 <w:sz w:val="18"/>
                 <w:szCs w:val="18"/>
               </w:rPr>
-              <w:t>…../ 202...</w:t>
+              <w:t>…../ 20</w:t>
+            </w:r>
+            <w:r>
+              <w:rPr>
+                <w:rFonts w:ascii="Times New Roman" w:eastAsia="Calibri" w:hAnsi="Times New Roman" w:cs="Times New Roman"/>
+                <w:sz w:val="18"/>
+                <w:szCs w:val="18"/>
+              </w:rPr>
+              <w:t>...</w:t>
             </w:r>
           </w:p>
         </w:tc>
         <w:tc>
           <w:tcPr>
-            <w:tcW w:w="3735" w:type="dxa"/>
+            <w:tcW w:w="556" w:type="pct"/>
             <w:tcBorders>
-              <w:top w:val="single" w:sz="4" w:space="0" w:color="000000"/>
-              <w:left w:val="single" w:sz="4" w:space="0" w:color="000000"/>
-              <w:bottom w:val="single" w:sz="4" w:space="0" w:color="000000"/>
-              <w:right w:val="single" w:sz="4" w:space="0" w:color="000000"/>
+              <w:bottom w:val="single" w:sz="4" w:space="0" w:color="auto"/>
             </w:tcBorders>
           </w:tcPr>
           <w:p>
@@ -736,7 +746,7 @@
               <w:spacing w:after="0" w:line="240" w:lineRule="auto"/>
               <w:jc w:val="center"/>
               <w:rPr>
-                <w:rFonts w:ascii="Times New Roman" w:hAnsi="Times New Roman"/>
+                <w:rFonts w:ascii="Times New Roman" w:hAnsi="Times New Roman" w:cs="Times New Roman"/>
                 <w:sz w:val="16"/>
                 <w:szCs w:val="16"/>
               </w:rPr>
@@ -773,11 +783,9 @@
       <w:tr>
         <w:tc>
           <w:tcPr>
-            <w:tcW w:w="454" w:type="dxa"/>
+            <w:tcW w:w="412" w:type="pct"/>
             <w:tcBorders>
-              <w:top w:val="single" w:sz="4" w:space="0" w:color="000000"/>
-              <w:left w:val="single" w:sz="4" w:space="0" w:color="000000"/>
-              <w:bottom w:val="single" w:sz="4" w:space="0" w:color="000000"/>
+              <w:top w:val="single" w:sz="4" w:space="0" w:color="auto"/>
             </w:tcBorders>
             <w:vAlign w:val="center"/>
           </w:tcPr>
@@ -786,7 +794,7 @@
               <w:spacing w:after="0" w:line="240" w:lineRule="auto"/>
               <w:jc w:val="center"/>
               <w:rPr>
-                <w:rFonts w:ascii="Times New Roman" w:hAnsi="Times New Roman"/>
+                <w:rFonts w:ascii="Times New Roman" w:hAnsi="Times New Roman" w:cs="Times New Roman"/>
               </w:rPr>
             </w:pPr>
             <w:r>
@@ -799,7 +807,7 @@
             </w:r>
             <w:r>
               <w:rPr>
-                <w:rFonts w:ascii="Times New Roman" w:eastAsia="DejaVu Sans" w:hAnsi="Times New Roman" w:cs="DejaVu Sans"/>
+                <w:rFonts w:ascii="Cambria Math" w:eastAsia="DejaVu Sans" w:hAnsi="Cambria Math" w:cs="Cambria Math"/>
                 <w:sz w:val="18"/>
                 <w:szCs w:val="18"/>
               </w:rPr>
@@ -809,11 +817,9 @@
         </w:tc>
         <w:tc>
           <w:tcPr>
-            <w:tcW w:w="3400" w:type="dxa"/>
+            <w:tcW w:w="2327" w:type="pct"/>
             <w:tcBorders>
-              <w:top w:val="single" w:sz="4" w:space="0" w:color="000000"/>
-              <w:left w:val="single" w:sz="4" w:space="0" w:color="000000"/>
-              <w:bottom w:val="single" w:sz="4" w:space="0" w:color="000000"/>
+              <w:top w:val="single" w:sz="4" w:space="0" w:color="auto"/>
             </w:tcBorders>
             <w:vAlign w:val="center"/>
           </w:tcPr>
@@ -823,7 +829,7 @@
               <w:ind w:left="113"/>
               <w:jc w:val="center"/>
               <w:rPr>
-                <w:rFonts w:ascii="Times New Roman" w:hAnsi="Times New Roman"/>
+                <w:rFonts w:ascii="Times New Roman" w:hAnsi="Times New Roman" w:cs="Times New Roman"/>
               </w:rPr>
             </w:pPr>
             <w:r>
@@ -838,10 +844,9 @@
         </w:tc>
         <w:tc>
           <w:tcPr>
-            <w:tcW w:w="2423" w:type="dxa"/>
+            <w:tcW w:w="924" w:type="pct"/>
             <w:tcBorders>
-              <w:left w:val="single" w:sz="4" w:space="0" w:color="000000"/>
-              <w:bottom w:val="single" w:sz="4" w:space="0" w:color="000000"/>
+              <w:top w:val="single" w:sz="4" w:space="0" w:color="auto"/>
             </w:tcBorders>
             <w:vAlign w:val="center"/>
           </w:tcPr>
@@ -850,7 +855,7 @@
               <w:spacing w:after="0" w:line="240" w:lineRule="auto"/>
               <w:jc w:val="center"/>
               <w:rPr>
-                <w:rFonts w:ascii="Times New Roman" w:hAnsi="Times New Roman"/>
+                <w:rFonts w:ascii="Times New Roman" w:eastAsia="Calibri" w:hAnsi="Times New Roman" w:cs="Times New Roman"/>
                 <w:sz w:val="16"/>
                 <w:szCs w:val="16"/>
               </w:rPr>
@@ -861,52 +866,15 @@
                 <w:sz w:val="16"/>
                 <w:szCs w:val="16"/>
               </w:rPr>
-              <w:t xml:space="preserve">+++ FOR </w:t>
-            </w:r>
-            <w:proofErr w:type="spellStart"/>
-            <w:r>
-              <w:rPr>
-                <w:rFonts w:ascii="Times New Roman" w:eastAsia="Calibri" w:hAnsi="Times New Roman" w:cs="Times New Roman"/>
-                <w:sz w:val="16"/>
-                <w:szCs w:val="16"/>
-              </w:rPr>
-              <w:t>day</w:t>
-            </w:r>
-            <w:proofErr w:type="spellEnd"/>
-            <w:r>
-              <w:rPr>
-                <w:rFonts w:ascii="Times New Roman" w:eastAsia="Calibri" w:hAnsi="Times New Roman" w:cs="Times New Roman"/>
-                <w:sz w:val="16"/>
-                <w:szCs w:val="16"/>
-              </w:rPr>
-              <w:t xml:space="preserve"> in </w:t>
-            </w:r>
-            <w:proofErr w:type="spellStart"/>
-            <w:r>
-              <w:rPr>
-                <w:rFonts w:ascii="Times New Roman" w:eastAsia="Calibri" w:hAnsi="Times New Roman" w:cs="Times New Roman"/>
-                <w:sz w:val="16"/>
-                <w:szCs w:val="16"/>
-              </w:rPr>
-              <w:t>days</w:t>
-            </w:r>
-            <w:proofErr w:type="spellEnd"/>
-            <w:r>
-              <w:rPr>
-                <w:rFonts w:ascii="Times New Roman" w:eastAsia="Calibri" w:hAnsi="Times New Roman" w:cs="Times New Roman"/>
-                <w:sz w:val="16"/>
-                <w:szCs w:val="16"/>
-              </w:rPr>
-              <w:t>+++</w:t>
+              <w:t>CLASSE</w:t>
             </w:r>
           </w:p>
         </w:tc>
         <w:tc>
           <w:tcPr>
-            <w:tcW w:w="454" w:type="dxa"/>
+            <w:tcW w:w="544" w:type="pct"/>
             <w:tcBorders>
-              <w:left w:val="single" w:sz="4" w:space="0" w:color="000000"/>
-              <w:bottom w:val="single" w:sz="4" w:space="0" w:color="000000"/>
+              <w:top w:val="single" w:sz="4" w:space="0" w:color="auto"/>
             </w:tcBorders>
             <w:vAlign w:val="center"/>
           </w:tcPr>
@@ -915,20 +883,62 @@
               <w:spacing w:after="0" w:line="240" w:lineRule="auto"/>
               <w:jc w:val="center"/>
               <w:rPr>
-                <w:rFonts w:ascii="Times New Roman" w:eastAsia="Calibri" w:hAnsi="Times New Roman" w:cs="Times New Roman"/>
+                <w:rFonts w:ascii="Times New Roman" w:hAnsi="Times New Roman" w:cs="Times New Roman"/>
                 <w:sz w:val="16"/>
                 <w:szCs w:val="16"/>
               </w:rPr>
             </w:pPr>
+            <w:r>
+              <w:rPr>
+                <w:rFonts w:ascii="Times New Roman" w:eastAsia="Calibri" w:hAnsi="Times New Roman" w:cs="Times New Roman"/>
+                <w:sz w:val="16"/>
+                <w:szCs w:val="16"/>
+              </w:rPr>
+              <w:t xml:space="preserve">+++ FOR </w:t>
+            </w:r>
+            <w:proofErr w:type="spellStart"/>
+            <w:r>
+              <w:rPr>
+                <w:rFonts w:ascii="Times New Roman" w:eastAsia="Calibri" w:hAnsi="Times New Roman" w:cs="Times New Roman"/>
+                <w:sz w:val="16"/>
+                <w:szCs w:val="16"/>
+              </w:rPr>
+              <w:t>day</w:t>
+            </w:r>
+            <w:proofErr w:type="spellEnd"/>
+            <w:r>
+              <w:rPr>
+                <w:rFonts w:ascii="Times New Roman" w:eastAsia="Calibri" w:hAnsi="Times New Roman" w:cs="Times New Roman"/>
+                <w:sz w:val="16"/>
+                <w:szCs w:val="16"/>
+              </w:rPr>
+              <w:t xml:space="preserve"> in </w:t>
+            </w:r>
+            <w:proofErr w:type="spellStart"/>
+            <w:r>
+              <w:rPr>
+                <w:rFonts w:ascii="Times New Roman" w:eastAsia="Calibri" w:hAnsi="Times New Roman" w:cs="Times New Roman"/>
+                <w:sz w:val="16"/>
+                <w:szCs w:val="16"/>
+              </w:rPr>
+              <w:t>days</w:t>
+            </w:r>
+            <w:proofErr w:type="spellEnd"/>
+            <w:r>
+              <w:rPr>
+                <w:rFonts w:ascii="Times New Roman" w:eastAsia="Calibri" w:hAnsi="Times New Roman" w:cs="Times New Roman"/>
+                <w:sz w:val="16"/>
+                <w:szCs w:val="16"/>
+              </w:rPr>
+              <w:t>+++</w:t>
+            </w:r>
           </w:p>
         </w:tc>
         <w:tc>
           <w:tcPr>
-            <w:tcW w:w="3735" w:type="dxa"/>
+            <w:tcW w:w="236" w:type="pct"/>
             <w:tcBorders>
-              <w:left w:val="single" w:sz="4" w:space="0" w:color="000000"/>
-              <w:bottom w:val="single" w:sz="4" w:space="0" w:color="000000"/>
-              <w:right w:val="single" w:sz="4" w:space="0" w:color="000000"/>
+              <w:top w:val="single" w:sz="4" w:space="0" w:color="auto"/>
             </w:tcBorders>
             <w:vAlign w:val="center"/>
           </w:tcPr>
@@ -937,47 +947,20 @@
               <w:spacing w:after="0" w:line="240" w:lineRule="auto"/>
               <w:jc w:val="center"/>
               <w:rPr>
-                <w:rFonts w:ascii="Times New Roman" w:hAnsi="Times New Roman"/>
+                <w:rFonts w:ascii="Times New Roman" w:eastAsia="Calibri" w:hAnsi="Times New Roman" w:cs="Times New Roman"/>
                 <w:sz w:val="16"/>
                 <w:szCs w:val="16"/>
               </w:rPr>
             </w:pPr>
-            <w:r>
-              <w:rPr>
-                <w:rFonts w:ascii="Times New Roman" w:eastAsia="Calibri" w:hAnsi="Times New Roman" w:cs="Times New Roman"/>
-                <w:sz w:val="16"/>
-                <w:szCs w:val="16"/>
-              </w:rPr>
-              <w:t xml:space="preserve">+++END-FOR </w:t>
-            </w:r>
-            <w:proofErr w:type="spellStart"/>
-            <w:r>
-              <w:rPr>
-                <w:rFonts w:ascii="Times New Roman" w:eastAsia="Calibri" w:hAnsi="Times New Roman" w:cs="Times New Roman"/>
-                <w:sz w:val="16"/>
-                <w:szCs w:val="16"/>
-              </w:rPr>
-              <w:t>day</w:t>
-            </w:r>
-            <w:proofErr w:type="spellEnd"/>
-            <w:r>
-              <w:rPr>
-                <w:rFonts w:ascii="Times New Roman" w:eastAsia="Calibri" w:hAnsi="Times New Roman" w:cs="Times New Roman"/>
-                <w:sz w:val="16"/>
-                <w:szCs w:val="16"/>
-              </w:rPr>
-              <w:t>+++</w:t>
-            </w:r>
+            <w:bookmarkStart w:id="0" w:name="_GoBack"/>
+            <w:bookmarkEnd w:id="0"/>
           </w:p>
         </w:tc>
-      </w:tr>
-      <w:tr>
         <w:tc>
           <w:tcPr>
-            <w:tcW w:w="454" w:type="dxa"/>
+            <w:tcW w:w="556" w:type="pct"/>
             <w:tcBorders>
-              <w:left w:val="single" w:sz="4" w:space="0" w:color="000000"/>
-              <w:bottom w:val="single" w:sz="4" w:space="0" w:color="000000"/>
+              <w:top w:val="single" w:sz="4" w:space="0" w:color="auto"/>
             </w:tcBorders>
             <w:vAlign w:val="center"/>
           </w:tcPr>
@@ -986,7 +969,52 @@
               <w:spacing w:after="0" w:line="240" w:lineRule="auto"/>
               <w:jc w:val="center"/>
               <w:rPr>
-                <w:rFonts w:ascii="Times New Roman" w:hAnsi="Times New Roman"/>
+                <w:rFonts w:ascii="Times New Roman" w:hAnsi="Times New Roman" w:cs="Times New Roman"/>
+                <w:sz w:val="16"/>
+                <w:szCs w:val="16"/>
+              </w:rPr>
+            </w:pPr>
+            <w:r>
+              <w:rPr>
+                <w:rFonts w:ascii="Times New Roman" w:eastAsia="Calibri" w:hAnsi="Times New Roman" w:cs="Times New Roman"/>
+                <w:sz w:val="16"/>
+                <w:szCs w:val="16"/>
+              </w:rPr>
+              <w:t xml:space="preserve">+++END-FOR </w:t>
+            </w:r>
+            <w:proofErr w:type="spellStart"/>
+            <w:r>
+              <w:rPr>
+                <w:rFonts w:ascii="Times New Roman" w:eastAsia="Calibri" w:hAnsi="Times New Roman" w:cs="Times New Roman"/>
+                <w:sz w:val="16"/>
+                <w:szCs w:val="16"/>
+              </w:rPr>
+              <w:t>day</w:t>
+            </w:r>
+            <w:proofErr w:type="spellEnd"/>
+            <w:r>
+              <w:rPr>
+                <w:rFonts w:ascii="Times New Roman" w:eastAsia="Calibri" w:hAnsi="Times New Roman" w:cs="Times New Roman"/>
+                <w:sz w:val="16"/>
+                <w:szCs w:val="16"/>
+              </w:rPr>
+              <w:t>+++</w:t>
+            </w:r>
+          </w:p>
+        </w:tc>
+      </w:tr>
+      <w:tr>
+        <w:tc>
+          <w:tcPr>
+            <w:tcW w:w="412" w:type="pct"/>
+            <w:vAlign w:val="center"/>
+          </w:tcPr>
+          <w:p>
+            <w:pPr>
+              <w:spacing w:after="0" w:line="240" w:lineRule="auto"/>
+              <w:jc w:val="center"/>
+              <w:rPr>
+                <w:rFonts w:ascii="Times New Roman" w:hAnsi="Times New Roman" w:cs="Times New Roman"/>
                 <w:sz w:val="18"/>
                 <w:szCs w:val="18"/>
               </w:rPr>
@@ -995,18 +1023,14 @@
         </w:tc>
         <w:tc>
           <w:tcPr>
-            <w:tcW w:w="3400" w:type="dxa"/>
-            <w:tcBorders>
-              <w:left w:val="single" w:sz="4" w:space="0" w:color="000000"/>
-              <w:bottom w:val="single" w:sz="4" w:space="0" w:color="000000"/>
-            </w:tcBorders>
+            <w:tcW w:w="2327" w:type="pct"/>
             <w:vAlign w:val="center"/>
           </w:tcPr>
           <w:p>
             <w:pPr>
               <w:spacing w:after="0" w:line="240" w:lineRule="auto"/>
               <w:rPr>
-                <w:rFonts w:ascii="Times New Roman" w:hAnsi="Times New Roman"/>
+                <w:rFonts w:ascii="Times New Roman" w:hAnsi="Times New Roman" w:cs="Times New Roman"/>
                 <w:lang w:val="en-US"/>
               </w:rPr>
             </w:pPr>
@@ -1017,19 +1041,8 @@
                 <w:szCs w:val="18"/>
                 <w:lang w:val="en-US"/>
               </w:rPr>
-              <w:t xml:space="preserve">+++ FOR </w:t>
-            </w:r>
-            <w:proofErr w:type="spellStart"/>
-            <w:r>
-              <w:rPr>
-                <w:rFonts w:ascii="Times New Roman" w:eastAsia="Calibri" w:hAnsi="Times New Roman" w:cs="Times New Roman"/>
-                <w:sz w:val="18"/>
-                <w:szCs w:val="18"/>
-                <w:lang w:val="en-US"/>
-              </w:rPr>
-              <w:t>std</w:t>
-            </w:r>
-            <w:proofErr w:type="spellEnd"/>
+              <w:t>+++FOR student</w:t>
+            </w:r>
             <w:r>
               <w:rPr>
                 <w:rFonts w:ascii="Times New Roman" w:eastAsia="Calibri" w:hAnsi="Times New Roman" w:cs="Times New Roman"/>
@@ -1063,18 +1076,28 @@
         </w:tc>
         <w:tc>
           <w:tcPr>
-            <w:tcW w:w="2423" w:type="dxa"/>
-            <w:tcBorders>
-              <w:left w:val="single" w:sz="4" w:space="0" w:color="000000"/>
-              <w:bottom w:val="single" w:sz="4" w:space="0" w:color="000000"/>
-            </w:tcBorders>
+            <w:tcW w:w="924" w:type="pct"/>
+          </w:tcPr>
+          <w:p>
+            <w:pPr>
+              <w:pStyle w:val="Contenudetableau"/>
+              <w:rPr>
+                <w:rFonts w:ascii="Times New Roman" w:hAnsi="Times New Roman" w:cs="Times New Roman"/>
+                <w:lang w:val="en-US"/>
+              </w:rPr>
+            </w:pPr>
+          </w:p>
+        </w:tc>
+        <w:tc>
+          <w:tcPr>
+            <w:tcW w:w="544" w:type="pct"/>
             <w:vAlign w:val="center"/>
           </w:tcPr>
           <w:p>
             <w:pPr>
               <w:pStyle w:val="Contenudetableau"/>
               <w:rPr>
-                <w:rFonts w:ascii="Times New Roman" w:hAnsi="Times New Roman"/>
+                <w:rFonts w:ascii="Times New Roman" w:hAnsi="Times New Roman" w:cs="Times New Roman"/>
                 <w:lang w:val="en-US"/>
               </w:rPr>
             </w:pPr>
@@ -1082,11 +1105,7 @@
         </w:tc>
         <w:tc>
           <w:tcPr>
-            <w:tcW w:w="454" w:type="dxa"/>
-            <w:tcBorders>
-              <w:left w:val="single" w:sz="4" w:space="0" w:color="000000"/>
-              <w:bottom w:val="single" w:sz="4" w:space="0" w:color="000000"/>
-            </w:tcBorders>
+            <w:tcW w:w="236" w:type="pct"/>
             <w:vAlign w:val="center"/>
           </w:tcPr>
           <w:p>
@@ -1094,7 +1113,7 @@
               <w:pStyle w:val="Contenudetableau"/>
               <w:jc w:val="center"/>
               <w:rPr>
-                <w:rFonts w:ascii="Times New Roman" w:hAnsi="Times New Roman"/>
+                <w:rFonts w:ascii="Times New Roman" w:hAnsi="Times New Roman" w:cs="Times New Roman"/>
                 <w:lang w:val="en-US"/>
               </w:rPr>
             </w:pPr>
@@ -1102,19 +1121,14 @@
         </w:tc>
         <w:tc>
           <w:tcPr>
-            <w:tcW w:w="3735" w:type="dxa"/>
-            <w:tcBorders>
-              <w:left w:val="single" w:sz="4" w:space="0" w:color="000000"/>
-              <w:bottom w:val="single" w:sz="4" w:space="0" w:color="000000"/>
-              <w:right w:val="single" w:sz="4" w:space="0" w:color="000000"/>
-            </w:tcBorders>
+            <w:tcW w:w="556" w:type="pct"/>
             <w:vAlign w:val="center"/>
           </w:tcPr>
           <w:p>
             <w:pPr>
               <w:pStyle w:val="Contenudetableau"/>
               <w:rPr>
-                <w:rFonts w:ascii="Times New Roman" w:hAnsi="Times New Roman"/>
+                <w:rFonts w:ascii="Times New Roman" w:hAnsi="Times New Roman" w:cs="Times New Roman"/>
                 <w:lang w:val="en-US"/>
               </w:rPr>
             </w:pPr>
@@ -1124,11 +1138,7 @@
       <w:tr>
         <w:tc>
           <w:tcPr>
-            <w:tcW w:w="454" w:type="dxa"/>
-            <w:tcBorders>
-              <w:left w:val="single" w:sz="4" w:space="0" w:color="000000"/>
-              <w:bottom w:val="single" w:sz="4" w:space="0" w:color="000000"/>
-            </w:tcBorders>
+            <w:tcW w:w="412" w:type="pct"/>
             <w:vAlign w:val="center"/>
           </w:tcPr>
           <w:p>
@@ -1136,7 +1146,7 @@
               <w:spacing w:after="0" w:line="240" w:lineRule="auto"/>
               <w:jc w:val="center"/>
               <w:rPr>
-                <w:rFonts w:ascii="Times New Roman" w:hAnsi="Times New Roman"/>
+                <w:rFonts w:ascii="Times New Roman" w:hAnsi="Times New Roman" w:cs="Times New Roman"/>
                 <w:sz w:val="16"/>
                 <w:szCs w:val="16"/>
               </w:rPr>
@@ -1147,25 +1157,13 @@
                 <w:sz w:val="16"/>
                 <w:szCs w:val="16"/>
               </w:rPr>
-              <w:t xml:space="preserve">+++ </w:t>
-            </w:r>
-            <w:r>
-              <w:rPr>
-                <w:rFonts w:ascii="Times New Roman" w:eastAsia="Calibri" w:hAnsi="Times New Roman" w:cs="Times New Roman"/>
-                <w:sz w:val="16"/>
-                <w:szCs w:val="16"/>
-              </w:rPr>
-              <w:t>$idx+1 +++</w:t>
+              <w:t>+++ $idx+1 +++</w:t>
             </w:r>
           </w:p>
         </w:tc>
         <w:tc>
           <w:tcPr>
-            <w:tcW w:w="3400" w:type="dxa"/>
-            <w:tcBorders>
-              <w:left w:val="single" w:sz="4" w:space="0" w:color="000000"/>
-              <w:bottom w:val="single" w:sz="4" w:space="0" w:color="000000"/>
-            </w:tcBorders>
+            <w:tcW w:w="2327" w:type="pct"/>
             <w:vAlign w:val="center"/>
           </w:tcPr>
           <w:p>
@@ -1173,7 +1171,7 @@
               <w:spacing w:after="0" w:line="240" w:lineRule="auto"/>
               <w:ind w:left="113"/>
               <w:rPr>
-                <w:rFonts w:ascii="Times New Roman" w:hAnsi="Times New Roman"/>
+                <w:rFonts w:ascii="Times New Roman" w:hAnsi="Times New Roman" w:cs="Times New Roman"/>
                 <w:sz w:val="16"/>
                 <w:szCs w:val="16"/>
               </w:rPr>
@@ -1186,9 +1184,6 @@
               </w:rPr>
               <w:t>+++$</w:t>
             </w:r>
-            <w:bookmarkStart w:id="0" w:name="_GoBack"/>
-            <w:bookmarkEnd w:id="0"/>
-            <w:proofErr w:type="spellStart"/>
             <w:r>
               <w:rPr>
                 <w:rFonts w:ascii="Times New Roman" w:eastAsia="Calibri" w:hAnsi="Times New Roman" w:cs="Times New Roman"/>
@@ -1196,9 +1191,35 @@
                 <w:szCs w:val="16"/>
                 <w:lang w:val="en-US"/>
               </w:rPr>
-              <w:t>std</w:t>
-            </w:r>
-            <w:proofErr w:type="spellEnd"/>
+              <w:t>st</w:t>
+            </w:r>
+            <w:r>
+              <w:rPr>
+                <w:rFonts w:ascii="Times New Roman" w:eastAsia="Calibri" w:hAnsi="Times New Roman" w:cs="Times New Roman"/>
+                <w:sz w:val="16"/>
+                <w:szCs w:val="16"/>
+                <w:lang w:val="en-US"/>
+              </w:rPr>
+              <w:t>u</w:t>
+            </w:r>
+            <w:r>
+              <w:rPr>
+                <w:rFonts w:ascii="Times New Roman" w:eastAsia="Calibri" w:hAnsi="Times New Roman" w:cs="Times New Roman"/>
+                <w:sz w:val="16"/>
+                <w:szCs w:val="16"/>
+                <w:lang w:val="en-US"/>
+              </w:rPr>
+              <w:t>d</w:t>
+            </w:r>
+            <w:r>
+              <w:rPr>
+                <w:rFonts w:ascii="Times New Roman" w:eastAsia="Calibri" w:hAnsi="Times New Roman" w:cs="Times New Roman"/>
+                <w:sz w:val="16"/>
+                <w:szCs w:val="16"/>
+                <w:lang w:val="en-US"/>
+              </w:rPr>
+              <w:t>ent</w:t>
+            </w:r>
             <w:r>
               <w:rPr>
                 <w:rFonts w:ascii="Times New Roman" w:eastAsia="Calibri" w:hAnsi="Times New Roman" w:cs="Times New Roman"/>
@@ -1229,11 +1250,7 @@
         </w:tc>
         <w:tc>
           <w:tcPr>
-            <w:tcW w:w="2423" w:type="dxa"/>
-            <w:tcBorders>
-              <w:left w:val="single" w:sz="4" w:space="0" w:color="000000"/>
-              <w:bottom w:val="single" w:sz="4" w:space="0" w:color="000000"/>
-            </w:tcBorders>
+            <w:tcW w:w="924" w:type="pct"/>
             <w:vAlign w:val="center"/>
           </w:tcPr>
           <w:p>
@@ -1241,9 +1258,10 @@
               <w:spacing w:after="0" w:line="240" w:lineRule="auto"/>
               <w:jc w:val="center"/>
               <w:rPr>
-                <w:rFonts w:ascii="Times New Roman" w:hAnsi="Times New Roman"/>
-                <w:sz w:val="16"/>
-                <w:szCs w:val="16"/>
+                <w:rFonts w:ascii="Times New Roman" w:eastAsia="Calibri" w:hAnsi="Times New Roman" w:cs="Times New Roman"/>
+                <w:sz w:val="16"/>
+                <w:szCs w:val="16"/>
+                <w:lang w:val="en-US"/>
               </w:rPr>
             </w:pPr>
             <w:r>
@@ -1251,8 +1269,18 @@
                 <w:rFonts w:ascii="Times New Roman" w:eastAsia="Calibri" w:hAnsi="Times New Roman" w:cs="Times New Roman"/>
                 <w:sz w:val="16"/>
                 <w:szCs w:val="16"/>
-              </w:rPr>
-              <w:t xml:space="preserve">+++ FOR </w:t>
+                <w:lang w:val="en-US"/>
+              </w:rPr>
+              <w:t>+++</w:t>
+            </w:r>
+            <w:r>
+              <w:rPr>
+                <w:rFonts w:ascii="Times New Roman" w:eastAsia="Calibri" w:hAnsi="Times New Roman" w:cs="Times New Roman"/>
+                <w:sz w:val="16"/>
+                <w:szCs w:val="16"/>
+                <w:lang w:val="en-US"/>
+              </w:rPr>
+              <w:t>$</w:t>
             </w:r>
             <w:proofErr w:type="spellStart"/>
             <w:r>
@@ -1260,8 +1288,54 @@
                 <w:rFonts w:ascii="Times New Roman" w:eastAsia="Calibri" w:hAnsi="Times New Roman" w:cs="Times New Roman"/>
                 <w:sz w:val="16"/>
                 <w:szCs w:val="16"/>
-              </w:rPr>
-              <w:t>day</w:t>
+                <w:lang w:val="en-US"/>
+              </w:rPr>
+              <w:t>student</w:t>
+            </w:r>
+            <w:r>
+              <w:rPr>
+                <w:rFonts w:ascii="Times New Roman" w:eastAsia="Calibri" w:hAnsi="Times New Roman" w:cs="Times New Roman"/>
+                <w:sz w:val="16"/>
+                <w:szCs w:val="16"/>
+                <w:lang w:val="en-US"/>
+              </w:rPr>
+              <w:t>.enrollment</w:t>
+            </w:r>
+            <w:r>
+              <w:rPr>
+                <w:rFonts w:ascii="Times New Roman" w:eastAsia="Calibri" w:hAnsi="Times New Roman" w:cs="Times New Roman"/>
+                <w:sz w:val="16"/>
+                <w:szCs w:val="16"/>
+                <w:lang w:val="en-US"/>
+              </w:rPr>
+              <w:t>.</w:t>
+            </w:r>
+            <w:r>
+              <w:rPr>
+                <w:rFonts w:ascii="Times New Roman" w:eastAsia="Calibri" w:hAnsi="Times New Roman" w:cs="Times New Roman"/>
+                <w:sz w:val="16"/>
+                <w:szCs w:val="16"/>
+                <w:lang w:val="en-US"/>
+              </w:rPr>
+              <w:t>classroom</w:t>
+            </w:r>
+            <w:r>
+              <w:rPr>
+                <w:rFonts w:ascii="Times New Roman" w:eastAsia="Calibri" w:hAnsi="Times New Roman" w:cs="Times New Roman"/>
+                <w:sz w:val="16"/>
+                <w:szCs w:val="16"/>
+                <w:lang w:val="en-US"/>
+              </w:rPr>
+              <w:t>.</w:t>
+            </w:r>
+            <w:r>
+              <w:rPr>
+                <w:rFonts w:ascii="Times New Roman" w:eastAsia="Calibri" w:hAnsi="Times New Roman" w:cs="Times New Roman"/>
+                <w:sz w:val="16"/>
+                <w:szCs w:val="16"/>
+                <w:lang w:val="en-US"/>
+              </w:rPr>
+              <w:t>shortIdentifier</w:t>
             </w:r>
             <w:proofErr w:type="spellEnd"/>
             <w:r>
@@ -1269,24 +1343,7 @@
                 <w:rFonts w:ascii="Times New Roman" w:eastAsia="Calibri" w:hAnsi="Times New Roman" w:cs="Times New Roman"/>
                 <w:sz w:val="16"/>
                 <w:szCs w:val="16"/>
-              </w:rPr>
-              <w:t xml:space="preserve"> in </w:t>
-            </w:r>
-            <w:proofErr w:type="spellStart"/>
-            <w:r>
-              <w:rPr>
-                <w:rFonts w:ascii="Times New Roman" w:eastAsia="Calibri" w:hAnsi="Times New Roman" w:cs="Times New Roman"/>
-                <w:sz w:val="16"/>
-                <w:szCs w:val="16"/>
-              </w:rPr>
-              <w:t>days</w:t>
-            </w:r>
-            <w:proofErr w:type="spellEnd"/>
-            <w:r>
-              <w:rPr>
-                <w:rFonts w:ascii="Times New Roman" w:eastAsia="Calibri" w:hAnsi="Times New Roman" w:cs="Times New Roman"/>
-                <w:sz w:val="16"/>
-                <w:szCs w:val="16"/>
+                <w:lang w:val="en-US"/>
               </w:rPr>
               <w:t>+++</w:t>
             </w:r>
@@ -1294,11 +1351,7 @@
         </w:tc>
         <w:tc>
           <w:tcPr>
-            <w:tcW w:w="454" w:type="dxa"/>
-            <w:tcBorders>
-              <w:left w:val="single" w:sz="4" w:space="0" w:color="000000"/>
-              <w:bottom w:val="single" w:sz="4" w:space="0" w:color="000000"/>
-            </w:tcBorders>
+            <w:tcW w:w="544" w:type="pct"/>
             <w:vAlign w:val="center"/>
           </w:tcPr>
           <w:p>
@@ -1306,21 +1359,60 @@
               <w:spacing w:after="0" w:line="240" w:lineRule="auto"/>
               <w:jc w:val="center"/>
               <w:rPr>
-                <w:rFonts w:ascii="Times New Roman" w:eastAsia="Calibri" w:hAnsi="Times New Roman" w:cs="Times New Roman"/>
+                <w:rFonts w:ascii="Times New Roman" w:hAnsi="Times New Roman" w:cs="Times New Roman"/>
                 <w:sz w:val="16"/>
                 <w:szCs w:val="16"/>
               </w:rPr>
             </w:pPr>
+            <w:r>
+              <w:rPr>
+                <w:rFonts w:ascii="Times New Roman" w:eastAsia="Calibri" w:hAnsi="Times New Roman" w:cs="Times New Roman"/>
+                <w:sz w:val="16"/>
+                <w:szCs w:val="16"/>
+              </w:rPr>
+              <w:t xml:space="preserve">+++ FOR </w:t>
+            </w:r>
+            <w:proofErr w:type="spellStart"/>
+            <w:r>
+              <w:rPr>
+                <w:rFonts w:ascii="Times New Roman" w:eastAsia="Calibri" w:hAnsi="Times New Roman" w:cs="Times New Roman"/>
+                <w:sz w:val="16"/>
+                <w:szCs w:val="16"/>
+              </w:rPr>
+              <w:t>day</w:t>
+            </w:r>
+            <w:proofErr w:type="spellEnd"/>
+            <w:r>
+              <w:rPr>
+                <w:rFonts w:ascii="Times New Roman" w:eastAsia="Calibri" w:hAnsi="Times New Roman" w:cs="Times New Roman"/>
+                <w:sz w:val="16"/>
+                <w:szCs w:val="16"/>
+              </w:rPr>
+              <w:t xml:space="preserve"> in </w:t>
+            </w:r>
+            <w:proofErr w:type="spellStart"/>
+            <w:r>
+              <w:rPr>
+                <w:rFonts w:ascii="Times New Roman" w:eastAsia="Calibri" w:hAnsi="Times New Roman" w:cs="Times New Roman"/>
+                <w:sz w:val="16"/>
+                <w:szCs w:val="16"/>
+              </w:rPr>
+              <w:t>days</w:t>
+            </w:r>
+            <w:proofErr w:type="spellEnd"/>
+            <w:r>
+              <w:rPr>
+                <w:rFonts w:ascii="Times New Roman" w:eastAsia="Calibri" w:hAnsi="Times New Roman" w:cs="Times New Roman"/>
+                <w:sz w:val="16"/>
+                <w:szCs w:val="16"/>
+              </w:rPr>
+              <w:t>+++</w:t>
+            </w:r>
           </w:p>
         </w:tc>
         <w:tc>
           <w:tcPr>
-            <w:tcW w:w="3735" w:type="dxa"/>
-            <w:tcBorders>
-              <w:left w:val="single" w:sz="4" w:space="0" w:color="000000"/>
-              <w:bottom w:val="single" w:sz="4" w:space="0" w:color="000000"/>
-              <w:right w:val="single" w:sz="4" w:space="0" w:color="000000"/>
-            </w:tcBorders>
+            <w:tcW w:w="236" w:type="pct"/>
             <w:vAlign w:val="center"/>
           </w:tcPr>
           <w:p>
@@ -1328,7 +1420,24 @@
               <w:spacing w:after="0" w:line="240" w:lineRule="auto"/>
               <w:jc w:val="center"/>
               <w:rPr>
-                <w:rFonts w:ascii="Times New Roman" w:hAnsi="Times New Roman"/>
+                <w:rFonts w:ascii="Times New Roman" w:eastAsia="Calibri" w:hAnsi="Times New Roman" w:cs="Times New Roman"/>
+                <w:sz w:val="16"/>
+                <w:szCs w:val="16"/>
+              </w:rPr>
+            </w:pPr>
+          </w:p>
+        </w:tc>
+        <w:tc>
+          <w:tcPr>
+            <w:tcW w:w="556" w:type="pct"/>
+            <w:vAlign w:val="center"/>
+          </w:tcPr>
+          <w:p>
+            <w:pPr>
+              <w:spacing w:after="0" w:line="240" w:lineRule="auto"/>
+              <w:jc w:val="center"/>
+              <w:rPr>
+                <w:rFonts w:ascii="Times New Roman" w:hAnsi="Times New Roman" w:cs="Times New Roman"/>
                 <w:sz w:val="16"/>
                 <w:szCs w:val="16"/>
               </w:rPr>
@@ -1365,11 +1474,7 @@
       <w:tr>
         <w:tc>
           <w:tcPr>
-            <w:tcW w:w="454" w:type="dxa"/>
-            <w:tcBorders>
-              <w:left w:val="single" w:sz="4" w:space="0" w:color="000000"/>
-              <w:bottom w:val="single" w:sz="4" w:space="0" w:color="000000"/>
-            </w:tcBorders>
+            <w:tcW w:w="412" w:type="pct"/>
             <w:vAlign w:val="center"/>
           </w:tcPr>
           <w:p>
@@ -1377,7 +1482,7 @@
               <w:spacing w:after="0" w:line="240" w:lineRule="auto"/>
               <w:jc w:val="center"/>
               <w:rPr>
-                <w:rFonts w:ascii="Times New Roman" w:hAnsi="Times New Roman"/>
+                <w:rFonts w:ascii="Times New Roman" w:hAnsi="Times New Roman" w:cs="Times New Roman"/>
                 <w:sz w:val="18"/>
                 <w:szCs w:val="18"/>
               </w:rPr>
@@ -1386,18 +1491,14 @@
         </w:tc>
         <w:tc>
           <w:tcPr>
-            <w:tcW w:w="3400" w:type="dxa"/>
-            <w:tcBorders>
-              <w:left w:val="single" w:sz="4" w:space="0" w:color="000000"/>
-              <w:bottom w:val="single" w:sz="4" w:space="0" w:color="000000"/>
-            </w:tcBorders>
+            <w:tcW w:w="2327" w:type="pct"/>
             <w:vAlign w:val="center"/>
           </w:tcPr>
           <w:p>
             <w:pPr>
               <w:spacing w:after="0" w:line="240" w:lineRule="auto"/>
               <w:rPr>
-                <w:rFonts w:ascii="Times New Roman" w:hAnsi="Times New Roman"/>
+                <w:rFonts w:ascii="Times New Roman" w:hAnsi="Times New Roman" w:cs="Times New Roman"/>
               </w:rPr>
             </w:pPr>
             <w:r>
@@ -1406,18 +1507,17 @@
                 <w:sz w:val="18"/>
                 <w:szCs w:val="18"/>
               </w:rPr>
-              <w:t xml:space="preserve">+++ END-FOR </w:t>
-            </w:r>
-            <w:proofErr w:type="spellStart"/>
+              <w:t xml:space="preserve">+++END-FOR </w:t>
+            </w:r>
             <w:r>
               <w:rPr>
                 <w:rFonts w:ascii="Times New Roman" w:eastAsia="Calibri" w:hAnsi="Times New Roman" w:cs="Times New Roman"/>
                 <w:sz w:val="18"/>
                 <w:szCs w:val="18"/>
-              </w:rPr>
-              <w:t>std</w:t>
-            </w:r>
-            <w:proofErr w:type="spellEnd"/>
+                <w:lang w:val="en-US"/>
+              </w:rPr>
+              <w:t>student</w:t>
+            </w:r>
             <w:r>
               <w:rPr>
                 <w:rFonts w:ascii="Times New Roman" w:eastAsia="Calibri" w:hAnsi="Times New Roman" w:cs="Times New Roman"/>
@@ -1430,29 +1530,34 @@
         </w:tc>
         <w:tc>
           <w:tcPr>
-            <w:tcW w:w="2423" w:type="dxa"/>
-            <w:tcBorders>
-              <w:left w:val="single" w:sz="4" w:space="0" w:color="000000"/>
-              <w:bottom w:val="single" w:sz="4" w:space="0" w:color="000000"/>
-            </w:tcBorders>
+            <w:tcW w:w="924" w:type="pct"/>
+          </w:tcPr>
+          <w:p>
+            <w:pPr>
+              <w:pStyle w:val="Contenudetableau"/>
+              <w:rPr>
+                <w:rFonts w:ascii="Times New Roman" w:hAnsi="Times New Roman" w:cs="Times New Roman"/>
+              </w:rPr>
+            </w:pPr>
+          </w:p>
+        </w:tc>
+        <w:tc>
+          <w:tcPr>
+            <w:tcW w:w="544" w:type="pct"/>
             <w:vAlign w:val="center"/>
           </w:tcPr>
           <w:p>
             <w:pPr>
               <w:pStyle w:val="Contenudetableau"/>
               <w:rPr>
-                <w:rFonts w:ascii="Times New Roman" w:hAnsi="Times New Roman"/>
+                <w:rFonts w:ascii="Times New Roman" w:hAnsi="Times New Roman" w:cs="Times New Roman"/>
               </w:rPr>
             </w:pPr>
           </w:p>
         </w:tc>
         <w:tc>
           <w:tcPr>
-            <w:tcW w:w="454" w:type="dxa"/>
-            <w:tcBorders>
-              <w:left w:val="single" w:sz="4" w:space="0" w:color="000000"/>
-              <w:bottom w:val="single" w:sz="4" w:space="0" w:color="000000"/>
-            </w:tcBorders>
+            <w:tcW w:w="236" w:type="pct"/>
             <w:vAlign w:val="center"/>
           </w:tcPr>
           <w:p>
@@ -1460,26 +1565,21 @@
               <w:pStyle w:val="Contenudetableau"/>
               <w:jc w:val="center"/>
               <w:rPr>
-                <w:rFonts w:ascii="Times New Roman" w:hAnsi="Times New Roman"/>
+                <w:rFonts w:ascii="Times New Roman" w:hAnsi="Times New Roman" w:cs="Times New Roman"/>
               </w:rPr>
             </w:pPr>
           </w:p>
         </w:tc>
         <w:tc>
           <w:tcPr>
-            <w:tcW w:w="3735" w:type="dxa"/>
-            <w:tcBorders>
-              <w:left w:val="single" w:sz="4" w:space="0" w:color="000000"/>
-              <w:bottom w:val="single" w:sz="4" w:space="0" w:color="000000"/>
-              <w:right w:val="single" w:sz="4" w:space="0" w:color="000000"/>
-            </w:tcBorders>
+            <w:tcW w:w="556" w:type="pct"/>
             <w:vAlign w:val="center"/>
           </w:tcPr>
           <w:p>
             <w:pPr>
               <w:pStyle w:val="Contenudetableau"/>
               <w:rPr>
-                <w:rFonts w:ascii="Times New Roman" w:hAnsi="Times New Roman"/>
+                <w:rFonts w:ascii="Times New Roman" w:hAnsi="Times New Roman" w:cs="Times New Roman"/>
               </w:rPr>
             </w:pPr>
           </w:p>
@@ -1489,19 +1589,22 @@
     <w:p>
       <w:pPr>
         <w:rPr>
-          <w:rFonts w:cs="Times New Roman"/>
+          <w:rFonts w:ascii="Times New Roman" w:hAnsi="Times New Roman" w:cs="Times New Roman"/>
           <w:sz w:val="10"/>
           <w:szCs w:val="10"/>
         </w:rPr>
       </w:pPr>
       <w:r>
+        <w:rPr>
+          <w:rFonts w:ascii="Times New Roman" w:hAnsi="Times New Roman" w:cs="Times New Roman"/>
+        </w:rPr>
         <w:br w:type="page"/>
       </w:r>
     </w:p>
     <w:p>
       <w:pPr>
         <w:rPr>
-          <w:rFonts w:ascii="Times New Roman" w:hAnsi="Times New Roman"/>
+          <w:rFonts w:ascii="Times New Roman" w:hAnsi="Times New Roman" w:cs="Times New Roman"/>
         </w:rPr>
       </w:pPr>
       <w:r>

</xml_diff>